<commit_message>
Opdatér dokument "Generering af release"
</commit_message>
<xml_diff>
--- a/Documentation/Generering af release 4.0.0.0.docx
+++ b/Documentation/Generering af release 4.0.0.0.docx
@@ -24,6 +24,20 @@
         <w:rPr/>
         <w:t>.0.0.0</w:t>
       </w:r>
+    </w:p>
+    <w:p>
+      <w:pPr>
+        <w:sectPr>
+          <w:footerReference w:type="default" r:id="rId2"/>
+          <w:type w:val="nextPage"/>
+          <w:pgSz w:w="11906" w:h="16838"/>
+          <w:pgMar w:left="1134" w:right="1134" w:header="0" w:top="1134" w:footer="708" w:bottom="1134" w:gutter="0"/>
+          <w:pgNumType w:fmt="decimal"/>
+          <w:formProt w:val="false"/>
+          <w:textDirection w:val="lrTb"/>
+          <w:docGrid w:type="default" w:linePitch="360" w:charSpace="0"/>
+        </w:sectPr>
+      </w:pPr>
     </w:p>
     <w:p>
       <w:pPr>
@@ -67,27 +81,27 @@
           </w:r>
           <w:r>
             <w:rPr>
-              <w:rStyle w:val="IndexLink"/>
+              <w:rStyle w:val="Indeksspring"/>
             </w:rPr>
-            <w:instrText> TOC \o "1-9" \u \l 1-9 \h </w:instrText>
+            <w:instrText> TOC \o "1-9" \u \h</w:instrText>
           </w:r>
           <w:r>
             <w:rPr>
-              <w:rStyle w:val="IndexLink"/>
+              <w:rStyle w:val="Indeksspring"/>
             </w:rPr>
             <w:fldChar w:fldCharType="separate"/>
           </w:r>
           <w:hyperlink w:anchor="__RefHeading___Toc531097476">
             <w:r>
               <w:rPr>
-                <w:rStyle w:val="IndexLink"/>
+                <w:rStyle w:val="Indeksspring"/>
                 <w:lang w:val="da-DK" w:eastAsia="da-DK" w:bidi="da-DK"/>
               </w:rPr>
               <w:t>HUSK:</w:t>
             </w:r>
             <w:r>
               <w:rPr>
-                <w:rStyle w:val="IndexLink"/>
+                <w:rStyle w:val="Indeksspring"/>
                 <w:lang w:val="da-DK" w:eastAsia="da-DK"/>
               </w:rPr>
               <w:tab/>
@@ -113,14 +127,14 @@
           <w:hyperlink w:anchor="__RefHeading___Toc531097477">
             <w:r>
               <w:rPr>
-                <w:rStyle w:val="IndexLink"/>
+                <w:rStyle w:val="Indeksspring"/>
                 <w:lang w:val="da-DK" w:eastAsia="da-DK" w:bidi="da-DK"/>
               </w:rPr>
               <w:t>Opdatér al officiel dokumentation :</w:t>
             </w:r>
             <w:r>
               <w:rPr>
-                <w:rStyle w:val="IndexLink"/>
+                <w:rStyle w:val="Indeksspring"/>
                 <w:lang w:val="da-DK" w:eastAsia="da-DK"/>
               </w:rPr>
               <w:tab/>
@@ -146,14 +160,14 @@
           <w:hyperlink w:anchor="__RefHeading___Toc531097478">
             <w:r>
               <w:rPr>
-                <w:rStyle w:val="IndexLink"/>
+                <w:rStyle w:val="Indeksspring"/>
                 <w:lang w:val="da-DK" w:eastAsia="da-DK" w:bidi="da-DK"/>
               </w:rPr>
               <w:t>Gør den officielle brugervejledning tilgængelig fra applikationen under Hjælp:</w:t>
             </w:r>
             <w:r>
               <w:rPr>
-                <w:rStyle w:val="IndexLink"/>
+                <w:rStyle w:val="Indeksspring"/>
                 <w:lang w:val="da-DK" w:eastAsia="da-DK"/>
               </w:rPr>
               <w:tab/>
@@ -179,14 +193,14 @@
           <w:hyperlink w:anchor="__RefHeading___Toc531097479">
             <w:r>
               <w:rPr>
-                <w:rStyle w:val="IndexLink"/>
+                <w:rStyle w:val="Indeksspring"/>
                 <w:lang w:val="da-DK" w:eastAsia="da-DK" w:bidi="da-DK"/>
               </w:rPr>
               <w:t>Build in Visual Studio</w:t>
             </w:r>
             <w:r>
               <w:rPr>
-                <w:rStyle w:val="IndexLink"/>
+                <w:rStyle w:val="Indeksspring"/>
                 <w:lang w:val="da-DK" w:eastAsia="da-DK"/>
               </w:rPr>
               <w:tab/>
@@ -212,14 +226,14 @@
           <w:hyperlink w:anchor="__RefHeading___Toc531097480">
             <w:r>
               <w:rPr>
-                <w:rStyle w:val="IndexLink"/>
+                <w:rStyle w:val="Indeksspring"/>
                 <w:lang w:val="da-DK" w:eastAsia="da-DK" w:bidi="da-DK"/>
               </w:rPr>
               <w:t>Make a copy of all source code involved</w:t>
             </w:r>
             <w:r>
               <w:rPr>
-                <w:rStyle w:val="IndexLink"/>
+                <w:rStyle w:val="Indeksspring"/>
                 <w:lang w:val="da-DK" w:eastAsia="da-DK"/>
               </w:rPr>
               <w:tab/>
@@ -245,14 +259,14 @@
           <w:hyperlink w:anchor="__RefHeading___Toc531097481">
             <w:r>
               <w:rPr>
-                <w:rStyle w:val="IndexLink"/>
+                <w:rStyle w:val="Indeksspring"/>
                 <w:lang w:val="da-DK" w:eastAsia="da-DK" w:bidi="da-DK"/>
               </w:rPr>
               <w:t>Create the setup file:</w:t>
             </w:r>
             <w:r>
               <w:rPr>
-                <w:rStyle w:val="IndexLink"/>
+                <w:rStyle w:val="Indeksspring"/>
                 <w:lang w:val="da-DK" w:eastAsia="da-DK"/>
               </w:rPr>
               <w:tab/>
@@ -278,14 +292,14 @@
           <w:hyperlink w:anchor="__RefHeading___Toc531097482">
             <w:r>
               <w:rPr>
-                <w:rStyle w:val="IndexLink"/>
+                <w:rStyle w:val="Indeksspring"/>
                 <w:lang w:val="da-DK" w:eastAsia="da-DK" w:bidi="da-DK"/>
               </w:rPr>
               <w:t>Save Setup.exe with the source code</w:t>
             </w:r>
             <w:r>
               <w:rPr>
-                <w:rStyle w:val="IndexLink"/>
+                <w:rStyle w:val="Indeksspring"/>
                 <w:lang w:val="da-DK" w:eastAsia="da-DK"/>
               </w:rPr>
               <w:tab/>
@@ -311,14 +325,14 @@
           <w:hyperlink w:anchor="__RefHeading___Toc531097483">
             <w:r>
               <w:rPr>
-                <w:rStyle w:val="IndexLink"/>
+                <w:rStyle w:val="Indeksspring"/>
                 <w:lang w:val="da-DK" w:eastAsia="da-DK" w:bidi="da-DK"/>
               </w:rPr>
               <w:t>Test the setup.exe file generated</w:t>
             </w:r>
             <w:r>
               <w:rPr>
-                <w:rStyle w:val="IndexLink"/>
+                <w:rStyle w:val="Indeksspring"/>
                 <w:lang w:val="da-DK" w:eastAsia="da-DK"/>
               </w:rPr>
               <w:tab/>
@@ -344,14 +358,14 @@
           <w:hyperlink w:anchor="__RefHeading___Toc531097484">
             <w:r>
               <w:rPr>
-                <w:rStyle w:val="IndexLink"/>
+                <w:rStyle w:val="Indeksspring"/>
                 <w:lang w:val="da-DK" w:eastAsia="da-DK" w:bidi="da-DK"/>
               </w:rPr>
               <w:t>Move documentation files</w:t>
             </w:r>
             <w:r>
               <w:rPr>
-                <w:rStyle w:val="IndexLink"/>
+                <w:rStyle w:val="Indeksspring"/>
                 <w:lang w:val="da-DK" w:eastAsia="da-DK"/>
               </w:rPr>
               <w:tab/>
@@ -377,14 +391,14 @@
           <w:hyperlink w:anchor="__RefHeading___Toc531097485">
             <w:r>
               <w:rPr>
-                <w:rStyle w:val="IndexLink"/>
+                <w:rStyle w:val="Indeksspring"/>
                 <w:lang w:val="da-DK" w:eastAsia="da-DK" w:bidi="da-DK"/>
               </w:rPr>
               <w:t>Create the .zip distribution file:</w:t>
             </w:r>
             <w:r>
               <w:rPr>
-                <w:rStyle w:val="IndexLink"/>
+                <w:rStyle w:val="Indeksspring"/>
                 <w:lang w:val="da-DK" w:eastAsia="da-DK"/>
               </w:rPr>
               <w:tab/>
@@ -410,14 +424,14 @@
           <w:hyperlink w:anchor="__RefHeading___Toc531097486">
             <w:r>
               <w:rPr>
-                <w:rStyle w:val="IndexLink"/>
+                <w:rStyle w:val="Indeksspring"/>
                 <w:lang w:val="da-DK" w:eastAsia="da-DK" w:bidi="da-DK"/>
               </w:rPr>
               <w:t>Save a copy of the release IBOS office net:</w:t>
             </w:r>
             <w:r>
               <w:rPr>
-                <w:rStyle w:val="IndexLink"/>
+                <w:rStyle w:val="Indeksspring"/>
                 <w:lang w:val="da-DK" w:eastAsia="da-DK"/>
               </w:rPr>
               <w:tab/>
@@ -426,10 +440,22 @@
           </w:hyperlink>
           <w:r>
             <w:rPr>
-              <w:rStyle w:val="IndexLink"/>
+              <w:rStyle w:val="Indeksspring"/>
             </w:rPr>
             <w:fldChar w:fldCharType="end"/>
           </w:r>
+        </w:p>
+        <w:p>
+          <w:pPr>
+            <w:sectPr>
+              <w:type w:val="continuous"/>
+              <w:pgSz w:w="11906" w:h="16838"/>
+              <w:pgMar w:left="1134" w:right="1134" w:header="0" w:top="1134" w:footer="708" w:bottom="1134" w:gutter="0"/>
+              <w:formProt w:val="false"/>
+              <w:textDirection w:val="lrTb"/>
+              <w:docGrid w:type="default" w:linePitch="360" w:charSpace="0"/>
+            </w:sectPr>
+          </w:pPr>
         </w:p>
       </w:sdtContent>
     </w:sdt>
@@ -459,6 +485,10 @@
     <w:p>
       <w:pPr>
         <w:pStyle w:val="Overskrift1"/>
+        <w:numPr>
+          <w:ilvl w:val="0"/>
+          <w:numId w:val="2"/>
+        </w:numPr>
         <w:bidi w:val="0"/>
         <w:jc w:val="left"/>
         <w:rPr>
@@ -466,11 +496,11 @@
         </w:rPr>
       </w:pPr>
       <w:bookmarkStart w:id="0" w:name="__RefHeading___Toc531097476"/>
+      <w:bookmarkEnd w:id="0"/>
       <w:r>
         <w:rPr/>
         <w:t>HUSK:</w:t>
       </w:r>
-      <w:bookmarkEnd w:id="0"/>
       <w:r>
         <w:rPr>
           <w:lang w:val="da-DK"/>
@@ -585,13 +615,17 @@
       </w:pPr>
       <w:r>
         <w:rPr>
-          <w:shd w:fill="FFFF00" w:val="clear"/>
+          <w:highlight w:val="yellow"/>
         </w:rPr>
       </w:r>
     </w:p>
     <w:p>
       <w:pPr>
         <w:pStyle w:val="Overskrift1"/>
+        <w:numPr>
+          <w:ilvl w:val="0"/>
+          <w:numId w:val="2"/>
+        </w:numPr>
         <w:bidi w:val="0"/>
         <w:jc w:val="left"/>
         <w:rPr/>
@@ -735,7 +769,7 @@
         <w:pStyle w:val="Standard"/>
         <w:numPr>
           <w:ilvl w:val="0"/>
-          <w:numId w:val="5"/>
+          <w:numId w:val="6"/>
         </w:numPr>
         <w:bidi w:val="0"/>
         <w:jc w:val="left"/>
@@ -759,13 +793,11 @@
         <w:pStyle w:val="Standard"/>
         <w:numPr>
           <w:ilvl w:val="0"/>
-          <w:numId w:val="5"/>
+          <w:numId w:val="6"/>
         </w:numPr>
         <w:bidi w:val="0"/>
         <w:jc w:val="left"/>
-        <w:rPr>
-          <w:rFonts w:ascii="Arial" w:hAnsi="Arial" w:cs="Arial"/>
-        </w:rPr>
+        <w:rPr/>
       </w:pPr>
       <w:r>
         <w:rPr>
@@ -778,13 +810,19 @@
           <w:rFonts w:cs="Arial" w:ascii="Arial" w:hAnsi="Arial"/>
           <w:lang w:val="da-DK"/>
         </w:rPr>
-        <w:t>3</w:t>
+        <w:t>4</w:t>
       </w:r>
       <w:r>
         <w:rPr>
           <w:rFonts w:cs="Arial" w:ascii="Arial" w:hAnsi="Arial"/>
         </w:rPr>
         <w:t>.0.0.0.doc</w:t>
+      </w:r>
+      <w:r>
+        <w:rPr>
+          <w:rFonts w:cs="Arial" w:ascii="Arial" w:hAnsi="Arial"/>
+        </w:rPr>
+        <w:t>x</w:t>
       </w:r>
     </w:p>
     <w:p>
@@ -792,13 +830,11 @@
         <w:pStyle w:val="Standard"/>
         <w:numPr>
           <w:ilvl w:val="0"/>
-          <w:numId w:val="5"/>
+          <w:numId w:val="6"/>
         </w:numPr>
         <w:bidi w:val="0"/>
         <w:jc w:val="left"/>
-        <w:rPr>
-          <w:rFonts w:ascii="Arial" w:hAnsi="Arial" w:cs="Arial"/>
-        </w:rPr>
+        <w:rPr/>
       </w:pPr>
       <w:r>
         <w:rPr>
@@ -811,13 +847,19 @@
           <w:rFonts w:cs="Arial" w:ascii="Arial" w:hAnsi="Arial"/>
           <w:lang w:val="da-DK"/>
         </w:rPr>
-        <w:t>3</w:t>
+        <w:t>4</w:t>
       </w:r>
       <w:r>
         <w:rPr>
           <w:rFonts w:cs="Arial" w:ascii="Arial" w:hAnsi="Arial"/>
         </w:rPr>
         <w:t>.0.0.0.doc</w:t>
+      </w:r>
+      <w:r>
+        <w:rPr>
+          <w:rFonts w:cs="Arial" w:ascii="Arial" w:hAnsi="Arial"/>
+        </w:rPr>
+        <w:t>x</w:t>
       </w:r>
     </w:p>
     <w:p>
@@ -825,7 +867,7 @@
         <w:pStyle w:val="Standard"/>
         <w:numPr>
           <w:ilvl w:val="0"/>
-          <w:numId w:val="5"/>
+          <w:numId w:val="6"/>
         </w:numPr>
         <w:bidi w:val="0"/>
         <w:jc w:val="left"/>
@@ -842,13 +884,33 @@
           <w:rFonts w:cs="Arial" w:ascii="Arial" w:hAnsi="Arial"/>
           <w:lang w:val="da-DK"/>
         </w:rPr>
-        <w:t xml:space="preserve"> 3.0.0.0.</w:t>
+        <w:t xml:space="preserve"> </w:t>
+      </w:r>
+      <w:r>
+        <w:rPr>
+          <w:rFonts w:cs="Arial" w:ascii="Arial" w:hAnsi="Arial"/>
+          <w:lang w:val="da-DK"/>
+        </w:rPr>
+        <w:t>4</w:t>
+      </w:r>
+      <w:r>
+        <w:rPr>
+          <w:rFonts w:cs="Arial" w:ascii="Arial" w:hAnsi="Arial"/>
+          <w:lang w:val="da-DK"/>
+        </w:rPr>
+        <w:t>.0.0.0.</w:t>
       </w:r>
       <w:r>
         <w:rPr>
           <w:rFonts w:cs="Arial" w:ascii="Arial" w:hAnsi="Arial"/>
         </w:rPr>
         <w:t>doc</w:t>
+      </w:r>
+      <w:r>
+        <w:rPr>
+          <w:rFonts w:cs="Arial" w:ascii="Arial" w:hAnsi="Arial"/>
+        </w:rPr>
+        <w:t>x</w:t>
       </w:r>
       <w:r>
         <w:rPr>
@@ -863,7 +925,7 @@
         <w:pStyle w:val="Standard"/>
         <w:numPr>
           <w:ilvl w:val="0"/>
-          <w:numId w:val="5"/>
+          <w:numId w:val="6"/>
         </w:numPr>
         <w:bidi w:val="0"/>
         <w:jc w:val="left"/>
@@ -885,13 +947,11 @@
         <w:pStyle w:val="Standard"/>
         <w:numPr>
           <w:ilvl w:val="0"/>
-          <w:numId w:val="5"/>
+          <w:numId w:val="6"/>
         </w:numPr>
         <w:bidi w:val="0"/>
         <w:jc w:val="left"/>
-        <w:rPr>
-          <w:rFonts w:ascii="Arial" w:hAnsi="Arial" w:cs="Arial"/>
-        </w:rPr>
+        <w:rPr/>
       </w:pPr>
       <w:r>
         <w:rPr>
@@ -904,13 +964,19 @@
           <w:rFonts w:cs="Arial" w:ascii="Arial" w:hAnsi="Arial"/>
           <w:lang w:val="en-US"/>
         </w:rPr>
-        <w:t>3</w:t>
+        <w:t>4</w:t>
       </w:r>
       <w:r>
         <w:rPr>
           <w:rFonts w:cs="Arial" w:ascii="Arial" w:hAnsi="Arial"/>
         </w:rPr>
         <w:t>.0.0.0.doc</w:t>
+      </w:r>
+      <w:r>
+        <w:rPr>
+          <w:rFonts w:cs="Arial" w:ascii="Arial" w:hAnsi="Arial"/>
+        </w:rPr>
+        <w:t>x</w:t>
       </w:r>
     </w:p>
     <w:p>
@@ -918,13 +984,11 @@
         <w:pStyle w:val="Standard"/>
         <w:numPr>
           <w:ilvl w:val="0"/>
-          <w:numId w:val="5"/>
+          <w:numId w:val="6"/>
         </w:numPr>
         <w:bidi w:val="0"/>
         <w:jc w:val="left"/>
-        <w:rPr>
-          <w:rFonts w:ascii="Arial" w:hAnsi="Arial" w:cs="Arial"/>
-        </w:rPr>
+        <w:rPr/>
       </w:pPr>
       <w:r>
         <w:rPr>
@@ -937,13 +1001,19 @@
           <w:rFonts w:cs="Arial" w:ascii="Arial" w:hAnsi="Arial"/>
           <w:lang w:val="en-US"/>
         </w:rPr>
-        <w:t>3</w:t>
+        <w:t>4</w:t>
       </w:r>
       <w:r>
         <w:rPr>
           <w:rFonts w:cs="Arial" w:ascii="Arial" w:hAnsi="Arial"/>
         </w:rPr>
         <w:t>.0.0.0.doc</w:t>
+      </w:r>
+      <w:r>
+        <w:rPr>
+          <w:rFonts w:cs="Arial" w:ascii="Arial" w:hAnsi="Arial"/>
+        </w:rPr>
+        <w:t>x</w:t>
       </w:r>
     </w:p>
     <w:p>
@@ -951,27 +1021,24 @@
         <w:pStyle w:val="Standard"/>
         <w:numPr>
           <w:ilvl w:val="0"/>
-          <w:numId w:val="5"/>
+          <w:numId w:val="6"/>
         </w:numPr>
         <w:bidi w:val="0"/>
         <w:jc w:val="left"/>
-        <w:rPr>
-          <w:rFonts w:ascii="Arial" w:hAnsi="Arial" w:cs="Arial"/>
+        <w:rPr/>
+      </w:pPr>
+      <w:r>
+        <w:rPr>
+          <w:rFonts w:cs="Arial" w:ascii="Arial" w:hAnsi="Arial"/>
+        </w:rPr>
+        <w:t xml:space="preserve">Release Notes for IBOS MusicXmlReader version </w:t>
+      </w:r>
+      <w:r>
+        <w:rPr>
+          <w:rFonts w:cs="Arial" w:ascii="Arial" w:hAnsi="Arial"/>
           <w:lang w:val="en-US"/>
         </w:rPr>
-      </w:pPr>
-      <w:r>
-        <w:rPr>
-          <w:rFonts w:cs="Arial" w:ascii="Arial" w:hAnsi="Arial"/>
-        </w:rPr>
-        <w:t xml:space="preserve">Release Notes for IBOS MusicXmlReader version </w:t>
-      </w:r>
-      <w:r>
-        <w:rPr>
-          <w:rFonts w:cs="Arial" w:ascii="Arial" w:hAnsi="Arial"/>
-          <w:lang w:val="en-US"/>
-        </w:rPr>
-        <w:t>3</w:t>
+        <w:t>4</w:t>
       </w:r>
       <w:r>
         <w:rPr>
@@ -979,6 +1046,12 @@
         </w:rPr>
         <w:t>.0.0.0.doc</w:t>
       </w:r>
+      <w:r>
+        <w:rPr>
+          <w:rFonts w:cs="Arial" w:ascii="Arial" w:hAnsi="Arial"/>
+        </w:rPr>
+        <w:t>x</w:t>
+      </w:r>
     </w:p>
     <w:p>
       <w:pPr>
@@ -1022,6 +1095,10 @@
     <w:p>
       <w:pPr>
         <w:pStyle w:val="Overskrift1"/>
+        <w:numPr>
+          <w:ilvl w:val="0"/>
+          <w:numId w:val="2"/>
+        </w:numPr>
         <w:bidi w:val="0"/>
         <w:jc w:val="left"/>
         <w:rPr/>
@@ -1163,8 +1240,8 @@
       </w:tblPr>
       <w:tblGrid>
         <w:gridCol w:w="1242"/>
-        <w:gridCol w:w="2127"/>
-        <w:gridCol w:w="6419"/>
+        <w:gridCol w:w="1818"/>
+        <w:gridCol w:w="6728"/>
       </w:tblGrid>
       <w:tr>
         <w:trPr/>
@@ -1200,7 +1277,7 @@
         </w:tc>
         <w:tc>
           <w:tcPr>
-            <w:tcW w:w="2127" w:type="dxa"/>
+            <w:tcW w:w="1818" w:type="dxa"/>
             <w:tcBorders>
               <w:top w:val="single" w:sz="4" w:space="0" w:color="000000"/>
               <w:left w:val="single" w:sz="4" w:space="0" w:color="000000"/>
@@ -1230,7 +1307,7 @@
         </w:tc>
         <w:tc>
           <w:tcPr>
-            <w:tcW w:w="6419" w:type="dxa"/>
+            <w:tcW w:w="6728" w:type="dxa"/>
             <w:tcBorders>
               <w:top w:val="single" w:sz="4" w:space="0" w:color="000000"/>
               <w:left w:val="single" w:sz="4" w:space="0" w:color="000000"/>
@@ -1294,7 +1371,7 @@
         </w:tc>
         <w:tc>
           <w:tcPr>
-            <w:tcW w:w="2127" w:type="dxa"/>
+            <w:tcW w:w="1818" w:type="dxa"/>
             <w:tcBorders>
               <w:top w:val="single" w:sz="4" w:space="0" w:color="000000"/>
               <w:left w:val="single" w:sz="4" w:space="0" w:color="000000"/>
@@ -1324,7 +1401,7 @@
         </w:tc>
         <w:tc>
           <w:tcPr>
-            <w:tcW w:w="6419" w:type="dxa"/>
+            <w:tcW w:w="6728" w:type="dxa"/>
             <w:tcBorders>
               <w:top w:val="single" w:sz="4" w:space="0" w:color="000000"/>
               <w:left w:val="single" w:sz="4" w:space="0" w:color="000000"/>
@@ -1339,10 +1416,7 @@
               <w:bidi w:val="0"/>
               <w:spacing w:before="0" w:after="120"/>
               <w:jc w:val="left"/>
-              <w:rPr>
-                <w:color w:val="FF0000"/>
-                <w:lang w:val="da-DK"/>
-              </w:rPr>
+              <w:rPr/>
             </w:pPr>
             <w:r>
               <w:rPr>
@@ -1350,6 +1424,13 @@
                 <w:lang w:val="da-DK"/>
               </w:rPr>
               <w:t>Brugervejledning for IBOS Nodelæser version*.doc</w:t>
+            </w:r>
+            <w:r>
+              <w:rPr>
+                <w:color w:val="FF0000"/>
+                <w:lang w:val="da-DK"/>
+              </w:rPr>
+              <w:t>x</w:t>
             </w:r>
           </w:p>
         </w:tc>
@@ -1388,7 +1469,7 @@
         </w:tc>
         <w:tc>
           <w:tcPr>
-            <w:tcW w:w="2127" w:type="dxa"/>
+            <w:tcW w:w="1818" w:type="dxa"/>
             <w:tcBorders>
               <w:top w:val="single" w:sz="4" w:space="0" w:color="000000"/>
               <w:left w:val="single" w:sz="4" w:space="0" w:color="000000"/>
@@ -1402,23 +1483,27 @@
               <w:bidi w:val="0"/>
               <w:spacing w:before="0" w:after="120"/>
               <w:jc w:val="left"/>
-              <w:rPr>
-                <w:color w:val="FF0000"/>
-                <w:lang w:val="da-DK"/>
-              </w:rPr>
+              <w:rPr/>
             </w:pPr>
             <w:r>
               <w:rPr>
                 <w:color w:val="FF0000"/>
                 <w:lang w:val="da-DK"/>
               </w:rPr>
-              <w:t>En-US</w:t>
+              <w:t>e</w:t>
+            </w:r>
+            <w:r>
+              <w:rPr>
+                <w:color w:val="FF0000"/>
+                <w:lang w:val="da-DK"/>
+              </w:rPr>
+              <w:t>n-US</w:t>
             </w:r>
           </w:p>
         </w:tc>
         <w:tc>
           <w:tcPr>
-            <w:tcW w:w="6419" w:type="dxa"/>
+            <w:tcW w:w="6728" w:type="dxa"/>
             <w:tcBorders>
               <w:top w:val="single" w:sz="4" w:space="0" w:color="000000"/>
               <w:left w:val="single" w:sz="4" w:space="0" w:color="000000"/>
@@ -1433,10 +1518,7 @@
               <w:bidi w:val="0"/>
               <w:spacing w:before="0" w:after="120"/>
               <w:jc w:val="left"/>
-              <w:rPr>
-                <w:color w:val="FF0000"/>
-                <w:lang w:val="en-US"/>
-              </w:rPr>
+              <w:rPr/>
             </w:pPr>
             <w:r>
               <w:rPr>
@@ -1445,6 +1527,98 @@
               </w:rPr>
               <w:t>User's manual for IBOS MusicXmlReader version*.doc</w:t>
             </w:r>
+            <w:r>
+              <w:rPr>
+                <w:color w:val="FF0000"/>
+                <w:lang w:val="en-US"/>
+              </w:rPr>
+              <w:t>x</w:t>
+            </w:r>
+          </w:p>
+        </w:tc>
+      </w:tr>
+      <w:tr>
+        <w:trPr/>
+        <w:tc>
+          <w:tcPr>
+            <w:tcW w:w="1242" w:type="dxa"/>
+            <w:tcBorders>
+              <w:left w:val="single" w:sz="4" w:space="0" w:color="000000"/>
+              <w:bottom w:val="single" w:sz="4" w:space="0" w:color="000000"/>
+            </w:tcBorders>
+            <w:shd w:fill="auto" w:val="clear"/>
+          </w:tcPr>
+          <w:p>
+            <w:pPr>
+              <w:pStyle w:val="Textbody"/>
+              <w:bidi w:val="0"/>
+              <w:spacing w:before="0" w:after="120"/>
+              <w:jc w:val="left"/>
+              <w:rPr>
+                <w:color w:val="FF5429"/>
+              </w:rPr>
+            </w:pPr>
+            <w:r>
+              <w:rPr>
+                <w:color w:val="FF5429"/>
+              </w:rPr>
+              <w:t>Hollandsk</w:t>
+            </w:r>
+          </w:p>
+        </w:tc>
+        <w:tc>
+          <w:tcPr>
+            <w:tcW w:w="1818" w:type="dxa"/>
+            <w:tcBorders>
+              <w:left w:val="single" w:sz="4" w:space="0" w:color="000000"/>
+              <w:bottom w:val="single" w:sz="4" w:space="0" w:color="000000"/>
+            </w:tcBorders>
+            <w:shd w:fill="auto" w:val="clear"/>
+          </w:tcPr>
+          <w:p>
+            <w:pPr>
+              <w:pStyle w:val="Textbody"/>
+              <w:bidi w:val="0"/>
+              <w:spacing w:before="0" w:after="120"/>
+              <w:jc w:val="left"/>
+              <w:rPr>
+                <w:color w:val="FF5429"/>
+              </w:rPr>
+            </w:pPr>
+            <w:r>
+              <w:rPr>
+                <w:color w:val="FF5429"/>
+              </w:rPr>
+              <w:t>nl-NL</w:t>
+            </w:r>
+          </w:p>
+        </w:tc>
+        <w:tc>
+          <w:tcPr>
+            <w:tcW w:w="6728" w:type="dxa"/>
+            <w:tcBorders>
+              <w:left w:val="single" w:sz="4" w:space="0" w:color="000000"/>
+              <w:bottom w:val="single" w:sz="4" w:space="0" w:color="000000"/>
+              <w:right w:val="single" w:sz="4" w:space="0" w:color="000000"/>
+            </w:tcBorders>
+            <w:shd w:fill="auto" w:val="clear"/>
+          </w:tcPr>
+          <w:p>
+            <w:pPr>
+              <w:pStyle w:val="Textbody"/>
+              <w:bidi w:val="0"/>
+              <w:spacing w:before="0" w:after="120"/>
+              <w:jc w:val="left"/>
+              <w:rPr>
+                <w:color w:val="FF5429"/>
+              </w:rPr>
+            </w:pPr>
+            <w:r>
+              <w:rPr>
+                <w:color w:val="FF5429"/>
+              </w:rPr>
+              <w:t>Gebruikershandleiding IBOS MusicXmlReader version*.docx</w:t>
+            </w:r>
           </w:p>
         </w:tc>
       </w:tr>
@@ -1454,16 +1628,28 @@
         <w:pStyle w:val="Textbody"/>
         <w:bidi w:val="0"/>
         <w:jc w:val="left"/>
-        <w:rPr>
-          <w:lang w:val="da-DK"/>
-        </w:rPr>
+        <w:rPr/>
       </w:pPr>
       <w:r>
         <w:rPr>
           <w:color w:val="FF0000"/>
           <w:lang w:val="da-DK"/>
         </w:rPr>
-        <w:t>Bemærk at ”Filnavn” ikke indeholder versionsnavn, men en stjerne, som i denne sammenhæng betyder ”hvad som helst” så det er ikke nødvendigt at ændre i programmet bare fordi brugervejledningen skifter versionsnummer.</w:t>
+        <w:t>Bemærk at ”Filnavn” ikke indeholder versionsn</w:t>
+      </w:r>
+      <w:r>
+        <w:rPr>
+          <w:color w:val="FF0000"/>
+          <w:lang w:val="da-DK"/>
+        </w:rPr>
+        <w:t>ummer</w:t>
+      </w:r>
+      <w:r>
+        <w:rPr>
+          <w:color w:val="FF0000"/>
+          <w:lang w:val="da-DK"/>
+        </w:rPr>
+        <w:t>, men en stjerne, som i denne sammenhæng betyder ”hvad som helst” så det er ikke nødvendigt at ændre i programmet bare fordi brugervejledningen skifter versionsnummer.</w:t>
       </w:r>
     </w:p>
     <w:p>
@@ -1482,6 +1668,410 @@
           <w:rFonts w:cs="Arial" w:ascii="Arial" w:hAnsi="Arial"/>
           <w:lang w:val="da-DK"/>
         </w:rPr>
+      </w:r>
+    </w:p>
+    <w:p>
+      <w:pPr>
+        <w:pStyle w:val="Standard"/>
+        <w:numPr>
+          <w:ilvl w:val="0"/>
+          <w:numId w:val="4"/>
+        </w:numPr>
+        <w:bidi w:val="0"/>
+        <w:jc w:val="left"/>
+        <w:rPr/>
+      </w:pPr>
+      <w:r>
+        <w:rPr>
+          <w:rFonts w:cs="Arial" w:ascii="Arial" w:hAnsi="Arial"/>
+        </w:rPr>
+        <w:t>Kopi</w:t>
+      </w:r>
+      <w:r>
+        <w:rPr>
+          <w:rFonts w:cs="Arial" w:ascii="Arial" w:hAnsi="Arial"/>
+        </w:rPr>
+        <w:t>é</w:t>
+      </w:r>
+      <w:r>
+        <w:rPr>
+          <w:rFonts w:cs="Arial" w:ascii="Arial" w:hAnsi="Arial"/>
+        </w:rPr>
+        <w:t>r brugervejledninger til h</w:t>
+      </w:r>
+      <w:r>
+        <w:rPr>
+          <w:rFonts w:cs="Arial" w:ascii="Arial" w:hAnsi="Arial"/>
+        </w:rPr>
+        <w:t>enholdsvis</w:t>
+      </w:r>
+      <w:r>
+        <w:rPr>
+          <w:rFonts w:cs="Arial" w:ascii="Arial" w:hAnsi="Arial"/>
+        </w:rPr>
+        <w:t xml:space="preserve"> </w:t>
+      </w:r>
+      <w:r>
+        <w:rPr>
+          <w:rFonts w:cs="Arial" w:ascii="Arial" w:hAnsi="Arial"/>
+          <w:b/>
+        </w:rPr>
+        <w:t>da-DK</w:t>
+      </w:r>
+      <w:r>
+        <w:rPr>
+          <w:rFonts w:cs="Arial" w:ascii="Arial" w:hAnsi="Arial"/>
+        </w:rPr>
+        <w:t xml:space="preserve"> o</w:t>
+      </w:r>
+      <w:r>
+        <w:rPr>
+          <w:rFonts w:cs="Arial" w:ascii="Arial" w:hAnsi="Arial"/>
+          <w:lang w:val="da-DK"/>
+        </w:rPr>
+        <w:t xml:space="preserve">g </w:t>
+      </w:r>
+      <w:r>
+        <w:rPr>
+          <w:rFonts w:cs="Arial" w:ascii="Arial" w:hAnsi="Arial"/>
+          <w:b/>
+          <w:lang w:val="da-DK"/>
+        </w:rPr>
+        <w:t>en-US</w:t>
+      </w:r>
+      <w:r>
+        <w:rPr>
+          <w:rFonts w:cs="Arial" w:ascii="Arial" w:hAnsi="Arial"/>
+          <w:lang w:val="da-DK"/>
+        </w:rPr>
+        <w:t xml:space="preserve"> </w:t>
+      </w:r>
+      <w:r>
+        <w:rPr>
+          <w:rFonts w:cs="Arial" w:ascii="Arial" w:hAnsi="Arial"/>
+          <w:lang w:val="da-DK"/>
+        </w:rPr>
+        <w:t xml:space="preserve">og </w:t>
+      </w:r>
+      <w:r>
+        <w:rPr>
+          <w:rFonts w:cs="Arial" w:ascii="Arial" w:hAnsi="Arial"/>
+          <w:b/>
+          <w:bCs/>
+          <w:lang w:val="da-DK"/>
+        </w:rPr>
+        <w:t xml:space="preserve">nl-NL </w:t>
+      </w:r>
+      <w:r>
+        <w:rPr>
+          <w:rFonts w:cs="Arial" w:ascii="Arial" w:hAnsi="Arial"/>
+          <w:lang w:val="da-DK"/>
+        </w:rPr>
+        <w:t>under</w:t>
+      </w:r>
+    </w:p>
+    <w:p>
+      <w:pPr>
+        <w:pStyle w:val="Standard"/>
+        <w:bidi w:val="0"/>
+        <w:ind w:left="720" w:hanging="0"/>
+        <w:jc w:val="left"/>
+        <w:rPr>
+          <w:rFonts w:ascii="Arial" w:hAnsi="Arial" w:cs="Arial"/>
+          <w:lang w:val="en-US"/>
+        </w:rPr>
+      </w:pPr>
+      <w:r>
+        <w:rPr>
+          <w:rFonts w:cs="Arial" w:ascii="Arial" w:hAnsi="Arial"/>
+          <w:lang w:val="en-US"/>
+        </w:rPr>
+        <w:t>…</w:t>
+      </w:r>
+      <w:r>
+        <w:rPr>
+          <w:rFonts w:eastAsia="Arial" w:cs="Arial" w:ascii="Arial" w:hAnsi="Arial"/>
+          <w:lang w:val="en-US"/>
+        </w:rPr>
+        <w:t xml:space="preserve"> </w:t>
+      </w:r>
+      <w:r>
+        <w:rPr>
+          <w:rFonts w:cs="Arial" w:ascii="Arial" w:hAnsi="Arial"/>
+        </w:rPr>
+        <w:t>MusicXmlReaderUI\</w:t>
+      </w:r>
+      <w:r>
+        <w:rPr>
+          <w:rFonts w:cs="Arial" w:ascii="Arial" w:hAnsi="Arial"/>
+          <w:lang w:val="en-US"/>
+        </w:rPr>
+        <w:t xml:space="preserve"> </w:t>
+      </w:r>
+      <w:r>
+        <w:rPr>
+          <w:rFonts w:cs="Arial" w:ascii="Arial" w:hAnsi="Arial"/>
+        </w:rPr>
+        <w:t>MusicXmlReader\bin\Debug\Documentation</w:t>
+      </w:r>
+      <w:r>
+        <w:rPr>
+          <w:rFonts w:cs="Arial" w:ascii="Arial" w:hAnsi="Arial"/>
+          <w:lang w:val="en-US"/>
+        </w:rPr>
+        <w:t>\</w:t>
+      </w:r>
+    </w:p>
+    <w:p>
+      <w:pPr>
+        <w:pStyle w:val="Standard"/>
+        <w:bidi w:val="0"/>
+        <w:ind w:left="720" w:hanging="0"/>
+        <w:jc w:val="left"/>
+        <w:rPr/>
+      </w:pPr>
+      <w:r>
+        <w:rPr>
+          <w:rFonts w:cs="Arial" w:ascii="Arial" w:hAnsi="Arial"/>
+          <w:lang w:val="da-DK"/>
+        </w:rPr>
+        <w:t>så de bliver tilgængelige fra det installerede program.</w:t>
+      </w:r>
+    </w:p>
+    <w:p>
+      <w:pPr>
+        <w:pStyle w:val="Standard"/>
+        <w:bidi w:val="0"/>
+        <w:ind w:left="720" w:hanging="0"/>
+        <w:jc w:val="left"/>
+        <w:rPr/>
+      </w:pPr>
+      <w:r>
+        <w:rPr>
+          <w:rFonts w:cs="Arial" w:ascii="Arial" w:hAnsi="Arial"/>
+          <w:lang w:val="da-DK"/>
+        </w:rPr>
+        <w:t>Under nl-NL anbringes den engelsksprogede User’s manual, men renamet til det hollandske navn, så den uden videre kan udskiftes senere i en eksisterende hollandsk installation.</w:t>
+      </w:r>
+    </w:p>
+    <w:p>
+      <w:pPr>
+        <w:pStyle w:val="Standard"/>
+        <w:bidi w:val="0"/>
+        <w:ind w:left="720" w:hanging="0"/>
+        <w:jc w:val="left"/>
+        <w:rPr>
+          <w:rFonts w:ascii="Arial" w:hAnsi="Arial" w:cs="Arial"/>
+          <w:lang w:val="da-DK"/>
+        </w:rPr>
+      </w:pPr>
+      <w:r>
+        <w:rPr>
+          <w:rFonts w:cs="Arial" w:ascii="Arial" w:hAnsi="Arial"/>
+          <w:b/>
+          <w:bCs/>
+          <w:lang w:val="da-DK"/>
+        </w:rPr>
+        <w:t>Sørg for at fjerne en eventuel skrivebeskyttelse!</w:t>
+      </w:r>
+    </w:p>
+    <w:p>
+      <w:pPr>
+        <w:pStyle w:val="Standard"/>
+        <w:numPr>
+          <w:ilvl w:val="0"/>
+          <w:numId w:val="4"/>
+        </w:numPr>
+        <w:bidi w:val="0"/>
+        <w:jc w:val="left"/>
+        <w:rPr>
+          <w:rFonts w:ascii="Arial" w:hAnsi="Arial" w:cs="Arial"/>
+          <w:lang w:val="da-DK"/>
+        </w:rPr>
+      </w:pPr>
+      <w:r>
+        <w:rPr>
+          <w:rFonts w:cs="Arial" w:ascii="Arial" w:hAnsi="Arial"/>
+          <w:lang w:val="da-DK"/>
+        </w:rPr>
+        <w:t>Fjern eventuelle gamle dokumentationsfiler ”2.0.0.0” sammesteds.</w:t>
+      </w:r>
+    </w:p>
+    <w:p>
+      <w:pPr>
+        <w:pStyle w:val="Standard"/>
+        <w:numPr>
+          <w:ilvl w:val="0"/>
+          <w:numId w:val="4"/>
+        </w:numPr>
+        <w:bidi w:val="0"/>
+        <w:jc w:val="left"/>
+        <w:rPr>
+          <w:rFonts w:ascii="Arial" w:hAnsi="Arial" w:cs="Arial"/>
+          <w:lang w:val="da-DK"/>
+        </w:rPr>
+      </w:pPr>
+      <w:r>
+        <w:rPr>
+          <w:rFonts w:cs="Arial" w:ascii="Arial" w:hAnsi="Arial"/>
+          <w:lang w:val="da-DK"/>
+        </w:rPr>
+        <w:t>Check at dokumentationsfilerne er tilgængelige fra Hjælp under applikationen.</w:t>
+      </w:r>
+    </w:p>
+    <w:p>
+      <w:pPr>
+        <w:pStyle w:val="Standard"/>
+        <w:bidi w:val="0"/>
+        <w:jc w:val="left"/>
+        <w:rPr>
+          <w:rFonts w:ascii="Arial" w:hAnsi="Arial" w:cs="Arial"/>
+          <w:lang w:val="da-DK"/>
+        </w:rPr>
+      </w:pPr>
+      <w:r>
+        <w:rPr>
+          <w:rFonts w:cs="Arial" w:ascii="Arial" w:hAnsi="Arial"/>
+          <w:lang w:val="da-DK"/>
+        </w:rPr>
+      </w:r>
+    </w:p>
+    <w:p>
+      <w:pPr>
+        <w:pStyle w:val="Normal"/>
+        <w:rPr>
+          <w:lang w:val="da-DK" w:eastAsia="da-DK" w:bidi="da-DK"/>
+        </w:rPr>
+      </w:pPr>
+      <w:r>
+        <w:rPr>
+          <w:lang w:val="da-DK" w:eastAsia="da-DK" w:bidi="da-DK"/>
+        </w:rPr>
+      </w:r>
+    </w:p>
+    <w:p>
+      <w:pPr>
+        <w:pStyle w:val="Normal"/>
+        <w:rPr>
+          <w:lang w:val="da-DK" w:eastAsia="da-DK" w:bidi="da-DK"/>
+        </w:rPr>
+      </w:pPr>
+      <w:r>
+        <w:rPr>
+          <w:lang w:val="da-DK" w:eastAsia="da-DK" w:bidi="da-DK"/>
+        </w:rPr>
+      </w:r>
+    </w:p>
+    <w:p>
+      <w:pPr>
+        <w:pStyle w:val="Normal"/>
+        <w:rPr>
+          <w:lang w:val="da-DK" w:eastAsia="da-DK" w:bidi="da-DK"/>
+        </w:rPr>
+      </w:pPr>
+      <w:r>
+        <w:rPr>
+          <w:lang w:val="da-DK" w:eastAsia="da-DK" w:bidi="da-DK"/>
+        </w:rPr>
+      </w:r>
+    </w:p>
+    <w:p>
+      <w:pPr>
+        <w:pStyle w:val="Normal"/>
+        <w:rPr>
+          <w:lang w:val="da-DK" w:eastAsia="da-DK" w:bidi="da-DK"/>
+        </w:rPr>
+      </w:pPr>
+      <w:r>
+        <w:rPr>
+          <w:lang w:val="da-DK" w:eastAsia="da-DK" w:bidi="da-DK"/>
+        </w:rPr>
+      </w:r>
+    </w:p>
+    <w:p>
+      <w:pPr>
+        <w:pStyle w:val="Standard"/>
+        <w:tabs>
+          <w:tab w:val="clear" w:pos="709"/>
+          <w:tab w:val="left" w:pos="1575" w:leader="none"/>
+        </w:tabs>
+        <w:bidi w:val="0"/>
+        <w:jc w:val="left"/>
+        <w:rPr/>
+      </w:pPr>
+      <w:r>
+        <w:rPr/>
+        <w:tab/>
+      </w:r>
+    </w:p>
+    <w:p>
+      <w:pPr>
+        <w:pStyle w:val="Standard"/>
+        <w:bidi w:val="0"/>
+        <w:jc w:val="left"/>
+        <w:rPr/>
+      </w:pPr>
+      <w:r>
+        <w:rPr/>
+      </w:r>
+      <w:r>
+        <w:br w:type="page"/>
+      </w:r>
+    </w:p>
+    <w:p>
+      <w:pPr>
+        <w:pStyle w:val="Standard"/>
+        <w:bidi w:val="0"/>
+        <w:jc w:val="left"/>
+        <w:rPr/>
+      </w:pPr>
+      <w:r>
+        <w:rPr/>
+      </w:r>
+    </w:p>
+    <w:p>
+      <w:pPr>
+        <w:pStyle w:val="Overskrift1"/>
+        <w:numPr>
+          <w:ilvl w:val="0"/>
+          <w:numId w:val="2"/>
+        </w:numPr>
+        <w:bidi w:val="0"/>
+        <w:jc w:val="left"/>
+        <w:rPr/>
+      </w:pPr>
+      <w:bookmarkStart w:id="3" w:name="__RefHeading___Toc531097479"/>
+      <w:bookmarkEnd w:id="3"/>
+      <w:r>
+        <w:rPr/>
+        <w:t>Build in Visual Studio</w:t>
+      </w:r>
+    </w:p>
+    <w:p>
+      <w:pPr>
+        <w:pStyle w:val="Standard"/>
+        <w:bidi w:val="0"/>
+        <w:jc w:val="left"/>
+        <w:rPr/>
+      </w:pPr>
+      <w:r>
+        <w:rPr/>
+      </w:r>
+    </w:p>
+    <w:p>
+      <w:pPr>
+        <w:pStyle w:val="Standard"/>
+        <w:bidi w:val="0"/>
+        <w:jc w:val="left"/>
+        <w:rPr>
+          <w:rFonts w:ascii="Arial" w:hAnsi="Arial" w:cs="Arial"/>
+        </w:rPr>
+      </w:pPr>
+      <w:r>
+        <w:rPr>
+          <w:rFonts w:cs="Arial" w:ascii="Arial" w:hAnsi="Arial"/>
+        </w:rPr>
+        <w:t>I MusicXmlReader Properties .AssemblyInfo.AssemblyInfo.cs set</w:t>
       </w:r>
     </w:p>
     <w:p>
@@ -1495,139 +2085,26 @@
         <w:jc w:val="left"/>
         <w:rPr>
           <w:rFonts w:ascii="Arial" w:hAnsi="Arial" w:cs="Arial"/>
-          <w:lang w:val="da-DK"/>
-        </w:rPr>
-      </w:pPr>
-      <w:r>
-        <w:rPr>
-          <w:rFonts w:cs="Arial" w:ascii="Arial" w:hAnsi="Arial"/>
-        </w:rPr>
-        <w:t xml:space="preserve">Kopier brugervejledninger til hhv </w:t>
-      </w:r>
-      <w:r>
-        <w:rPr>
-          <w:rFonts w:cs="Arial" w:ascii="Arial" w:hAnsi="Arial"/>
-          <w:b/>
-        </w:rPr>
-        <w:t>da-DK</w:t>
-      </w:r>
-      <w:r>
-        <w:rPr>
-          <w:rFonts w:cs="Arial" w:ascii="Arial" w:hAnsi="Arial"/>
-        </w:rPr>
-        <w:t xml:space="preserve"> o</w:t>
-      </w:r>
-      <w:r>
-        <w:rPr>
-          <w:rFonts w:cs="Arial" w:ascii="Arial" w:hAnsi="Arial"/>
-          <w:lang w:val="da-DK"/>
-        </w:rPr>
-        <w:t xml:space="preserve">g </w:t>
-      </w:r>
-      <w:r>
-        <w:rPr>
-          <w:rFonts w:cs="Arial" w:ascii="Arial" w:hAnsi="Arial"/>
-          <w:b/>
-          <w:lang w:val="da-DK"/>
-        </w:rPr>
-        <w:t>en-US</w:t>
-      </w:r>
-      <w:r>
-        <w:rPr>
-          <w:rFonts w:cs="Arial" w:ascii="Arial" w:hAnsi="Arial"/>
-          <w:lang w:val="da-DK"/>
-        </w:rPr>
-        <w:t xml:space="preserve"> under</w:t>
-      </w:r>
-    </w:p>
-    <w:p>
-      <w:pPr>
-        <w:pStyle w:val="Standard"/>
-        <w:bidi w:val="0"/>
-        <w:ind w:left="720" w:hanging="0"/>
-        <w:jc w:val="left"/>
-        <w:rPr>
-          <w:rFonts w:ascii="Arial" w:hAnsi="Arial" w:cs="Arial"/>
-          <w:lang w:val="en-US"/>
-        </w:rPr>
-      </w:pPr>
-      <w:r>
-        <w:rPr>
-          <w:rFonts w:cs="Arial" w:ascii="Arial" w:hAnsi="Arial"/>
-          <w:lang w:val="en-US"/>
-        </w:rPr>
-        <w:t>…</w:t>
-      </w:r>
-      <w:r>
-        <w:rPr>
-          <w:rFonts w:eastAsia="Arial" w:cs="Arial" w:ascii="Arial" w:hAnsi="Arial"/>
-          <w:lang w:val="en-US"/>
-        </w:rPr>
-        <w:t xml:space="preserve"> </w:t>
-      </w:r>
-      <w:r>
-        <w:rPr>
-          <w:rFonts w:cs="Arial" w:ascii="Arial" w:hAnsi="Arial"/>
-        </w:rPr>
-        <w:t>MusicXmlReaderUI\</w:t>
-      </w:r>
-      <w:r>
-        <w:rPr>
-          <w:rFonts w:cs="Arial" w:ascii="Arial" w:hAnsi="Arial"/>
-          <w:lang w:val="en-US"/>
-        </w:rPr>
-        <w:t xml:space="preserve"> </w:t>
-      </w:r>
-      <w:r>
-        <w:rPr>
-          <w:rFonts w:cs="Arial" w:ascii="Arial" w:hAnsi="Arial"/>
-        </w:rPr>
-        <w:t>MusicXmlReader\bin\Debug\Documentation</w:t>
-      </w:r>
-      <w:r>
-        <w:rPr>
-          <w:rFonts w:cs="Arial" w:ascii="Arial" w:hAnsi="Arial"/>
-          <w:lang w:val="en-US"/>
-        </w:rPr>
-        <w:t>\</w:t>
-      </w:r>
-    </w:p>
-    <w:p>
-      <w:pPr>
-        <w:pStyle w:val="Standard"/>
-        <w:bidi w:val="0"/>
-        <w:ind w:left="720" w:hanging="0"/>
-        <w:jc w:val="left"/>
-        <w:rPr>
-          <w:rFonts w:ascii="Arial" w:hAnsi="Arial" w:cs="Arial"/>
-          <w:lang w:val="da-DK"/>
-        </w:rPr>
-      </w:pPr>
-      <w:r>
-        <w:rPr>
-          <w:rFonts w:cs="Arial" w:ascii="Arial" w:hAnsi="Arial"/>
-          <w:lang w:val="da-DK"/>
-        </w:rPr>
-        <w:t>så de bliver tilgængelige fra det installerede program.</w:t>
-      </w:r>
-    </w:p>
-    <w:p>
-      <w:pPr>
-        <w:pStyle w:val="Standard"/>
-        <w:bidi w:val="0"/>
-        <w:ind w:left="720" w:hanging="0"/>
-        <w:jc w:val="left"/>
-        <w:rPr>
-          <w:rFonts w:ascii="Arial" w:hAnsi="Arial" w:cs="Arial"/>
-          <w:lang w:val="da-DK"/>
-        </w:rPr>
-      </w:pPr>
-      <w:r>
-        <w:rPr>
-          <w:rFonts w:cs="Arial" w:ascii="Arial" w:hAnsi="Arial"/>
-          <w:lang w:val="da-DK"/>
-        </w:rPr>
-        <w:t>Sørg for at fjerne en eventuel skrivebeskyttelse!</w:t>
+        </w:rPr>
+      </w:pPr>
+      <w:r>
+        <w:rPr>
+          <w:rFonts w:cs="Arial" w:ascii="Arial" w:hAnsi="Arial"/>
+        </w:rPr>
+        <w:t>Set AssemblyVersion = "</w:t>
+      </w:r>
+      <w:r>
+        <w:rPr>
+          <w:rFonts w:cs="Arial" w:ascii="Arial" w:hAnsi="Arial"/>
+          <w:lang w:val="da-DK"/>
+        </w:rPr>
+        <w:t>3</w:t>
+      </w:r>
+      <w:r>
+        <w:rPr>
+          <w:rFonts w:cs="Arial" w:ascii="Arial" w:hAnsi="Arial"/>
+        </w:rPr>
+        <w:t>.0.0.0"</w:t>
       </w:r>
     </w:p>
     <w:p>
@@ -1641,15 +2118,42 @@
         <w:jc w:val="left"/>
         <w:rPr>
           <w:rFonts w:ascii="Arial" w:hAnsi="Arial" w:cs="Arial"/>
-          <w:lang w:val="da-DK"/>
-        </w:rPr>
-      </w:pPr>
-      <w:r>
-        <w:rPr>
-          <w:rFonts w:cs="Arial" w:ascii="Arial" w:hAnsi="Arial"/>
-          <w:lang w:val="da-DK"/>
-        </w:rPr>
-        <w:t>Fjern eventuelle gamle dokumentationsfiler ”2.0.0.0” sammesteds.</w:t>
+        </w:rPr>
+      </w:pPr>
+      <w:r>
+        <w:rPr>
+          <w:rFonts w:cs="Arial" w:ascii="Arial" w:hAnsi="Arial"/>
+        </w:rPr>
+        <w:t>Set AssemblyFileVersion = "</w:t>
+      </w:r>
+      <w:r>
+        <w:rPr>
+          <w:rFonts w:cs="Arial" w:ascii="Arial" w:hAnsi="Arial"/>
+          <w:lang w:val="da-DK"/>
+        </w:rPr>
+        <w:t>3</w:t>
+      </w:r>
+      <w:r>
+        <w:rPr>
+          <w:rFonts w:cs="Arial" w:ascii="Arial" w:hAnsi="Arial"/>
+        </w:rPr>
+        <w:t>.0.0.0"</w:t>
+      </w:r>
+    </w:p>
+    <w:p>
+      <w:pPr>
+        <w:pStyle w:val="Standard"/>
+        <w:bidi w:val="0"/>
+        <w:jc w:val="left"/>
+        <w:rPr>
+          <w:rFonts w:ascii="Arial" w:hAnsi="Arial" w:cs="Arial"/>
+        </w:rPr>
+      </w:pPr>
+      <w:r>
+        <w:rPr>
+          <w:rFonts w:cs="Arial" w:ascii="Arial" w:hAnsi="Arial"/>
+        </w:rPr>
+        <w:t>I MusicXmlReader Properties.Application set</w:t>
       </w:r>
     </w:p>
     <w:p>
@@ -1657,192 +2161,232 @@
         <w:pStyle w:val="Standard"/>
         <w:numPr>
           <w:ilvl w:val="0"/>
-          <w:numId w:val="3"/>
+          <w:numId w:val="5"/>
         </w:numPr>
         <w:bidi w:val="0"/>
         <w:jc w:val="left"/>
         <w:rPr>
           <w:rFonts w:ascii="Arial" w:hAnsi="Arial" w:cs="Arial"/>
-          <w:lang w:val="da-DK"/>
-        </w:rPr>
-      </w:pPr>
-      <w:r>
-        <w:rPr>
-          <w:rFonts w:cs="Arial" w:ascii="Arial" w:hAnsi="Arial"/>
-          <w:lang w:val="da-DK"/>
-        </w:rPr>
-        <w:t>Check at dokumentationsfilerne er tilgængelige fra Hjælp under applikationen.</w:t>
-      </w:r>
-    </w:p>
-    <w:p>
-      <w:pPr>
-        <w:pStyle w:val="Standard"/>
-        <w:bidi w:val="0"/>
-        <w:jc w:val="left"/>
-        <w:rPr>
-          <w:rFonts w:ascii="Arial" w:hAnsi="Arial" w:cs="Arial"/>
-          <w:lang w:val="da-DK"/>
-        </w:rPr>
-      </w:pPr>
-      <w:r>
-        <w:rPr>
-          <w:rFonts w:cs="Arial" w:ascii="Arial" w:hAnsi="Arial"/>
-          <w:lang w:val="da-DK"/>
-        </w:rPr>
-      </w:r>
-    </w:p>
-    <w:p>
-      <w:pPr>
-        <w:pStyle w:val="Normal"/>
-        <w:rPr>
-          <w:lang w:val="da-DK" w:eastAsia="da-DK" w:bidi="da-DK"/>
-        </w:rPr>
-      </w:pPr>
-      <w:r>
-        <w:rPr>
-          <w:lang w:val="da-DK" w:eastAsia="da-DK" w:bidi="da-DK"/>
-        </w:rPr>
-      </w:r>
-    </w:p>
-    <w:p>
-      <w:pPr>
-        <w:pStyle w:val="Normal"/>
-        <w:rPr>
-          <w:lang w:val="da-DK" w:eastAsia="da-DK" w:bidi="da-DK"/>
-        </w:rPr>
-      </w:pPr>
-      <w:r>
-        <w:rPr>
-          <w:lang w:val="da-DK" w:eastAsia="da-DK" w:bidi="da-DK"/>
-        </w:rPr>
-      </w:r>
-    </w:p>
-    <w:p>
-      <w:pPr>
-        <w:pStyle w:val="Normal"/>
-        <w:rPr>
-          <w:lang w:val="da-DK" w:eastAsia="da-DK" w:bidi="da-DK"/>
-        </w:rPr>
-      </w:pPr>
-      <w:r>
-        <w:rPr>
-          <w:lang w:val="da-DK" w:eastAsia="da-DK" w:bidi="da-DK"/>
-        </w:rPr>
-      </w:r>
-    </w:p>
-    <w:p>
-      <w:pPr>
-        <w:pStyle w:val="Normal"/>
-        <w:rPr>
-          <w:lang w:val="da-DK" w:eastAsia="da-DK" w:bidi="da-DK"/>
-        </w:rPr>
-      </w:pPr>
-      <w:r>
-        <w:rPr>
-          <w:lang w:val="da-DK" w:eastAsia="da-DK" w:bidi="da-DK"/>
-        </w:rPr>
-      </w:r>
-    </w:p>
-    <w:p>
-      <w:pPr>
-        <w:pStyle w:val="Standard"/>
-        <w:tabs>
-          <w:tab w:val="clear" w:pos="709"/>
-          <w:tab w:val="left" w:pos="1575" w:leader="none"/>
-        </w:tabs>
-        <w:bidi w:val="0"/>
-        <w:jc w:val="left"/>
-        <w:rPr/>
-      </w:pPr>
-      <w:r>
-        <w:rPr/>
-        <w:tab/>
-      </w:r>
-    </w:p>
-    <w:p>
-      <w:pPr>
-        <w:pStyle w:val="Standard"/>
-        <w:bidi w:val="0"/>
-        <w:jc w:val="left"/>
-        <w:rPr/>
-      </w:pPr>
-      <w:r>
-        <w:rPr/>
-      </w:r>
-      <w:r>
-        <w:br w:type="page"/>
-      </w:r>
-    </w:p>
-    <w:p>
-      <w:pPr>
-        <w:pStyle w:val="Standard"/>
-        <w:bidi w:val="0"/>
-        <w:jc w:val="left"/>
-        <w:rPr/>
-      </w:pPr>
-      <w:r>
-        <w:rPr/>
+        </w:rPr>
+      </w:pPr>
+      <w:r>
+        <w:rPr>
+          <w:rFonts w:cs="Arial" w:ascii="Arial" w:hAnsi="Arial"/>
+        </w:rPr>
+        <w:t>Output type = "Windows Application"</w:t>
+      </w:r>
+    </w:p>
+    <w:p>
+      <w:pPr>
+        <w:pStyle w:val="Standard"/>
+        <w:bidi w:val="0"/>
+        <w:jc w:val="left"/>
+        <w:rPr>
+          <w:rFonts w:ascii="Arial" w:hAnsi="Arial" w:cs="Arial"/>
+        </w:rPr>
+      </w:pPr>
+      <w:r>
+        <w:rPr>
+          <w:rFonts w:cs="Arial" w:ascii="Arial" w:hAnsi="Arial"/>
+        </w:rPr>
+        <w:t>Commit everything to Git.</w:t>
+      </w:r>
+    </w:p>
+    <w:p>
+      <w:pPr>
+        <w:pStyle w:val="Standard"/>
+        <w:bidi w:val="0"/>
+        <w:jc w:val="left"/>
+        <w:rPr>
+          <w:rFonts w:ascii="Arial" w:hAnsi="Arial" w:cs="Arial"/>
+        </w:rPr>
+      </w:pPr>
+      <w:r>
+        <w:rPr>
+          <w:rFonts w:cs="Arial" w:ascii="Arial" w:hAnsi="Arial"/>
+        </w:rPr>
+        <w:t>Clean Solution</w:t>
+      </w:r>
+    </w:p>
+    <w:p>
+      <w:pPr>
+        <w:pStyle w:val="Standard"/>
+        <w:bidi w:val="0"/>
+        <w:jc w:val="left"/>
+        <w:rPr>
+          <w:rFonts w:ascii="Arial" w:hAnsi="Arial" w:cs="Arial"/>
+        </w:rPr>
+      </w:pPr>
+      <w:r>
+        <w:rPr>
+          <w:rFonts w:cs="Arial" w:ascii="Arial" w:hAnsi="Arial"/>
+        </w:rPr>
+        <w:t>Rebuild Solution</w:t>
+      </w:r>
+    </w:p>
+    <w:p>
+      <w:pPr>
+        <w:pStyle w:val="Standard"/>
+        <w:bidi w:val="0"/>
+        <w:jc w:val="left"/>
+        <w:rPr>
+          <w:rFonts w:ascii="Arial" w:hAnsi="Arial" w:cs="Arial"/>
+        </w:rPr>
+      </w:pPr>
+      <w:r>
+        <w:rPr>
+          <w:rFonts w:cs="Arial" w:ascii="Arial" w:hAnsi="Arial"/>
+        </w:rPr>
+      </w:r>
+    </w:p>
+    <w:p>
+      <w:pPr>
+        <w:pStyle w:val="Standard"/>
+        <w:bidi w:val="0"/>
+        <w:jc w:val="left"/>
+        <w:rPr>
+          <w:rFonts w:ascii="Arial" w:hAnsi="Arial" w:cs="Arial"/>
+        </w:rPr>
+      </w:pPr>
+      <w:r>
+        <w:rPr>
+          <w:rFonts w:cs="Arial" w:ascii="Arial" w:hAnsi="Arial"/>
+        </w:rPr>
+        <w:t>Nu ligger alle filer i</w:t>
+      </w:r>
+    </w:p>
+    <w:p>
+      <w:pPr>
+        <w:pStyle w:val="Standard"/>
+        <w:bidi w:val="0"/>
+        <w:jc w:val="left"/>
+        <w:rPr>
+          <w:rFonts w:ascii="Arial" w:hAnsi="Arial" w:cs="Arial"/>
+        </w:rPr>
+      </w:pPr>
+      <w:r>
+        <w:rPr>
+          <w:rFonts w:cs="Arial" w:ascii="Arial" w:hAnsi="Arial"/>
+        </w:rPr>
+      </w:r>
+    </w:p>
+    <w:p>
+      <w:pPr>
+        <w:pStyle w:val="Standard"/>
+        <w:bidi w:val="0"/>
+        <w:jc w:val="left"/>
+        <w:rPr>
+          <w:rFonts w:ascii="Arial" w:hAnsi="Arial" w:cs="Arial"/>
+          <w:sz w:val="20"/>
+          <w:szCs w:val="20"/>
+        </w:rPr>
+      </w:pPr>
+      <w:r>
+        <w:rPr>
+          <w:rFonts w:cs="Arial" w:ascii="Arial" w:hAnsi="Arial"/>
+          <w:sz w:val="20"/>
+          <w:szCs w:val="20"/>
+        </w:rPr>
+        <w:t>C:\Users\Jens\Dropbox\Root\Visual Studio 2015\Projects\MusicXmlReaderUI\MusicXmlReader\bin\Debug</w:t>
+      </w:r>
+    </w:p>
+    <w:p>
+      <w:pPr>
+        <w:pStyle w:val="Standard"/>
+        <w:bidi w:val="0"/>
+        <w:jc w:val="left"/>
+        <w:rPr>
+          <w:rFonts w:ascii="Arial" w:hAnsi="Arial" w:cs="Arial"/>
+          <w:sz w:val="20"/>
+          <w:szCs w:val="20"/>
+        </w:rPr>
+      </w:pPr>
+      <w:r>
+        <w:rPr>
+          <w:rFonts w:cs="Arial" w:ascii="Arial" w:hAnsi="Arial"/>
+          <w:sz w:val="20"/>
+          <w:szCs w:val="20"/>
+        </w:rPr>
       </w:r>
     </w:p>
     <w:p>
       <w:pPr>
         <w:pStyle w:val="Overskrift1"/>
-        <w:bidi w:val="0"/>
-        <w:jc w:val="left"/>
-        <w:rPr/>
-      </w:pPr>
-      <w:bookmarkStart w:id="3" w:name="__RefHeading___Toc531097479"/>
-      <w:bookmarkEnd w:id="3"/>
-      <w:r>
-        <w:rPr/>
-        <w:t>Build in Visual Studio</w:t>
-      </w:r>
-    </w:p>
-    <w:p>
-      <w:pPr>
-        <w:pStyle w:val="Standard"/>
-        <w:bidi w:val="0"/>
-        <w:jc w:val="left"/>
-        <w:rPr/>
-      </w:pPr>
-      <w:r>
-        <w:rPr/>
-      </w:r>
-    </w:p>
-    <w:p>
-      <w:pPr>
-        <w:pStyle w:val="Standard"/>
-        <w:bidi w:val="0"/>
-        <w:jc w:val="left"/>
-        <w:rPr>
-          <w:rFonts w:ascii="Arial" w:hAnsi="Arial" w:cs="Arial"/>
-        </w:rPr>
-      </w:pPr>
-      <w:r>
-        <w:rPr>
-          <w:rFonts w:cs="Arial" w:ascii="Arial" w:hAnsi="Arial"/>
-        </w:rPr>
-        <w:t>I MusicXmlReader Properties .AssemblyInfo.AssemblyInfo.cs set</w:t>
-      </w:r>
-    </w:p>
-    <w:p>
-      <w:pPr>
-        <w:pStyle w:val="Standard"/>
         <w:numPr>
           <w:ilvl w:val="0"/>
           <w:numId w:val="2"/>
         </w:numPr>
         <w:bidi w:val="0"/>
         <w:jc w:val="left"/>
-        <w:rPr>
-          <w:rFonts w:ascii="Arial" w:hAnsi="Arial" w:cs="Arial"/>
-        </w:rPr>
-      </w:pPr>
-      <w:r>
-        <w:rPr>
-          <w:rFonts w:cs="Arial" w:ascii="Arial" w:hAnsi="Arial"/>
-        </w:rPr>
-        <w:t>Set AssemblyVersion = "</w:t>
+        <w:rPr/>
+      </w:pPr>
+      <w:bookmarkStart w:id="4" w:name="__RefHeading___Toc531097480"/>
+      <w:bookmarkEnd w:id="4"/>
+      <w:r>
+        <w:rPr/>
+        <w:t>Make a copy of all source code involved</w:t>
+      </w:r>
+    </w:p>
+    <w:p>
+      <w:pPr>
+        <w:pStyle w:val="Standard"/>
+        <w:bidi w:val="0"/>
+        <w:jc w:val="left"/>
+        <w:rPr>
+          <w:rFonts w:ascii="Arial" w:hAnsi="Arial" w:cs="Arial"/>
+        </w:rPr>
+      </w:pPr>
+      <w:r>
+        <w:rPr>
+          <w:rFonts w:cs="Arial" w:ascii="Arial" w:hAnsi="Arial"/>
+        </w:rPr>
+      </w:r>
+    </w:p>
+    <w:p>
+      <w:pPr>
+        <w:pStyle w:val="Standard"/>
+        <w:bidi w:val="0"/>
+        <w:jc w:val="left"/>
+        <w:rPr>
+          <w:rFonts w:ascii="Arial" w:hAnsi="Arial" w:cs="Arial"/>
+        </w:rPr>
+      </w:pPr>
+      <w:r>
+        <w:rPr>
+          <w:rFonts w:cs="Arial" w:ascii="Arial" w:hAnsi="Arial"/>
+        </w:rPr>
+        <w:t>Copy  C:\Users\Jens\Dropbox\Root\Visual Studio 2015\Projects\MusicXmlReaderUI</w:t>
+      </w:r>
+    </w:p>
+    <w:p>
+      <w:pPr>
+        <w:pStyle w:val="Standard"/>
+        <w:bidi w:val="0"/>
+        <w:jc w:val="left"/>
+        <w:rPr>
+          <w:rFonts w:ascii="Arial" w:hAnsi="Arial" w:cs="Arial"/>
+        </w:rPr>
+      </w:pPr>
+      <w:r>
+        <w:rPr>
+          <w:rFonts w:cs="Arial" w:ascii="Arial" w:hAnsi="Arial"/>
+        </w:rPr>
+      </w:r>
+    </w:p>
+    <w:p>
+      <w:pPr>
+        <w:pStyle w:val="Standard"/>
+        <w:bidi w:val="0"/>
+        <w:jc w:val="left"/>
+        <w:rPr>
+          <w:rFonts w:ascii="Arial" w:hAnsi="Arial" w:cs="Arial"/>
+        </w:rPr>
+      </w:pPr>
+      <w:r>
+        <w:rPr>
+          <w:rFonts w:cs="Arial" w:ascii="Arial" w:hAnsi="Arial"/>
+        </w:rPr>
+        <w:t xml:space="preserve">til C:\Users\Jens\Dropbox\Root\Arkiv for Releasede versioner\Version </w:t>
       </w:r>
       <w:r>
         <w:rPr>
@@ -1855,320 +2399,33 @@
         <w:rPr>
           <w:rFonts w:cs="Arial" w:ascii="Arial" w:hAnsi="Arial"/>
         </w:rPr>
-        <w:t>.0.0.0"</w:t>
-      </w:r>
-    </w:p>
-    <w:p>
-      <w:pPr>
-        <w:pStyle w:val="Standard"/>
+        <w:t>.0.0.0</w:t>
+      </w:r>
+    </w:p>
+    <w:p>
+      <w:pPr>
+        <w:pStyle w:val="Standard"/>
+        <w:bidi w:val="0"/>
+        <w:jc w:val="left"/>
+        <w:rPr>
+          <w:rFonts w:ascii="Arial" w:hAnsi="Arial" w:cs="Arial"/>
+        </w:rPr>
+      </w:pPr>
+      <w:r>
+        <w:rPr>
+          <w:rFonts w:cs="Arial" w:ascii="Arial" w:hAnsi="Arial"/>
+        </w:rPr>
+      </w:r>
+    </w:p>
+    <w:p>
+      <w:pPr>
+        <w:pStyle w:val="Overskrift1"/>
         <w:numPr>
           <w:ilvl w:val="0"/>
           <w:numId w:val="2"/>
         </w:numPr>
         <w:bidi w:val="0"/>
         <w:jc w:val="left"/>
-        <w:rPr>
-          <w:rFonts w:ascii="Arial" w:hAnsi="Arial" w:cs="Arial"/>
-        </w:rPr>
-      </w:pPr>
-      <w:r>
-        <w:rPr>
-          <w:rFonts w:cs="Arial" w:ascii="Arial" w:hAnsi="Arial"/>
-        </w:rPr>
-        <w:t>Set AssemblyFileVersion = "</w:t>
-      </w:r>
-      <w:r>
-        <w:rPr>
-          <w:rFonts w:cs="Arial" w:ascii="Arial" w:hAnsi="Arial"/>
-          <w:lang w:val="da-DK"/>
-        </w:rPr>
-        <w:t>3</w:t>
-      </w:r>
-      <w:r>
-        <w:rPr>
-          <w:rFonts w:cs="Arial" w:ascii="Arial" w:hAnsi="Arial"/>
-        </w:rPr>
-        <w:t>.0.0.0"</w:t>
-      </w:r>
-    </w:p>
-    <w:p>
-      <w:pPr>
-        <w:pStyle w:val="Standard"/>
-        <w:bidi w:val="0"/>
-        <w:jc w:val="left"/>
-        <w:rPr>
-          <w:rFonts w:ascii="Arial" w:hAnsi="Arial" w:cs="Arial"/>
-        </w:rPr>
-      </w:pPr>
-      <w:r>
-        <w:rPr>
-          <w:rFonts w:cs="Arial" w:ascii="Arial" w:hAnsi="Arial"/>
-        </w:rPr>
-        <w:t>I MusicXmlReader Properties.Application set</w:t>
-      </w:r>
-    </w:p>
-    <w:p>
-      <w:pPr>
-        <w:pStyle w:val="Standard"/>
-        <w:numPr>
-          <w:ilvl w:val="0"/>
-          <w:numId w:val="4"/>
-        </w:numPr>
-        <w:bidi w:val="0"/>
-        <w:jc w:val="left"/>
-        <w:rPr>
-          <w:rFonts w:ascii="Arial" w:hAnsi="Arial" w:cs="Arial"/>
-        </w:rPr>
-      </w:pPr>
-      <w:r>
-        <w:rPr>
-          <w:rFonts w:cs="Arial" w:ascii="Arial" w:hAnsi="Arial"/>
-        </w:rPr>
-        <w:t>Output type = "Windows Application"</w:t>
-      </w:r>
-    </w:p>
-    <w:p>
-      <w:pPr>
-        <w:pStyle w:val="Standard"/>
-        <w:bidi w:val="0"/>
-        <w:jc w:val="left"/>
-        <w:rPr>
-          <w:rFonts w:ascii="Arial" w:hAnsi="Arial" w:cs="Arial"/>
-        </w:rPr>
-      </w:pPr>
-      <w:r>
-        <w:rPr>
-          <w:rFonts w:cs="Arial" w:ascii="Arial" w:hAnsi="Arial"/>
-        </w:rPr>
-        <w:t>Commit everything to Git.</w:t>
-      </w:r>
-    </w:p>
-    <w:p>
-      <w:pPr>
-        <w:pStyle w:val="Standard"/>
-        <w:bidi w:val="0"/>
-        <w:jc w:val="left"/>
-        <w:rPr>
-          <w:rFonts w:ascii="Arial" w:hAnsi="Arial" w:cs="Arial"/>
-        </w:rPr>
-      </w:pPr>
-      <w:r>
-        <w:rPr>
-          <w:rFonts w:cs="Arial" w:ascii="Arial" w:hAnsi="Arial"/>
-        </w:rPr>
-        <w:t>Clean Solution</w:t>
-      </w:r>
-    </w:p>
-    <w:p>
-      <w:pPr>
-        <w:pStyle w:val="Standard"/>
-        <w:bidi w:val="0"/>
-        <w:jc w:val="left"/>
-        <w:rPr>
-          <w:rFonts w:ascii="Arial" w:hAnsi="Arial" w:cs="Arial"/>
-        </w:rPr>
-      </w:pPr>
-      <w:r>
-        <w:rPr>
-          <w:rFonts w:cs="Arial" w:ascii="Arial" w:hAnsi="Arial"/>
-        </w:rPr>
-        <w:t>Rebuild Solution</w:t>
-      </w:r>
-    </w:p>
-    <w:p>
-      <w:pPr>
-        <w:pStyle w:val="Standard"/>
-        <w:bidi w:val="0"/>
-        <w:jc w:val="left"/>
-        <w:rPr>
-          <w:rFonts w:ascii="Arial" w:hAnsi="Arial" w:cs="Arial"/>
-        </w:rPr>
-      </w:pPr>
-      <w:r>
-        <w:rPr>
-          <w:rFonts w:cs="Arial" w:ascii="Arial" w:hAnsi="Arial"/>
-        </w:rPr>
-      </w:r>
-    </w:p>
-    <w:p>
-      <w:pPr>
-        <w:pStyle w:val="Standard"/>
-        <w:bidi w:val="0"/>
-        <w:jc w:val="left"/>
-        <w:rPr>
-          <w:rFonts w:ascii="Arial" w:hAnsi="Arial" w:cs="Arial"/>
-        </w:rPr>
-      </w:pPr>
-      <w:r>
-        <w:rPr>
-          <w:rFonts w:cs="Arial" w:ascii="Arial" w:hAnsi="Arial"/>
-        </w:rPr>
-        <w:t>Nu ligger alle filer i</w:t>
-      </w:r>
-    </w:p>
-    <w:p>
-      <w:pPr>
-        <w:pStyle w:val="Standard"/>
-        <w:bidi w:val="0"/>
-        <w:jc w:val="left"/>
-        <w:rPr>
-          <w:rFonts w:ascii="Arial" w:hAnsi="Arial" w:cs="Arial"/>
-        </w:rPr>
-      </w:pPr>
-      <w:r>
-        <w:rPr>
-          <w:rFonts w:cs="Arial" w:ascii="Arial" w:hAnsi="Arial"/>
-        </w:rPr>
-      </w:r>
-    </w:p>
-    <w:p>
-      <w:pPr>
-        <w:pStyle w:val="Standard"/>
-        <w:bidi w:val="0"/>
-        <w:jc w:val="left"/>
-        <w:rPr>
-          <w:rFonts w:ascii="Arial" w:hAnsi="Arial" w:cs="Arial"/>
-          <w:sz w:val="20"/>
-          <w:szCs w:val="20"/>
-        </w:rPr>
-      </w:pPr>
-      <w:r>
-        <w:rPr>
-          <w:rFonts w:cs="Arial" w:ascii="Arial" w:hAnsi="Arial"/>
-          <w:sz w:val="20"/>
-          <w:szCs w:val="20"/>
-        </w:rPr>
-        <w:t>C:\Users\Jens\Dropbox\Root\Visual Studio 2015\Projects\MusicXmlReaderUI\MusicXmlReader\bin\Debug</w:t>
-      </w:r>
-    </w:p>
-    <w:p>
-      <w:pPr>
-        <w:pStyle w:val="Standard"/>
-        <w:bidi w:val="0"/>
-        <w:jc w:val="left"/>
-        <w:rPr>
-          <w:rFonts w:ascii="Arial" w:hAnsi="Arial" w:cs="Arial"/>
-          <w:sz w:val="20"/>
-          <w:szCs w:val="20"/>
-        </w:rPr>
-      </w:pPr>
-      <w:r>
-        <w:rPr>
-          <w:rFonts w:cs="Arial" w:ascii="Arial" w:hAnsi="Arial"/>
-          <w:sz w:val="20"/>
-          <w:szCs w:val="20"/>
-        </w:rPr>
-      </w:r>
-    </w:p>
-    <w:p>
-      <w:pPr>
-        <w:pStyle w:val="Overskrift1"/>
-        <w:bidi w:val="0"/>
-        <w:jc w:val="left"/>
-        <w:rPr/>
-      </w:pPr>
-      <w:bookmarkStart w:id="4" w:name="__RefHeading___Toc531097480"/>
-      <w:bookmarkEnd w:id="4"/>
-      <w:r>
-        <w:rPr/>
-        <w:t>Make a copy of all source code involved</w:t>
-      </w:r>
-    </w:p>
-    <w:p>
-      <w:pPr>
-        <w:pStyle w:val="Standard"/>
-        <w:bidi w:val="0"/>
-        <w:jc w:val="left"/>
-        <w:rPr>
-          <w:rFonts w:ascii="Arial" w:hAnsi="Arial" w:cs="Arial"/>
-        </w:rPr>
-      </w:pPr>
-      <w:r>
-        <w:rPr>
-          <w:rFonts w:cs="Arial" w:ascii="Arial" w:hAnsi="Arial"/>
-        </w:rPr>
-      </w:r>
-    </w:p>
-    <w:p>
-      <w:pPr>
-        <w:pStyle w:val="Standard"/>
-        <w:bidi w:val="0"/>
-        <w:jc w:val="left"/>
-        <w:rPr>
-          <w:rFonts w:ascii="Arial" w:hAnsi="Arial" w:cs="Arial"/>
-        </w:rPr>
-      </w:pPr>
-      <w:r>
-        <w:rPr>
-          <w:rFonts w:cs="Arial" w:ascii="Arial" w:hAnsi="Arial"/>
-        </w:rPr>
-        <w:t>Copy  C:\Users\Jens\Dropbox\Root\Visual Studio 2015\Projects\MusicXmlReaderUI</w:t>
-      </w:r>
-    </w:p>
-    <w:p>
-      <w:pPr>
-        <w:pStyle w:val="Standard"/>
-        <w:bidi w:val="0"/>
-        <w:jc w:val="left"/>
-        <w:rPr>
-          <w:rFonts w:ascii="Arial" w:hAnsi="Arial" w:cs="Arial"/>
-        </w:rPr>
-      </w:pPr>
-      <w:r>
-        <w:rPr>
-          <w:rFonts w:cs="Arial" w:ascii="Arial" w:hAnsi="Arial"/>
-        </w:rPr>
-      </w:r>
-    </w:p>
-    <w:p>
-      <w:pPr>
-        <w:pStyle w:val="Standard"/>
-        <w:bidi w:val="0"/>
-        <w:jc w:val="left"/>
-        <w:rPr>
-          <w:rFonts w:ascii="Arial" w:hAnsi="Arial" w:cs="Arial"/>
-        </w:rPr>
-      </w:pPr>
-      <w:r>
-        <w:rPr>
-          <w:rFonts w:cs="Arial" w:ascii="Arial" w:hAnsi="Arial"/>
-        </w:rPr>
-        <w:t xml:space="preserve">til C:\Users\Jens\Dropbox\Root\Arkiv for Releasede versioner\Version </w:t>
-      </w:r>
-      <w:r>
-        <w:rPr>
-          <w:rFonts w:cs="Arial" w:ascii="Arial" w:hAnsi="Arial"/>
-          <w:lang w:val="da-DK"/>
-        </w:rPr>
-        <w:t>3</w:t>
-      </w:r>
-      <w:r>
-        <w:rPr>
-          <w:rFonts w:cs="Arial" w:ascii="Arial" w:hAnsi="Arial"/>
-        </w:rPr>
-        <w:t>.0.0.0</w:t>
-      </w:r>
-    </w:p>
-    <w:p>
-      <w:pPr>
-        <w:pStyle w:val="Standard"/>
-        <w:bidi w:val="0"/>
-        <w:jc w:val="left"/>
-        <w:rPr>
-          <w:rFonts w:ascii="Arial" w:hAnsi="Arial" w:cs="Arial"/>
-        </w:rPr>
-      </w:pPr>
-      <w:r>
-        <w:rPr>
-          <w:rFonts w:cs="Arial" w:ascii="Arial" w:hAnsi="Arial"/>
-        </w:rPr>
-      </w:r>
-    </w:p>
-    <w:p>
-      <w:pPr>
-        <w:pStyle w:val="Overskrift1"/>
-        <w:bidi w:val="0"/>
-        <w:jc w:val="left"/>
         <w:rPr/>
       </w:pPr>
       <w:bookmarkStart w:id="5" w:name="__RefHeading___Toc531097481"/>
@@ -2537,6 +2794,10 @@
     <w:p>
       <w:pPr>
         <w:pStyle w:val="Overskrift1"/>
+        <w:numPr>
+          <w:ilvl w:val="0"/>
+          <w:numId w:val="2"/>
+        </w:numPr>
         <w:bidi w:val="0"/>
         <w:jc w:val="left"/>
         <w:rPr/>
@@ -2749,6 +3010,10 @@
     <w:p>
       <w:pPr>
         <w:pStyle w:val="Overskrift1"/>
+        <w:numPr>
+          <w:ilvl w:val="0"/>
+          <w:numId w:val="2"/>
+        </w:numPr>
         <w:bidi w:val="0"/>
         <w:jc w:val="left"/>
         <w:rPr/>
@@ -3072,6 +3337,10 @@
     <w:p>
       <w:pPr>
         <w:pStyle w:val="Overskrift1"/>
+        <w:numPr>
+          <w:ilvl w:val="0"/>
+          <w:numId w:val="2"/>
+        </w:numPr>
         <w:bidi w:val="0"/>
         <w:jc w:val="left"/>
         <w:rPr/>
@@ -3165,7 +3434,7 @@
         <w:pStyle w:val="Standard"/>
         <w:numPr>
           <w:ilvl w:val="0"/>
-          <w:numId w:val="5"/>
+          <w:numId w:val="6"/>
         </w:numPr>
         <w:bidi w:val="0"/>
         <w:jc w:val="left"/>
@@ -3198,7 +3467,7 @@
         <w:pStyle w:val="Standard"/>
         <w:numPr>
           <w:ilvl w:val="0"/>
-          <w:numId w:val="5"/>
+          <w:numId w:val="6"/>
         </w:numPr>
         <w:bidi w:val="0"/>
         <w:jc w:val="left"/>
@@ -3231,7 +3500,7 @@
         <w:pStyle w:val="Standard"/>
         <w:numPr>
           <w:ilvl w:val="0"/>
-          <w:numId w:val="5"/>
+          <w:numId w:val="6"/>
         </w:numPr>
         <w:bidi w:val="0"/>
         <w:jc w:val="left"/>
@@ -3269,7 +3538,7 @@
         <w:pStyle w:val="Standard"/>
         <w:numPr>
           <w:ilvl w:val="0"/>
-          <w:numId w:val="5"/>
+          <w:numId w:val="6"/>
         </w:numPr>
         <w:bidi w:val="0"/>
         <w:jc w:val="left"/>
@@ -3284,7 +3553,7 @@
         <w:pStyle w:val="Standard"/>
         <w:numPr>
           <w:ilvl w:val="0"/>
-          <w:numId w:val="5"/>
+          <w:numId w:val="6"/>
         </w:numPr>
         <w:bidi w:val="0"/>
         <w:jc w:val="left"/>
@@ -3304,7 +3573,7 @@
         <w:pStyle w:val="Standard"/>
         <w:numPr>
           <w:ilvl w:val="0"/>
-          <w:numId w:val="5"/>
+          <w:numId w:val="6"/>
         </w:numPr>
         <w:bidi w:val="0"/>
         <w:jc w:val="left"/>
@@ -3324,7 +3593,7 @@
         <w:pStyle w:val="Standard"/>
         <w:numPr>
           <w:ilvl w:val="0"/>
-          <w:numId w:val="5"/>
+          <w:numId w:val="6"/>
         </w:numPr>
         <w:bidi w:val="0"/>
         <w:jc w:val="left"/>
@@ -3530,6 +3799,10 @@
     <w:p>
       <w:pPr>
         <w:pStyle w:val="Overskrift1"/>
+        <w:numPr>
+          <w:ilvl w:val="0"/>
+          <w:numId w:val="2"/>
+        </w:numPr>
         <w:bidi w:val="0"/>
         <w:jc w:val="left"/>
         <w:rPr/>
@@ -3807,6 +4080,10 @@
     <w:p>
       <w:pPr>
         <w:pStyle w:val="Overskrift1"/>
+        <w:numPr>
+          <w:ilvl w:val="0"/>
+          <w:numId w:val="2"/>
+        </w:numPr>
         <w:bidi w:val="0"/>
         <w:jc w:val="left"/>
         <w:rPr/>
@@ -4026,7 +4303,7 @@
           <w:rFonts w:ascii="Arial" w:hAnsi="Arial" w:cs="Arial"/>
         </w:rPr>
       </w:pPr>
-      <w:hyperlink r:id="rId2">
+      <w:hyperlink r:id="rId3">
         <w:r>
           <w:rPr>
             <w:rStyle w:val="Hyperlink"/>
@@ -4656,7 +4933,7 @@
         </w:rPr>
         <w:t xml:space="preserve">Se </w:t>
       </w:r>
-      <w:hyperlink r:id="rId3">
+      <w:hyperlink r:id="rId4">
         <w:r>
           <w:rPr>
             <w:rStyle w:val="Hyperlink"/>
@@ -4922,8 +5199,8 @@
       </w:r>
     </w:p>
     <w:sectPr>
-      <w:footerReference w:type="default" r:id="rId4"/>
-      <w:type w:val="nextPage"/>
+      <w:footerReference w:type="default" r:id="rId5"/>
+      <w:type w:val="continuous"/>
       <w:pgSz w:w="11906" w:h="16838"/>
       <w:pgMar w:left="1134" w:right="1134" w:header="0" w:top="1134" w:footer="708" w:bottom="1134" w:gutter="0"/>
       <w:pgNumType w:fmt="decimal"/>
@@ -4961,7 +5238,88 @@
     </w:r>
     <w:r>
       <w:rPr/>
-      <w:t>Generering af release 3.0.0.0.doc</w:t>
+      <w:t>Generering af release 4.0.0.0.docx</w:t>
+    </w:r>
+    <w:r>
+      <w:rPr/>
+      <w:fldChar w:fldCharType="end"/>
+    </w:r>
+    <w:r>
+      <w:rPr>
+        <w:rFonts w:eastAsia="Liberation Serif" w:cs="Liberation Serif"/>
+        <w:lang w:val="da-DK"/>
+      </w:rPr>
+      <w:t xml:space="preserve"> </w:t>
+    </w:r>
+    <w:r>
+      <w:rPr>
+        <w:lang w:val="da-DK"/>
+      </w:rPr>
+      <w:t>3.0.0.0</w:t>
+    </w:r>
+  </w:p>
+  <w:p>
+    <w:pPr>
+      <w:pStyle w:val="Sidefod"/>
+      <w:bidi w:val="0"/>
+      <w:jc w:val="right"/>
+      <w:rPr/>
+    </w:pPr>
+    <w:r>
+      <w:rPr/>
+      <w:t xml:space="preserve">Side </w:t>
+    </w:r>
+    <w:r>
+      <w:rPr/>
+      <w:fldChar w:fldCharType="begin"/>
+    </w:r>
+    <w:r>
+      <w:rPr/>
+      <w:instrText> PAGE </w:instrText>
+    </w:r>
+    <w:r>
+      <w:rPr/>
+      <w:fldChar w:fldCharType="separate"/>
+    </w:r>
+    <w:r>
+      <w:rPr/>
+      <w:t>7</w:t>
+    </w:r>
+    <w:r>
+      <w:rPr/>
+      <w:fldChar w:fldCharType="end"/>
+    </w:r>
+  </w:p>
+</w:ftr>
+</file>
+
+<file path=word/footer2.xml><?xml version="1.0" encoding="utf-8"?>
+<w:ftr xmlns:o="urn:schemas-microsoft-com:office:office" xmlns:r="http://schemas.openxmlformats.org/officeDocument/2006/relationships" xmlns:v="urn:schemas-microsoft-com:vml" xmlns:w="http://schemas.openxmlformats.org/wordprocessingml/2006/main" xmlns:w10="urn:schemas-microsoft-com:office:word" xmlns:wp="http://schemas.openxmlformats.org/drawingml/2006/wordprocessingDrawing" xmlns:wps="http://schemas.microsoft.com/office/word/2010/wordprocessingShape" xmlns:wpg="http://schemas.microsoft.com/office/word/2010/wordprocessingGroup" xmlns:mc="http://schemas.openxmlformats.org/markup-compatibility/2006" xmlns:wp14="http://schemas.microsoft.com/office/word/2010/wordprocessingDrawing" xmlns:w14="http://schemas.microsoft.com/office/word/2010/wordml" mc:Ignorable="w14 wp14">
+  <w:p>
+    <w:pPr>
+      <w:pStyle w:val="Sidefod"/>
+      <w:suppressLineNumbers/>
+      <w:bidi w:val="0"/>
+      <w:jc w:val="left"/>
+      <w:rPr>
+        <w:lang w:val="da-DK"/>
+      </w:rPr>
+    </w:pPr>
+    <w:r>
+      <w:rPr/>
+      <w:fldChar w:fldCharType="begin"/>
+    </w:r>
+    <w:r>
+      <w:rPr/>
+      <w:instrText> FILENAME </w:instrText>
+    </w:r>
+    <w:r>
+      <w:rPr/>
+      <w:fldChar w:fldCharType="separate"/>
+    </w:r>
+    <w:r>
+      <w:rPr/>
+      <w:t>Generering af release 4.0.0.0.docx</w:t>
     </w:r>
     <w:r>
       <w:rPr/>
@@ -5113,6 +5471,99 @@
   </w:abstractNum>
   <w:abstractNum w:abstractNumId="2">
     <w:lvl w:ilvl="0">
+      <w:start w:val="1"/>
+      <w:numFmt w:val="none"/>
+      <w:suff w:val="nothing"/>
+      <w:lvlText w:val=""/>
+      <w:lvlJc w:val="left"/>
+      <w:pPr>
+        <w:ind w:left="0" w:hanging="0"/>
+      </w:pPr>
+    </w:lvl>
+    <w:lvl w:ilvl="1">
+      <w:start w:val="1"/>
+      <w:numFmt w:val="none"/>
+      <w:suff w:val="nothing"/>
+      <w:lvlText w:val=""/>
+      <w:lvlJc w:val="left"/>
+      <w:pPr>
+        <w:ind w:left="0" w:hanging="0"/>
+      </w:pPr>
+    </w:lvl>
+    <w:lvl w:ilvl="2">
+      <w:start w:val="1"/>
+      <w:numFmt w:val="none"/>
+      <w:suff w:val="nothing"/>
+      <w:lvlText w:val=""/>
+      <w:lvlJc w:val="left"/>
+      <w:pPr>
+        <w:ind w:left="0" w:hanging="0"/>
+      </w:pPr>
+    </w:lvl>
+    <w:lvl w:ilvl="3">
+      <w:start w:val="1"/>
+      <w:numFmt w:val="none"/>
+      <w:suff w:val="nothing"/>
+      <w:lvlText w:val=""/>
+      <w:lvlJc w:val="left"/>
+      <w:pPr>
+        <w:ind w:left="0" w:hanging="0"/>
+      </w:pPr>
+    </w:lvl>
+    <w:lvl w:ilvl="4">
+      <w:start w:val="1"/>
+      <w:numFmt w:val="none"/>
+      <w:suff w:val="nothing"/>
+      <w:lvlText w:val=""/>
+      <w:lvlJc w:val="left"/>
+      <w:pPr>
+        <w:ind w:left="0" w:hanging="0"/>
+      </w:pPr>
+    </w:lvl>
+    <w:lvl w:ilvl="5">
+      <w:start w:val="1"/>
+      <w:numFmt w:val="none"/>
+      <w:suff w:val="nothing"/>
+      <w:lvlText w:val=""/>
+      <w:lvlJc w:val="left"/>
+      <w:pPr>
+        <w:ind w:left="0" w:hanging="0"/>
+      </w:pPr>
+    </w:lvl>
+    <w:lvl w:ilvl="6">
+      <w:start w:val="1"/>
+      <w:numFmt w:val="none"/>
+      <w:suff w:val="nothing"/>
+      <w:lvlText w:val=""/>
+      <w:lvlJc w:val="left"/>
+      <w:pPr>
+        <w:ind w:left="0" w:hanging="0"/>
+      </w:pPr>
+    </w:lvl>
+    <w:lvl w:ilvl="7">
+      <w:start w:val="1"/>
+      <w:numFmt w:val="none"/>
+      <w:suff w:val="nothing"/>
+      <w:lvlText w:val=""/>
+      <w:lvlJc w:val="left"/>
+      <w:pPr>
+        <w:ind w:left="0" w:hanging="0"/>
+      </w:pPr>
+    </w:lvl>
+    <w:lvl w:ilvl="8">
+      <w:start w:val="1"/>
+      <w:numFmt w:val="none"/>
+      <w:suff w:val="nothing"/>
+      <w:lvlText w:val=""/>
+      <w:lvlJc w:val="left"/>
+      <w:pPr>
+        <w:ind w:left="0" w:hanging="0"/>
+      </w:pPr>
+    </w:lvl>
+  </w:abstractNum>
+  <w:abstractNum w:abstractNumId="3">
+    <w:lvl w:ilvl="0">
+      <w:start w:val="1"/>
       <w:numFmt w:val="bullet"/>
       <w:lvlText w:val=""/>
       <w:lvlJc w:val="left"/>
@@ -5229,7 +5680,7 @@
       </w:rPr>
     </w:lvl>
   </w:abstractNum>
-  <w:abstractNum w:abstractNumId="3">
+  <w:abstractNum w:abstractNumId="4">
     <w:lvl w:ilvl="0">
       <w:start w:val="1"/>
       <w:numFmt w:val="decimal"/>
@@ -5243,9 +5694,106 @@
         <w:lang w:val="da-DK"/>
       </w:rPr>
     </w:lvl>
+    <w:lvl w:ilvl="1">
+      <w:start w:val="1"/>
+      <w:numFmt w:val="decimal"/>
+      <w:lvlText w:val="%2."/>
+      <w:lvlJc w:val="left"/>
+      <w:pPr>
+        <w:tabs>
+          <w:tab w:val="num" w:pos="1080"/>
+        </w:tabs>
+        <w:ind w:left="1080" w:hanging="360"/>
+      </w:pPr>
+    </w:lvl>
+    <w:lvl w:ilvl="2">
+      <w:start w:val="1"/>
+      <w:numFmt w:val="decimal"/>
+      <w:lvlText w:val="%3."/>
+      <w:lvlJc w:val="left"/>
+      <w:pPr>
+        <w:tabs>
+          <w:tab w:val="num" w:pos="1440"/>
+        </w:tabs>
+        <w:ind w:left="1440" w:hanging="360"/>
+      </w:pPr>
+    </w:lvl>
+    <w:lvl w:ilvl="3">
+      <w:start w:val="1"/>
+      <w:numFmt w:val="decimal"/>
+      <w:lvlText w:val="%4."/>
+      <w:lvlJc w:val="left"/>
+      <w:pPr>
+        <w:tabs>
+          <w:tab w:val="num" w:pos="1800"/>
+        </w:tabs>
+        <w:ind w:left="1800" w:hanging="360"/>
+      </w:pPr>
+    </w:lvl>
+    <w:lvl w:ilvl="4">
+      <w:start w:val="1"/>
+      <w:numFmt w:val="decimal"/>
+      <w:lvlText w:val="%5."/>
+      <w:lvlJc w:val="left"/>
+      <w:pPr>
+        <w:tabs>
+          <w:tab w:val="num" w:pos="2160"/>
+        </w:tabs>
+        <w:ind w:left="2160" w:hanging="360"/>
+      </w:pPr>
+    </w:lvl>
+    <w:lvl w:ilvl="5">
+      <w:start w:val="1"/>
+      <w:numFmt w:val="decimal"/>
+      <w:lvlText w:val="%6."/>
+      <w:lvlJc w:val="left"/>
+      <w:pPr>
+        <w:tabs>
+          <w:tab w:val="num" w:pos="2520"/>
+        </w:tabs>
+        <w:ind w:left="2520" w:hanging="360"/>
+      </w:pPr>
+    </w:lvl>
+    <w:lvl w:ilvl="6">
+      <w:start w:val="1"/>
+      <w:numFmt w:val="decimal"/>
+      <w:lvlText w:val="%7."/>
+      <w:lvlJc w:val="left"/>
+      <w:pPr>
+        <w:tabs>
+          <w:tab w:val="num" w:pos="2880"/>
+        </w:tabs>
+        <w:ind w:left="2880" w:hanging="360"/>
+      </w:pPr>
+    </w:lvl>
+    <w:lvl w:ilvl="7">
+      <w:start w:val="1"/>
+      <w:numFmt w:val="decimal"/>
+      <w:lvlText w:val="%8."/>
+      <w:lvlJc w:val="left"/>
+      <w:pPr>
+        <w:tabs>
+          <w:tab w:val="num" w:pos="3240"/>
+        </w:tabs>
+        <w:ind w:left="3240" w:hanging="360"/>
+      </w:pPr>
+    </w:lvl>
+    <w:lvl w:ilvl="8">
+      <w:start w:val="1"/>
+      <w:numFmt w:val="decimal"/>
+      <w:lvlText w:val="%9."/>
+      <w:lvlJc w:val="left"/>
+      <w:pPr>
+        <w:tabs>
+          <w:tab w:val="num" w:pos="3600"/>
+        </w:tabs>
+        <w:ind w:left="3600" w:hanging="360"/>
+      </w:pPr>
+    </w:lvl>
   </w:abstractNum>
-  <w:abstractNum w:abstractNumId="4">
+  <w:abstractNum w:abstractNumId="5">
     <w:lvl w:ilvl="0">
+      <w:start w:val="1"/>
       <w:numFmt w:val="bullet"/>
       <w:lvlText w:val=""/>
       <w:lvlJc w:val="left"/>
@@ -5362,8 +5910,9 @@
       </w:rPr>
     </w:lvl>
   </w:abstractNum>
-  <w:abstractNum w:abstractNumId="5">
+  <w:abstractNum w:abstractNumId="6">
     <w:lvl w:ilvl="0">
+      <w:start w:val="1"/>
       <w:numFmt w:val="bullet"/>
       <w:lvlText w:val=""/>
       <w:lvlJc w:val="left"/>
@@ -5372,6 +5921,7 @@
       </w:pPr>
       <w:rPr>
         <w:rFonts w:ascii="Symbol" w:hAnsi="Symbol" w:cs="Symbol" w:hint="default"/>
+        <w:b/>
         <w:rFonts w:cs="OpenSymbol"/>
         <w:lang w:val="da-DK"/>
       </w:rPr>
@@ -5504,6 +6054,9 @@
   <w:num w:numId="5">
     <w:abstractNumId w:val="5"/>
   </w:num>
+  <w:num w:numId="6">
+    <w:abstractNumId w:val="6"/>
+  </w:num>
 </w:numbering>
 </file>
 
@@ -5513,6 +6066,7 @@
     <w:rPrDefault>
       <w:rPr>
         <w:rFonts w:ascii="Liberation Serif" w:hAnsi="Liberation Serif" w:eastAsia="NSimSun" w:cs="Lucida Sans"/>
+        <w:sz w:val="20"/>
         <w:szCs w:val="24"/>
         <w:lang w:val="da-DK" w:eastAsia="zh-CN" w:bidi="hi-IN"/>
       </w:rPr>
@@ -5528,6 +6082,7 @@
       <w:widowControl/>
       <w:suppressAutoHyphens w:val="true"/>
       <w:bidi w:val="0"/>
+      <w:jc w:val="left"/>
       <w:textAlignment w:val="baseline"/>
     </w:pPr>
     <w:rPr>
@@ -5541,7 +6096,7 @@
   </w:style>
   <w:style w:type="paragraph" w:styleId="Overskrift1">
     <w:name w:val="Heading 1"/>
-    <w:basedOn w:val="Heading"/>
+    <w:basedOn w:val="Overskrift"/>
     <w:next w:val="Textbody"/>
     <w:qFormat/>
     <w:pPr>
@@ -5632,8 +6187,8 @@
     <w:qFormat/>
     <w:rPr/>
   </w:style>
-  <w:style w:type="character" w:styleId="NumberingSymbols">
-    <w:name w:val="Numbering Symbols"/>
+  <w:style w:type="character" w:styleId="Nummereringstegn">
+    <w:name w:val="Nummereringstegn"/>
     <w:qFormat/>
     <w:rPr/>
   </w:style>
@@ -5646,15 +6201,15 @@
       <w:lang w:val="da-DK" w:bidi="da-DK"/>
     </w:rPr>
   </w:style>
-  <w:style w:type="character" w:styleId="BulletSymbols">
-    <w:name w:val="Bullet Symbols"/>
+  <w:style w:type="character" w:styleId="Punkttegn">
+    <w:name w:val="Punkttegn"/>
     <w:qFormat/>
     <w:rPr>
       <w:rFonts w:ascii="OpenSymbol" w:hAnsi="OpenSymbol" w:eastAsia="OpenSymbol" w:cs="OpenSymbol"/>
     </w:rPr>
   </w:style>
-  <w:style w:type="character" w:styleId="IndexLink">
-    <w:name w:val="Index Link"/>
+  <w:style w:type="character" w:styleId="Indeksspring">
+    <w:name w:val="Indeksspring"/>
     <w:qFormat/>
     <w:rPr/>
   </w:style>
@@ -5678,17 +6233,17 @@
   </w:style>
   <w:style w:type="paragraph" w:styleId="Overskrift">
     <w:name w:val="Overskrift"/>
-    <w:basedOn w:val="Heading"/>
+    <w:basedOn w:val="Standard"/>
     <w:next w:val="Textbody"/>
     <w:qFormat/>
     <w:pPr>
-      <w:jc w:val="center"/>
+      <w:keepNext w:val="true"/>
+      <w:spacing w:before="240" w:after="120"/>
     </w:pPr>
     <w:rPr>
-      <w:b/>
-      <w:bCs/>
-      <w:sz w:val="56"/>
-      <w:szCs w:val="56"/>
+      <w:rFonts w:ascii="Arial" w:hAnsi="Arial" w:eastAsia="Andale Sans UI" w:cs="Tahoma"/>
+      <w:sz w:val="28"/>
+      <w:szCs w:val="28"/>
     </w:rPr>
   </w:style>
   <w:style w:type="paragraph" w:styleId="Brdtekst">
@@ -5725,13 +6280,13 @@
   </w:style>
   <w:style w:type="paragraph" w:styleId="Indeks">
     <w:name w:val="Indeks"/>
-    <w:basedOn w:val="Normal"/>
+    <w:basedOn w:val="Standard"/>
     <w:qFormat/>
     <w:pPr>
       <w:suppressLineNumbers/>
     </w:pPr>
     <w:rPr>
-      <w:rFonts w:cs="Lucida Sans"/>
+      <w:rFonts w:cs="Tahoma"/>
     </w:rPr>
   </w:style>
   <w:style w:type="paragraph" w:styleId="Standard">
@@ -5741,6 +6296,7 @@
       <w:widowControl/>
       <w:suppressAutoHyphens w:val="true"/>
       <w:bidi w:val="0"/>
+      <w:jc w:val="left"/>
       <w:textAlignment w:val="baseline"/>
     </w:pPr>
     <w:rPr>
@@ -5749,22 +6305,7 @@
       <w:kern w:val="2"/>
       <w:sz w:val="24"/>
       <w:szCs w:val="24"/>
-      <w:lang w:val="da-DK" w:bidi="da-DK" w:eastAsia="zh-CN"/>
-    </w:rPr>
-  </w:style>
-  <w:style w:type="paragraph" w:styleId="Heading">
-    <w:name w:val="Heading"/>
-    <w:basedOn w:val="Standard"/>
-    <w:next w:val="Textbody"/>
-    <w:qFormat/>
-    <w:pPr>
-      <w:keepNext w:val="true"/>
-      <w:spacing w:before="240" w:after="120"/>
-    </w:pPr>
-    <w:rPr>
-      <w:rFonts w:ascii="Arial" w:hAnsi="Arial" w:eastAsia="Andale Sans UI" w:cs="Tahoma"/>
-      <w:sz w:val="28"/>
-      <w:szCs w:val="28"/>
+      <w:lang w:val="da-DK" w:eastAsia="zh-CN" w:bidi="da-DK"/>
     </w:rPr>
   </w:style>
   <w:style w:type="paragraph" w:styleId="Textbody">
@@ -5775,17 +6316,6 @@
       <w:spacing w:before="0" w:after="120"/>
     </w:pPr>
     <w:rPr/>
-  </w:style>
-  <w:style w:type="paragraph" w:styleId="Index">
-    <w:name w:val="Index"/>
-    <w:basedOn w:val="Standard"/>
-    <w:qFormat/>
-    <w:pPr>
-      <w:suppressLineNumbers/>
-    </w:pPr>
-    <w:rPr>
-      <w:rFonts w:cs="Tahoma"/>
-    </w:rPr>
   </w:style>
   <w:style w:type="paragraph" w:styleId="Sidehovedogsidefod">
     <w:name w:val="Sidehoved og sidefod"/>
@@ -5811,7 +6341,7 @@
   </w:style>
   <w:style w:type="paragraph" w:styleId="ContentsHeading">
     <w:name w:val="Contents Heading"/>
-    <w:basedOn w:val="Heading"/>
+    <w:basedOn w:val="Overskrift"/>
     <w:qFormat/>
     <w:pPr>
       <w:suppressLineNumbers/>
@@ -5826,7 +6356,7 @@
   </w:style>
   <w:style w:type="paragraph" w:styleId="Contents1">
     <w:name w:val="Contents 1"/>
-    <w:basedOn w:val="Index"/>
+    <w:basedOn w:val="Indeks"/>
     <w:qFormat/>
     <w:pPr>
       <w:ind w:left="0" w:right="0" w:hanging="0"/>

</xml_diff>

<commit_message>
Updated "Generering af release"
</commit_message>
<xml_diff>
--- a/Documentation/Generering af release 4.0.0.0.docx
+++ b/Documentation/Generering af release 4.0.0.0.docx
@@ -2,57 +2,6 @@
 <file path=word/document.xml><?xml version="1.0" encoding="utf-8"?>
 <w:document xmlns:o="urn:schemas-microsoft-com:office:office" xmlns:r="http://schemas.openxmlformats.org/officeDocument/2006/relationships" xmlns:v="urn:schemas-microsoft-com:vml" xmlns:w="http://schemas.openxmlformats.org/wordprocessingml/2006/main" xmlns:w10="urn:schemas-microsoft-com:office:word" xmlns:wp="http://schemas.openxmlformats.org/drawingml/2006/wordprocessingDrawing" xmlns:wps="http://schemas.microsoft.com/office/word/2010/wordprocessingShape" xmlns:wpg="http://schemas.microsoft.com/office/word/2010/wordprocessingGroup" xmlns:mc="http://schemas.openxmlformats.org/markup-compatibility/2006" xmlns:wp14="http://schemas.microsoft.com/office/word/2010/wordprocessingDrawing" xmlns:w14="http://schemas.microsoft.com/office/word/2010/wordml" mc:Ignorable="w14 wp14">
   <w:body>
-    <w:p>
-      <w:pPr>
-        <w:pStyle w:val="Overskrift"/>
-        <w:bidi w:val="0"/>
-        <w:spacing w:before="240" w:after="120"/>
-        <w:rPr/>
-      </w:pPr>
-      <w:r>
-        <w:rPr/>
-        <w:t xml:space="preserve">Generering af Release </w:t>
-      </w:r>
-      <w:r>
-        <w:rPr>
-          <w:color w:val="C9211E"/>
-          <w:lang w:val="da-DK"/>
-        </w:rPr>
-        <w:t>4</w:t>
-      </w:r>
-      <w:r>
-        <w:rPr/>
-        <w:t>.0.0.0</w:t>
-      </w:r>
-    </w:p>
-    <w:p>
-      <w:pPr>
-        <w:sectPr>
-          <w:footerReference w:type="default" r:id="rId2"/>
-          <w:type w:val="nextPage"/>
-          <w:pgSz w:w="11906" w:h="16838"/>
-          <w:pgMar w:left="1134" w:right="1134" w:header="0" w:top="1134" w:footer="708" w:bottom="1134" w:gutter="0"/>
-          <w:pgNumType w:fmt="decimal"/>
-          <w:formProt w:val="false"/>
-          <w:textDirection w:val="lrTb"/>
-          <w:docGrid w:type="default" w:linePitch="360" w:charSpace="0"/>
-        </w:sectPr>
-      </w:pPr>
-    </w:p>
-    <w:p>
-      <w:pPr>
-        <w:pStyle w:val="Standard"/>
-        <w:widowControl/>
-        <w:suppressAutoHyphens w:val="true"/>
-        <w:bidi w:val="0"/>
-        <w:jc w:val="left"/>
-        <w:textAlignment w:val="baseline"/>
-        <w:rPr/>
-      </w:pPr>
-      <w:r>
-        <w:rPr/>
-      </w:r>
-    </w:p>
     <w:sdt>
       <w:sdtPr>
         <w:docPartObj>
@@ -63,18 +12,72 @@
       <w:sdtContent>
         <w:p>
           <w:pPr>
+            <w:pStyle w:val="Indholdsfortegnelseoverskrift"/>
+            <w:suppressLineNumbers/>
+            <w:bidi w:val="0"/>
+            <w:spacing w:before="240" w:after="120"/>
+            <w:ind w:left="0" w:hanging="0"/>
+            <w:jc w:val="center"/>
+            <w:rPr>
+              <w:b/>
+              <w:b/>
+              <w:bCs/>
+              <w:sz w:val="44"/>
+              <w:szCs w:val="44"/>
+            </w:rPr>
+          </w:pPr>
+          <w:r>
+            <w:rPr>
+              <w:b/>
+              <w:bCs/>
+              <w:sz w:val="44"/>
+              <w:szCs w:val="44"/>
+            </w:rPr>
+            <w:t>Generering af Release 4.0.0.0</w:t>
+          </w:r>
+        </w:p>
+        <w:p>
+          <w:pPr>
+            <w:pStyle w:val="Textbody"/>
+            <w:bidi w:val="0"/>
+            <w:spacing w:before="240" w:after="120"/>
+            <w:rPr/>
+          </w:pPr>
+          <w:r>
+            <w:rPr/>
+          </w:r>
+        </w:p>
+        <w:p>
+          <w:pPr>
+            <w:pStyle w:val="Indholdsfortegnelseoverskrift"/>
+            <w:suppressLineNumbers/>
+            <w:ind w:left="0" w:hanging="0"/>
+            <w:rPr>
+              <w:b/>
+              <w:b/>
+              <w:bCs/>
+              <w:sz w:val="32"/>
+              <w:szCs w:val="32"/>
+            </w:rPr>
+          </w:pPr>
+          <w:r>
+            <w:rPr>
+              <w:b/>
+              <w:bCs/>
+              <w:sz w:val="32"/>
+              <w:szCs w:val="32"/>
+            </w:rPr>
+            <w:t>Indholdsfortegnelse</w:t>
+          </w:r>
+        </w:p>
+        <w:p>
+          <w:pPr>
             <w:pStyle w:val="Indholdsfortegnelse1"/>
             <w:tabs>
               <w:tab w:val="clear" w:pos="709"/>
-              <w:tab w:val="right" w:pos="9628" w:leader="dot"/>
+              <w:tab w:val="right" w:pos="9638" w:leader="dot"/>
             </w:tabs>
-            <w:rPr>
-              <w:rFonts w:ascii="Calibri" w:hAnsi="Calibri" w:eastAsia="Times New Roman" w:cs="Times New Roman"/>
-              <w:kern w:val="0"/>
-              <w:sz w:val="22"/>
-              <w:szCs w:val="22"/>
-              <w:lang w:val="da-DK" w:eastAsia="da-DK" w:bidi="ar-SA"/>
-            </w:rPr>
+            <w:rPr/>
           </w:pPr>
           <w:r>
             <w:fldChar w:fldCharType="begin"/>
@@ -83,7 +86,7 @@
             <w:rPr>
               <w:rStyle w:val="Indeksspring"/>
             </w:rPr>
-            <w:instrText> TOC \o "1-9" \u \h</w:instrText>
+            <w:instrText> TOC \o "1-9" \h</w:instrText>
           </w:r>
           <w:r>
             <w:rPr>
@@ -95,15 +98,8 @@
             <w:r>
               <w:rPr>
                 <w:rStyle w:val="Indeksspring"/>
-                <w:lang w:val="da-DK" w:eastAsia="da-DK" w:bidi="da-DK"/>
               </w:rPr>
-              <w:t>HUSK:</w:t>
-            </w:r>
-            <w:r>
-              <w:rPr>
-                <w:rStyle w:val="Indeksspring"/>
-                <w:lang w:val="da-DK" w:eastAsia="da-DK"/>
-              </w:rPr>
+              <w:t>HUSK: (En liste over ting, som man skal huske undervejs i processen)</w:t>
               <w:tab/>
               <w:t>1</w:t>
             </w:r>
@@ -114,29 +110,16 @@
             <w:pStyle w:val="Indholdsfortegnelse1"/>
             <w:tabs>
               <w:tab w:val="clear" w:pos="709"/>
-              <w:tab w:val="right" w:pos="9628" w:leader="dot"/>
+              <w:tab w:val="right" w:pos="9638" w:leader="dot"/>
             </w:tabs>
-            <w:rPr>
-              <w:rFonts w:ascii="Calibri" w:hAnsi="Calibri" w:eastAsia="Times New Roman" w:cs="Times New Roman"/>
-              <w:kern w:val="0"/>
-              <w:sz w:val="22"/>
-              <w:szCs w:val="22"/>
-              <w:lang w:val="da-DK" w:eastAsia="da-DK" w:bidi="ar-SA"/>
-            </w:rPr>
+            <w:rPr/>
           </w:pPr>
           <w:hyperlink w:anchor="__RefHeading___Toc531097477">
             <w:r>
               <w:rPr>
                 <w:rStyle w:val="Indeksspring"/>
-                <w:lang w:val="da-DK" w:eastAsia="da-DK" w:bidi="da-DK"/>
               </w:rPr>
               <w:t>Opdatér al officiel dokumentation :</w:t>
-            </w:r>
-            <w:r>
-              <w:rPr>
-                <w:rStyle w:val="Indeksspring"/>
-                <w:lang w:val="da-DK" w:eastAsia="da-DK"/>
-              </w:rPr>
               <w:tab/>
               <w:t>1</w:t>
             </w:r>
@@ -147,62 +130,16 @@
             <w:pStyle w:val="Indholdsfortegnelse1"/>
             <w:tabs>
               <w:tab w:val="clear" w:pos="709"/>
-              <w:tab w:val="right" w:pos="9628" w:leader="dot"/>
+              <w:tab w:val="right" w:pos="9638" w:leader="dot"/>
             </w:tabs>
-            <w:rPr>
-              <w:rFonts w:ascii="Calibri" w:hAnsi="Calibri" w:eastAsia="Times New Roman" w:cs="Times New Roman"/>
-              <w:kern w:val="0"/>
-              <w:sz w:val="22"/>
-              <w:szCs w:val="22"/>
-              <w:lang w:val="da-DK" w:eastAsia="da-DK" w:bidi="ar-SA"/>
-            </w:rPr>
+            <w:rPr/>
           </w:pPr>
           <w:hyperlink w:anchor="__RefHeading___Toc531097478">
             <w:r>
               <w:rPr>
                 <w:rStyle w:val="Indeksspring"/>
-                <w:lang w:val="da-DK" w:eastAsia="da-DK" w:bidi="da-DK"/>
               </w:rPr>
-              <w:t>Gør den officielle brugervejledning tilgængelig fra applikationen under Hjælp:</w:t>
-            </w:r>
-            <w:r>
-              <w:rPr>
-                <w:rStyle w:val="Indeksspring"/>
-                <w:lang w:val="da-DK" w:eastAsia="da-DK"/>
-              </w:rPr>
-              <w:tab/>
-              <w:t>1</w:t>
-            </w:r>
-          </w:hyperlink>
-        </w:p>
-        <w:p>
-          <w:pPr>
-            <w:pStyle w:val="Indholdsfortegnelse1"/>
-            <w:tabs>
-              <w:tab w:val="clear" w:pos="709"/>
-              <w:tab w:val="right" w:pos="9628" w:leader="dot"/>
-            </w:tabs>
-            <w:rPr>
-              <w:rFonts w:ascii="Calibri" w:hAnsi="Calibri" w:eastAsia="Times New Roman" w:cs="Times New Roman"/>
-              <w:kern w:val="0"/>
-              <w:sz w:val="22"/>
-              <w:szCs w:val="22"/>
-              <w:lang w:val="da-DK" w:eastAsia="da-DK" w:bidi="ar-SA"/>
-            </w:rPr>
-          </w:pPr>
-          <w:hyperlink w:anchor="__RefHeading___Toc531097479">
-            <w:r>
-              <w:rPr>
-                <w:rStyle w:val="Indeksspring"/>
-                <w:lang w:val="da-DK" w:eastAsia="da-DK" w:bidi="da-DK"/>
-              </w:rPr>
-              <w:t>Build in Visual Studio</w:t>
-            </w:r>
-            <w:r>
-              <w:rPr>
-                <w:rStyle w:val="Indeksspring"/>
-                <w:lang w:val="da-DK" w:eastAsia="da-DK"/>
-              </w:rPr>
+              <w:t>Gør brugervejledningen tilgængelig fra IBOS Nodelæser under Hjælp:</w:t>
               <w:tab/>
               <w:t>2</w:t>
             </w:r>
@@ -213,31 +150,18 @@
             <w:pStyle w:val="Indholdsfortegnelse1"/>
             <w:tabs>
               <w:tab w:val="clear" w:pos="709"/>
-              <w:tab w:val="right" w:pos="9628" w:leader="dot"/>
+              <w:tab w:val="right" w:pos="9638" w:leader="dot"/>
             </w:tabs>
-            <w:rPr>
-              <w:rFonts w:ascii="Calibri" w:hAnsi="Calibri" w:eastAsia="Times New Roman" w:cs="Times New Roman"/>
-              <w:kern w:val="0"/>
-              <w:sz w:val="22"/>
-              <w:szCs w:val="22"/>
-              <w:lang w:val="da-DK" w:eastAsia="da-DK" w:bidi="ar-SA"/>
-            </w:rPr>
+            <w:rPr/>
           </w:pPr>
-          <w:hyperlink w:anchor="__RefHeading___Toc531097480">
+          <w:hyperlink w:anchor="__RefHeading___Toc531097479">
             <w:r>
               <w:rPr>
                 <w:rStyle w:val="Indeksspring"/>
-                <w:lang w:val="da-DK" w:eastAsia="da-DK" w:bidi="da-DK"/>
               </w:rPr>
-              <w:t>Make a copy of all source code involved</w:t>
-            </w:r>
-            <w:r>
-              <w:rPr>
-                <w:rStyle w:val="Indeksspring"/>
-                <w:lang w:val="da-DK" w:eastAsia="da-DK"/>
-              </w:rPr>
+              <w:t>Build in Visual Studio</w:t>
               <w:tab/>
-              <w:t>2</w:t>
+              <w:t>3</w:t>
             </w:r>
           </w:hyperlink>
         </w:p>
@@ -246,31 +170,18 @@
             <w:pStyle w:val="Indholdsfortegnelse1"/>
             <w:tabs>
               <w:tab w:val="clear" w:pos="709"/>
-              <w:tab w:val="right" w:pos="9628" w:leader="dot"/>
+              <w:tab w:val="right" w:pos="9638" w:leader="dot"/>
             </w:tabs>
-            <w:rPr>
-              <w:rFonts w:ascii="Calibri" w:hAnsi="Calibri" w:eastAsia="Times New Roman" w:cs="Times New Roman"/>
-              <w:kern w:val="0"/>
-              <w:sz w:val="22"/>
-              <w:szCs w:val="22"/>
-              <w:lang w:val="da-DK" w:eastAsia="da-DK" w:bidi="ar-SA"/>
-            </w:rPr>
+            <w:rPr/>
           </w:pPr>
-          <w:hyperlink w:anchor="__RefHeading___Toc531097481">
+          <w:hyperlink w:anchor="__RefHeading___Toc531097480">
             <w:r>
               <w:rPr>
                 <w:rStyle w:val="Indeksspring"/>
-                <w:lang w:val="da-DK" w:eastAsia="da-DK" w:bidi="da-DK"/>
               </w:rPr>
-              <w:t>Create the setup file:</w:t>
-            </w:r>
-            <w:r>
-              <w:rPr>
-                <w:rStyle w:val="Indeksspring"/>
-                <w:lang w:val="da-DK" w:eastAsia="da-DK"/>
-              </w:rPr>
+              <w:t>Make a copy of all source code involved</w:t>
               <w:tab/>
-              <w:t>2</w:t>
+              <w:t>3</w:t>
             </w:r>
           </w:hyperlink>
         </w:p>
@@ -279,31 +190,18 @@
             <w:pStyle w:val="Indholdsfortegnelse1"/>
             <w:tabs>
               <w:tab w:val="clear" w:pos="709"/>
-              <w:tab w:val="right" w:pos="9628" w:leader="dot"/>
+              <w:tab w:val="right" w:pos="9638" w:leader="dot"/>
             </w:tabs>
-            <w:rPr>
-              <w:rFonts w:ascii="Calibri" w:hAnsi="Calibri" w:eastAsia="Times New Roman" w:cs="Times New Roman"/>
-              <w:kern w:val="0"/>
-              <w:sz w:val="22"/>
-              <w:szCs w:val="22"/>
-              <w:lang w:val="da-DK" w:eastAsia="da-DK" w:bidi="ar-SA"/>
-            </w:rPr>
+            <w:rPr/>
           </w:pPr>
-          <w:hyperlink w:anchor="__RefHeading___Toc531097482">
+          <w:hyperlink w:anchor="__RefHeading___Toc531097481">
             <w:r>
               <w:rPr>
                 <w:rStyle w:val="Indeksspring"/>
-                <w:lang w:val="da-DK" w:eastAsia="da-DK" w:bidi="da-DK"/>
               </w:rPr>
-              <w:t>Save Setup.exe with the source code</w:t>
-            </w:r>
-            <w:r>
-              <w:rPr>
-                <w:rStyle w:val="Indeksspring"/>
-                <w:lang w:val="da-DK" w:eastAsia="da-DK"/>
-              </w:rPr>
+              <w:t>Create the setup file:</w:t>
               <w:tab/>
-              <w:t>2</w:t>
+              <w:t>3</w:t>
             </w:r>
           </w:hyperlink>
         </w:p>
@@ -312,29 +210,16 @@
             <w:pStyle w:val="Indholdsfortegnelse1"/>
             <w:tabs>
               <w:tab w:val="clear" w:pos="709"/>
-              <w:tab w:val="right" w:pos="9628" w:leader="dot"/>
+              <w:tab w:val="right" w:pos="9638" w:leader="dot"/>
             </w:tabs>
-            <w:rPr>
-              <w:rFonts w:ascii="Calibri" w:hAnsi="Calibri" w:eastAsia="Times New Roman" w:cs="Times New Roman"/>
-              <w:kern w:val="0"/>
-              <w:sz w:val="22"/>
-              <w:szCs w:val="22"/>
-              <w:lang w:val="da-DK" w:eastAsia="da-DK" w:bidi="ar-SA"/>
-            </w:rPr>
+            <w:rPr/>
           </w:pPr>
-          <w:hyperlink w:anchor="__RefHeading___Toc531097483">
+          <w:hyperlink w:anchor="__RefHeading___Toc531097482">
             <w:r>
               <w:rPr>
                 <w:rStyle w:val="Indeksspring"/>
-                <w:lang w:val="da-DK" w:eastAsia="da-DK" w:bidi="da-DK"/>
               </w:rPr>
-              <w:t>Test the setup.exe file generated</w:t>
-            </w:r>
-            <w:r>
-              <w:rPr>
-                <w:rStyle w:val="Indeksspring"/>
-                <w:lang w:val="da-DK" w:eastAsia="da-DK"/>
-              </w:rPr>
+              <w:t>Save Setup.exe with the source code</w:t>
               <w:tab/>
               <w:t>4</w:t>
             </w:r>
@@ -345,62 +230,16 @@
             <w:pStyle w:val="Indholdsfortegnelse1"/>
             <w:tabs>
               <w:tab w:val="clear" w:pos="709"/>
-              <w:tab w:val="right" w:pos="9628" w:leader="dot"/>
+              <w:tab w:val="right" w:pos="9638" w:leader="dot"/>
             </w:tabs>
-            <w:rPr>
-              <w:rFonts w:ascii="Calibri" w:hAnsi="Calibri" w:eastAsia="Times New Roman" w:cs="Times New Roman"/>
-              <w:kern w:val="0"/>
-              <w:sz w:val="22"/>
-              <w:szCs w:val="22"/>
-              <w:lang w:val="da-DK" w:eastAsia="da-DK" w:bidi="ar-SA"/>
-            </w:rPr>
+            <w:rPr/>
           </w:pPr>
-          <w:hyperlink w:anchor="__RefHeading___Toc531097484">
+          <w:hyperlink w:anchor="__RefHeading___Toc531097483">
             <w:r>
               <w:rPr>
                 <w:rStyle w:val="Indeksspring"/>
-                <w:lang w:val="da-DK" w:eastAsia="da-DK" w:bidi="da-DK"/>
               </w:rPr>
-              <w:t>Move documentation files</w:t>
-            </w:r>
-            <w:r>
-              <w:rPr>
-                <w:rStyle w:val="Indeksspring"/>
-                <w:lang w:val="da-DK" w:eastAsia="da-DK"/>
-              </w:rPr>
-              <w:tab/>
-              <w:t>4</w:t>
-            </w:r>
-          </w:hyperlink>
-        </w:p>
-        <w:p>
-          <w:pPr>
-            <w:pStyle w:val="Indholdsfortegnelse1"/>
-            <w:tabs>
-              <w:tab w:val="clear" w:pos="709"/>
-              <w:tab w:val="right" w:pos="9628" w:leader="dot"/>
-            </w:tabs>
-            <w:rPr>
-              <w:rFonts w:ascii="Calibri" w:hAnsi="Calibri" w:eastAsia="Times New Roman" w:cs="Times New Roman"/>
-              <w:kern w:val="0"/>
-              <w:sz w:val="22"/>
-              <w:szCs w:val="22"/>
-              <w:lang w:val="da-DK" w:eastAsia="da-DK" w:bidi="ar-SA"/>
-            </w:rPr>
-          </w:pPr>
-          <w:hyperlink w:anchor="__RefHeading___Toc531097485">
-            <w:r>
-              <w:rPr>
-                <w:rStyle w:val="Indeksspring"/>
-                <w:lang w:val="da-DK" w:eastAsia="da-DK" w:bidi="da-DK"/>
-              </w:rPr>
-              <w:t>Create the .zip distribution file:</w:t>
-            </w:r>
-            <w:r>
-              <w:rPr>
-                <w:rStyle w:val="Indeksspring"/>
-                <w:lang w:val="da-DK" w:eastAsia="da-DK"/>
-              </w:rPr>
+              <w:t>Test the setup.exe file generated</w:t>
               <w:tab/>
               <w:t>5</w:t>
             </w:r>
@@ -411,31 +250,58 @@
             <w:pStyle w:val="Indholdsfortegnelse1"/>
             <w:tabs>
               <w:tab w:val="clear" w:pos="709"/>
-              <w:tab w:val="right" w:pos="9628" w:leader="dot"/>
+              <w:tab w:val="right" w:pos="9638" w:leader="dot"/>
             </w:tabs>
-            <w:rPr>
-              <w:rFonts w:ascii="Calibri" w:hAnsi="Calibri" w:eastAsia="Times New Roman" w:cs="Times New Roman"/>
-              <w:kern w:val="0"/>
-              <w:sz w:val="22"/>
-              <w:szCs w:val="22"/>
-              <w:lang w:val="da-DK" w:eastAsia="da-DK" w:bidi="ar-SA"/>
-            </w:rPr>
+            <w:rPr/>
+          </w:pPr>
+          <w:hyperlink w:anchor="__RefHeading___Toc531097484">
+            <w:r>
+              <w:rPr>
+                <w:rStyle w:val="Indeksspring"/>
+              </w:rPr>
+              <w:t>Move documentation files</w:t>
+              <w:tab/>
+              <w:t>5</w:t>
+            </w:r>
+          </w:hyperlink>
+        </w:p>
+        <w:p>
+          <w:pPr>
+            <w:pStyle w:val="Indholdsfortegnelse1"/>
+            <w:tabs>
+              <w:tab w:val="clear" w:pos="709"/>
+              <w:tab w:val="right" w:pos="9638" w:leader="dot"/>
+            </w:tabs>
+            <w:rPr/>
+          </w:pPr>
+          <w:hyperlink w:anchor="__RefHeading___Toc531097485">
+            <w:r>
+              <w:rPr>
+                <w:rStyle w:val="Indeksspring"/>
+              </w:rPr>
+              <w:t>Create the .zip distribution file:</w:t>
+              <w:tab/>
+              <w:t>6</w:t>
+            </w:r>
+          </w:hyperlink>
+        </w:p>
+        <w:p>
+          <w:pPr>
+            <w:pStyle w:val="Indholdsfortegnelse1"/>
+            <w:tabs>
+              <w:tab w:val="clear" w:pos="709"/>
+              <w:tab w:val="right" w:pos="9638" w:leader="dot"/>
+            </w:tabs>
+            <w:rPr/>
           </w:pPr>
           <w:hyperlink w:anchor="__RefHeading___Toc531097486">
             <w:r>
               <w:rPr>
                 <w:rStyle w:val="Indeksspring"/>
-                <w:lang w:val="da-DK" w:eastAsia="da-DK" w:bidi="da-DK"/>
               </w:rPr>
-              <w:t>Save a copy of the release IBOS office net:</w:t>
-            </w:r>
-            <w:r>
-              <w:rPr>
-                <w:rStyle w:val="Indeksspring"/>
-                <w:lang w:val="da-DK" w:eastAsia="da-DK"/>
-              </w:rPr>
+              <w:t>Save a copy of the release in Dropbox:</w:t>
               <w:tab/>
-              <w:t>5</w:t>
+              <w:t>6</w:t>
             </w:r>
           </w:hyperlink>
           <w:r>
@@ -448,9 +314,11 @@
         <w:p>
           <w:pPr>
             <w:sectPr>
-              <w:type w:val="continuous"/>
+              <w:footerReference w:type="default" r:id="rId2"/>
+              <w:type w:val="nextPage"/>
               <w:pgSz w:w="11906" w:h="16838"/>
               <w:pgMar w:left="1134" w:right="1134" w:header="0" w:top="1134" w:footer="708" w:bottom="1134" w:gutter="0"/>
+              <w:pgNumType w:fmt="decimal"/>
               <w:formProt w:val="false"/>
               <w:textDirection w:val="lrTb"/>
               <w:docGrid w:type="default" w:linePitch="360" w:charSpace="0"/>
@@ -2083,9 +1951,7 @@
         </w:numPr>
         <w:bidi w:val="0"/>
         <w:jc w:val="left"/>
-        <w:rPr>
-          <w:rFonts w:ascii="Arial" w:hAnsi="Arial" w:cs="Arial"/>
-        </w:rPr>
+        <w:rPr/>
       </w:pPr>
       <w:r>
         <w:rPr>
@@ -2098,7 +1964,7 @@
           <w:rFonts w:cs="Arial" w:ascii="Arial" w:hAnsi="Arial"/>
           <w:lang w:val="da-DK"/>
         </w:rPr>
-        <w:t>3</w:t>
+        <w:t>4</w:t>
       </w:r>
       <w:r>
         <w:rPr>
@@ -2116,9 +1982,7 @@
         </w:numPr>
         <w:bidi w:val="0"/>
         <w:jc w:val="left"/>
-        <w:rPr>
-          <w:rFonts w:ascii="Arial" w:hAnsi="Arial" w:cs="Arial"/>
-        </w:rPr>
+        <w:rPr/>
       </w:pPr>
       <w:r>
         <w:rPr>
@@ -2131,7 +1995,7 @@
           <w:rFonts w:cs="Arial" w:ascii="Arial" w:hAnsi="Arial"/>
           <w:lang w:val="da-DK"/>
         </w:rPr>
-        <w:t>3</w:t>
+        <w:t>4</w:t>
       </w:r>
       <w:r>
         <w:rPr>
@@ -2378,9 +2242,7 @@
         <w:pStyle w:val="Standard"/>
         <w:bidi w:val="0"/>
         <w:jc w:val="left"/>
-        <w:rPr>
-          <w:rFonts w:ascii="Arial" w:hAnsi="Arial" w:cs="Arial"/>
-        </w:rPr>
+        <w:rPr/>
       </w:pPr>
       <w:r>
         <w:rPr>
@@ -2393,7 +2255,7 @@
           <w:rFonts w:cs="Arial" w:ascii="Arial" w:hAnsi="Arial"/>
           <w:lang w:val="da-DK"/>
         </w:rPr>
-        <w:t>3</w:t>
+        <w:t>4</w:t>
       </w:r>
       <w:r>
         <w:rPr>
@@ -2535,9 +2397,7 @@
         <w:pStyle w:val="Standard"/>
         <w:bidi w:val="0"/>
         <w:jc w:val="left"/>
-        <w:rPr>
-          <w:rFonts w:ascii="Arial" w:hAnsi="Arial" w:cs="Arial"/>
-        </w:rPr>
+        <w:rPr/>
       </w:pPr>
       <w:r>
         <w:rPr>
@@ -2550,7 +2410,21 @@
           <w:rFonts w:cs="Arial" w:ascii="Arial" w:hAnsi="Arial"/>
           <w:lang w:val="en-US"/>
         </w:rPr>
-        <w:t xml:space="preserve"> 3.0.0.0</w:t>
+        <w:t xml:space="preserve"> </w:t>
+      </w:r>
+      <w:r>
+        <w:rPr>
+          <w:rFonts w:cs="Arial" w:ascii="Arial" w:hAnsi="Arial"/>
+          <w:lang w:val="en-US"/>
+        </w:rPr>
+        <w:t>4</w:t>
+      </w:r>
+      <w:r>
+        <w:rPr>
+          <w:rFonts w:cs="Arial" w:ascii="Arial" w:hAnsi="Arial"/>
+          <w:lang w:val="en-US"/>
+        </w:rPr>
+        <w:t>.0.0.0</w:t>
       </w:r>
       <w:r>
         <w:rPr>
@@ -2564,9 +2438,7 @@
         <w:pStyle w:val="Standard"/>
         <w:bidi w:val="0"/>
         <w:jc w:val="left"/>
-        <w:rPr>
-          <w:rFonts w:ascii="Arial" w:hAnsi="Arial" w:cs="Arial"/>
-        </w:rPr>
+        <w:rPr/>
       </w:pPr>
       <w:r>
         <w:rPr>
@@ -2579,7 +2451,7 @@
           <w:rFonts w:cs="Arial" w:ascii="Arial" w:hAnsi="Arial"/>
           <w:lang w:val="en-US"/>
         </w:rPr>
-        <w:t>3</w:t>
+        <w:t>4</w:t>
       </w:r>
       <w:r>
         <w:rPr>
@@ -2593,15 +2465,25 @@
         <w:pStyle w:val="Standard"/>
         <w:bidi w:val="0"/>
         <w:jc w:val="left"/>
-        <w:rPr>
-          <w:rFonts w:ascii="Arial" w:hAnsi="Arial" w:cs="Arial"/>
-        </w:rPr>
-      </w:pPr>
-      <w:r>
-        <w:rPr>
-          <w:rFonts w:cs="Arial" w:ascii="Arial" w:hAnsi="Arial"/>
-        </w:rPr>
-        <w:t>Company name = IBOS</w:t>
+        <w:rPr/>
+      </w:pPr>
+      <w:r>
+        <w:rPr>
+          <w:rFonts w:cs="Arial" w:ascii="Arial" w:hAnsi="Arial"/>
+        </w:rPr>
+        <w:t xml:space="preserve">Company </w:t>
+      </w:r>
+      <w:r>
+        <w:rPr>
+          <w:rFonts w:cs="Arial" w:ascii="Arial" w:hAnsi="Arial"/>
+        </w:rPr>
+        <w:t>N</w:t>
+      </w:r>
+      <w:r>
+        <w:rPr>
+          <w:rFonts w:cs="Arial" w:ascii="Arial" w:hAnsi="Arial"/>
+        </w:rPr>
+        <w:t>ame = IBOS</w:t>
       </w:r>
     </w:p>
     <w:p>
@@ -2702,15 +2584,49 @@
         <w:pStyle w:val="Standard"/>
         <w:bidi w:val="0"/>
         <w:jc w:val="left"/>
-        <w:rPr>
-          <w:rFonts w:ascii="Arial" w:hAnsi="Arial" w:cs="Arial"/>
-        </w:rPr>
-      </w:pPr>
-      <w:r>
-        <w:rPr>
-          <w:rFonts w:cs="Arial" w:ascii="Arial" w:hAnsi="Arial"/>
-        </w:rPr>
-        <w:t>IF en error uccurs "Cannot open because in use by another process" just click "Try Again"</w:t>
+        <w:rPr/>
+      </w:pPr>
+      <w:r>
+        <w:rPr>
+          <w:rFonts w:cs="Arial" w:ascii="Arial" w:hAnsi="Arial"/>
+        </w:rPr>
+        <w:t>I</w:t>
+      </w:r>
+      <w:r>
+        <w:rPr>
+          <w:rFonts w:cs="Arial" w:ascii="Arial" w:hAnsi="Arial"/>
+        </w:rPr>
+        <w:t>f</w:t>
+      </w:r>
+      <w:r>
+        <w:rPr>
+          <w:rFonts w:cs="Arial" w:ascii="Arial" w:hAnsi="Arial"/>
+        </w:rPr>
+        <w:t xml:space="preserve"> </w:t>
+      </w:r>
+      <w:r>
+        <w:rPr>
+          <w:rFonts w:cs="Arial" w:ascii="Arial" w:hAnsi="Arial"/>
+        </w:rPr>
+        <w:t>a</w:t>
+      </w:r>
+      <w:r>
+        <w:rPr>
+          <w:rFonts w:cs="Arial" w:ascii="Arial" w:hAnsi="Arial"/>
+        </w:rPr>
+        <w:t xml:space="preserve">n error </w:t>
+      </w:r>
+      <w:r>
+        <w:rPr>
+          <w:rFonts w:cs="Arial" w:ascii="Arial" w:hAnsi="Arial"/>
+        </w:rPr>
+        <w:t>o</w:t>
+      </w:r>
+      <w:r>
+        <w:rPr>
+          <w:rFonts w:cs="Arial" w:ascii="Arial" w:hAnsi="Arial"/>
+        </w:rPr>
+        <w:t>ccurs "Cannot open because in use by another process" just click "Try Again"</w:t>
       </w:r>
     </w:p>
     <w:p>
@@ -2774,6 +2690,24 @@
           <w:rFonts w:cs="Arial" w:ascii="Arial" w:hAnsi="Arial"/>
         </w:rPr>
         <w:t>containing setup.exe</w:t>
+      </w:r>
+    </w:p>
+    <w:p>
+      <w:pPr>
+        <w:pStyle w:val="Standard"/>
+        <w:bidi w:val="0"/>
+        <w:jc w:val="left"/>
+        <w:rPr>
+          <w:rFonts w:ascii="Arial" w:hAnsi="Arial" w:cs="Arial"/>
+        </w:rPr>
+      </w:pPr>
+      <w:r>
+        <w:rPr>
+          <w:rFonts w:cs="Arial" w:ascii="Arial" w:hAnsi="Arial"/>
+        </w:rPr>
+      </w:r>
+      <w:r>
+        <w:br w:type="page"/>
       </w:r>
     </w:p>
     <w:p>
@@ -3045,9 +2979,7 @@
         <w:pStyle w:val="Standard"/>
         <w:bidi w:val="0"/>
         <w:jc w:val="left"/>
-        <w:rPr>
-          <w:rFonts w:ascii="Arial" w:hAnsi="Arial" w:cs="Arial"/>
-        </w:rPr>
+        <w:rPr/>
       </w:pPr>
       <w:r>
         <w:rPr>
@@ -3060,7 +2992,7 @@
           <w:rFonts w:cs="Arial" w:ascii="Arial" w:hAnsi="Arial"/>
           <w:lang w:val="en-US"/>
         </w:rPr>
-        <w:t>3</w:t>
+        <w:t>4</w:t>
       </w:r>
       <w:r>
         <w:rPr>
@@ -3089,9 +3021,7 @@
         <w:pStyle w:val="Standard"/>
         <w:bidi w:val="0"/>
         <w:jc w:val="left"/>
-        <w:rPr>
-          <w:rFonts w:ascii="Arial" w:hAnsi="Arial" w:cs="Arial"/>
-        </w:rPr>
+        <w:rPr/>
       </w:pPr>
       <w:r>
         <w:rPr>
@@ -3104,7 +3034,7 @@
           <w:rFonts w:cs="Arial" w:ascii="Arial" w:hAnsi="Arial"/>
           <w:lang w:val="da-DK"/>
         </w:rPr>
-        <w:t>3</w:t>
+        <w:t>4</w:t>
       </w:r>
       <w:r>
         <w:rPr>
@@ -3213,15 +3143,25 @@
         <w:pStyle w:val="Standard"/>
         <w:bidi w:val="0"/>
         <w:jc w:val="left"/>
-        <w:rPr>
-          <w:rFonts w:ascii="Arial" w:hAnsi="Arial" w:cs="Arial"/>
-        </w:rPr>
-      </w:pPr>
-      <w:r>
-        <w:rPr>
-          <w:rFonts w:cs="Arial" w:ascii="Arial" w:hAnsi="Arial"/>
-        </w:rPr>
-        <w:t>Keep Program Group Name = "IBOS MusicXmlREader"</w:t>
+        <w:rPr/>
+      </w:pPr>
+      <w:r>
+        <w:rPr>
+          <w:rFonts w:cs="Arial" w:ascii="Arial" w:hAnsi="Arial"/>
+        </w:rPr>
+        <w:t>Keep Program Group Name = "IBOS MusicXmlR</w:t>
+      </w:r>
+      <w:r>
+        <w:rPr>
+          <w:rFonts w:cs="Arial" w:ascii="Arial" w:hAnsi="Arial"/>
+        </w:rPr>
+        <w:t>e</w:t>
+      </w:r>
+      <w:r>
+        <w:rPr>
+          <w:rFonts w:cs="Arial" w:ascii="Arial" w:hAnsi="Arial"/>
+        </w:rPr>
+        <w:t>ader"</w:t>
       </w:r>
     </w:p>
     <w:p>
@@ -3277,15 +3217,25 @@
         <w:pStyle w:val="Standard"/>
         <w:bidi w:val="0"/>
         <w:jc w:val="left"/>
-        <w:rPr>
-          <w:rFonts w:ascii="Arial" w:hAnsi="Arial" w:cs="Arial"/>
-        </w:rPr>
-      </w:pPr>
-      <w:r>
-        <w:rPr>
-          <w:rFonts w:cs="Arial" w:ascii="Arial" w:hAnsi="Arial"/>
-        </w:rPr>
-        <w:t>Keep "Launch IBOS MusicXmlReader" ckecked</w:t>
+        <w:rPr/>
+      </w:pPr>
+      <w:r>
+        <w:rPr>
+          <w:rFonts w:cs="Arial" w:ascii="Arial" w:hAnsi="Arial"/>
+        </w:rPr>
+        <w:t>Keep "Launch IBOS MusicXmlReader" c</w:t>
+      </w:r>
+      <w:r>
+        <w:rPr>
+          <w:rFonts w:cs="Arial" w:ascii="Arial" w:hAnsi="Arial"/>
+        </w:rPr>
+        <w:t>h</w:t>
+      </w:r>
+      <w:r>
+        <w:rPr>
+          <w:rFonts w:cs="Arial" w:ascii="Arial" w:hAnsi="Arial"/>
+        </w:rPr>
+        <w:t>ecked</w:t>
       </w:r>
     </w:p>
     <w:p>
@@ -3438,9 +3388,7 @@
         </w:numPr>
         <w:bidi w:val="0"/>
         <w:jc w:val="left"/>
-        <w:rPr>
-          <w:rFonts w:ascii="Arial" w:hAnsi="Arial" w:cs="Arial"/>
-        </w:rPr>
+        <w:rPr/>
       </w:pPr>
       <w:r>
         <w:rPr>
@@ -3453,13 +3401,19 @@
           <w:rFonts w:cs="Arial" w:ascii="Arial" w:hAnsi="Arial"/>
           <w:lang w:val="da-DK"/>
         </w:rPr>
-        <w:t>3</w:t>
+        <w:t>4</w:t>
       </w:r>
       <w:r>
         <w:rPr>
           <w:rFonts w:cs="Arial" w:ascii="Arial" w:hAnsi="Arial"/>
         </w:rPr>
         <w:t>.0.0.0.doc</w:t>
+      </w:r>
+      <w:r>
+        <w:rPr>
+          <w:rFonts w:cs="Arial" w:ascii="Arial" w:hAnsi="Arial"/>
+        </w:rPr>
+        <w:t>x</w:t>
       </w:r>
     </w:p>
     <w:p>
@@ -3471,9 +3425,7 @@
         </w:numPr>
         <w:bidi w:val="0"/>
         <w:jc w:val="left"/>
-        <w:rPr>
-          <w:rFonts w:ascii="Arial" w:hAnsi="Arial" w:cs="Arial"/>
-        </w:rPr>
+        <w:rPr/>
       </w:pPr>
       <w:r>
         <w:rPr>
@@ -3486,13 +3438,19 @@
           <w:rFonts w:cs="Arial" w:ascii="Arial" w:hAnsi="Arial"/>
           <w:lang w:val="da-DK"/>
         </w:rPr>
-        <w:t>3</w:t>
+        <w:t>4</w:t>
       </w:r>
       <w:r>
         <w:rPr>
           <w:rFonts w:cs="Arial" w:ascii="Arial" w:hAnsi="Arial"/>
         </w:rPr>
         <w:t>.0.0.0.doc</w:t>
+      </w:r>
+      <w:r>
+        <w:rPr>
+          <w:rFonts w:cs="Arial" w:ascii="Arial" w:hAnsi="Arial"/>
+        </w:rPr>
+        <w:t>x</w:t>
       </w:r>
     </w:p>
     <w:p>
@@ -3517,13 +3475,25 @@
           <w:rFonts w:cs="Arial" w:ascii="Arial" w:hAnsi="Arial"/>
           <w:lang w:val="da-DK"/>
         </w:rPr>
-        <w:t>3</w:t>
+        <w:t>4</w:t>
       </w:r>
       <w:r>
         <w:rPr>
           <w:rFonts w:cs="Arial" w:ascii="Arial" w:hAnsi="Arial"/>
         </w:rPr>
         <w:t>.0.0.0.doc</w:t>
+      </w:r>
+      <w:r>
+        <w:rPr>
+          <w:rFonts w:cs="Arial" w:ascii="Arial" w:hAnsi="Arial"/>
+        </w:rPr>
+        <w:t>x</w:t>
+      </w:r>
+      <w:r>
+        <w:rPr>
+          <w:rFonts w:cs="Arial" w:ascii="Arial" w:hAnsi="Arial"/>
+        </w:rPr>
+        <w:t xml:space="preserve"> </w:t>
       </w:r>
       <w:r>
         <w:rPr>
@@ -3557,15 +3527,31 @@
         </w:numPr>
         <w:bidi w:val="0"/>
         <w:jc w:val="left"/>
-        <w:rPr>
-          <w:rFonts w:ascii="Arial" w:hAnsi="Arial" w:cs="Arial"/>
-        </w:rPr>
-      </w:pPr>
-      <w:r>
-        <w:rPr>
-          <w:rFonts w:cs="Arial" w:ascii="Arial" w:hAnsi="Arial"/>
-        </w:rPr>
-        <w:t>User's manual for IBOS MusicXmlReader version 2.0.0.0.doc</w:t>
+        <w:rPr/>
+      </w:pPr>
+      <w:r>
+        <w:rPr>
+          <w:rFonts w:cs="Arial" w:ascii="Arial" w:hAnsi="Arial"/>
+        </w:rPr>
+        <w:t xml:space="preserve">User's manual for IBOS MusicXmlReader version </w:t>
+      </w:r>
+      <w:r>
+        <w:rPr>
+          <w:rFonts w:cs="Arial" w:ascii="Arial" w:hAnsi="Arial"/>
+        </w:rPr>
+        <w:t>4</w:t>
+      </w:r>
+      <w:r>
+        <w:rPr>
+          <w:rFonts w:cs="Arial" w:ascii="Arial" w:hAnsi="Arial"/>
+        </w:rPr>
+        <w:t>.0.0.0.doc</w:t>
+      </w:r>
+      <w:r>
+        <w:rPr>
+          <w:rFonts w:cs="Arial" w:ascii="Arial" w:hAnsi="Arial"/>
+        </w:rPr>
+        <w:t>x</w:t>
       </w:r>
     </w:p>
     <w:p>
@@ -3577,15 +3563,31 @@
         </w:numPr>
         <w:bidi w:val="0"/>
         <w:jc w:val="left"/>
-        <w:rPr>
-          <w:rFonts w:ascii="Arial" w:hAnsi="Arial" w:cs="Arial"/>
-        </w:rPr>
-      </w:pPr>
-      <w:r>
-        <w:rPr>
-          <w:rFonts w:cs="Arial" w:ascii="Arial" w:hAnsi="Arial"/>
-        </w:rPr>
-        <w:t>Installation guide for IBOS MusicXmlReader version 2.0.0.0.doc</w:t>
+        <w:rPr/>
+      </w:pPr>
+      <w:r>
+        <w:rPr>
+          <w:rFonts w:cs="Arial" w:ascii="Arial" w:hAnsi="Arial"/>
+        </w:rPr>
+        <w:t xml:space="preserve">Installation guide for IBOS MusicXmlReader version </w:t>
+      </w:r>
+      <w:r>
+        <w:rPr>
+          <w:rFonts w:cs="Arial" w:ascii="Arial" w:hAnsi="Arial"/>
+        </w:rPr>
+        <w:t>4</w:t>
+      </w:r>
+      <w:r>
+        <w:rPr>
+          <w:rFonts w:cs="Arial" w:ascii="Arial" w:hAnsi="Arial"/>
+        </w:rPr>
+        <w:t>.0.0.0.doc</w:t>
+      </w:r>
+      <w:r>
+        <w:rPr>
+          <w:rFonts w:cs="Arial" w:ascii="Arial" w:hAnsi="Arial"/>
+        </w:rPr>
+        <w:t>x</w:t>
       </w:r>
     </w:p>
     <w:p>
@@ -3597,118 +3599,164 @@
         </w:numPr>
         <w:bidi w:val="0"/>
         <w:jc w:val="left"/>
-        <w:rPr>
-          <w:rFonts w:ascii="Arial" w:hAnsi="Arial" w:cs="Arial"/>
-        </w:rPr>
-      </w:pPr>
-      <w:r>
-        <w:rPr>
-          <w:rFonts w:cs="Arial" w:ascii="Arial" w:hAnsi="Arial"/>
-        </w:rPr>
-        <w:t>Release Notes for IBOS MusicXmlReader version 2.0.0.0.doc</w:t>
-      </w:r>
-    </w:p>
-    <w:p>
-      <w:pPr>
-        <w:pStyle w:val="Standard"/>
-        <w:bidi w:val="0"/>
-        <w:jc w:val="left"/>
-        <w:rPr>
-          <w:rFonts w:ascii="Arial" w:hAnsi="Arial" w:cs="Arial"/>
-        </w:rPr>
-      </w:pPr>
-      <w:r>
-        <w:rPr>
-          <w:rFonts w:cs="Arial" w:ascii="Arial" w:hAnsi="Arial"/>
-        </w:rPr>
-      </w:r>
-    </w:p>
-    <w:p>
-      <w:pPr>
-        <w:pStyle w:val="Standard"/>
-        <w:bidi w:val="0"/>
-        <w:jc w:val="left"/>
-        <w:rPr>
-          <w:rFonts w:ascii="Arial" w:hAnsi="Arial" w:cs="Arial"/>
-        </w:rPr>
-      </w:pPr>
-      <w:r>
-        <w:rPr>
-          <w:rFonts w:cs="Arial" w:ascii="Arial" w:hAnsi="Arial"/>
-        </w:rPr>
-      </w:r>
-    </w:p>
-    <w:p>
-      <w:pPr>
-        <w:pStyle w:val="Standard"/>
-        <w:bidi w:val="0"/>
-        <w:jc w:val="left"/>
-        <w:rPr>
-          <w:rFonts w:ascii="Arial" w:hAnsi="Arial" w:cs="Arial"/>
-        </w:rPr>
-      </w:pPr>
-      <w:r>
-        <w:rPr>
-          <w:rFonts w:cs="Arial" w:ascii="Arial" w:hAnsi="Arial"/>
-        </w:rPr>
-        <w:t>Start (Word or LibreOfficeWriter?) on each of the 6 .doc files and convert them to</w:t>
-      </w:r>
-    </w:p>
-    <w:p>
-      <w:pPr>
-        <w:pStyle w:val="Standard"/>
-        <w:bidi w:val="0"/>
-        <w:jc w:val="left"/>
-        <w:rPr>
-          <w:rFonts w:ascii="Arial" w:hAnsi="Arial" w:cs="Arial"/>
-        </w:rPr>
-      </w:pPr>
-      <w:r>
-        <w:rPr>
-          <w:rFonts w:cs="Arial" w:ascii="Arial" w:hAnsi="Arial"/>
-        </w:rPr>
-        <w:t>.pdf and .rtf in the same location</w:t>
-      </w:r>
-    </w:p>
-    <w:p>
-      <w:pPr>
-        <w:pStyle w:val="Standard"/>
-        <w:bidi w:val="0"/>
-        <w:jc w:val="left"/>
-        <w:rPr>
-          <w:rFonts w:ascii="Arial" w:hAnsi="Arial" w:cs="Arial"/>
-        </w:rPr>
-      </w:pPr>
-      <w:r>
-        <w:rPr>
-          <w:rFonts w:cs="Arial" w:ascii="Arial" w:hAnsi="Arial"/>
-        </w:rPr>
-      </w:r>
-    </w:p>
-    <w:p>
-      <w:pPr>
-        <w:pStyle w:val="Standard"/>
-        <w:bidi w:val="0"/>
-        <w:jc w:val="left"/>
-        <w:rPr>
-          <w:rFonts w:ascii="Arial" w:hAnsi="Arial" w:cs="Arial"/>
-        </w:rPr>
-      </w:pPr>
-      <w:r>
-        <w:rPr>
-          <w:rFonts w:cs="Arial" w:ascii="Arial" w:hAnsi="Arial"/>
-        </w:rPr>
-        <w:t>"Filer-&gt;Exporter som .pdf"</w:t>
-      </w:r>
-    </w:p>
-    <w:p>
-      <w:pPr>
-        <w:pStyle w:val="Standard"/>
-        <w:bidi w:val="0"/>
-        <w:jc w:val="left"/>
-        <w:rPr>
-          <w:rFonts w:ascii="Arial" w:hAnsi="Arial" w:cs="Arial"/>
-        </w:rPr>
+        <w:rPr/>
+      </w:pPr>
+      <w:r>
+        <w:rPr>
+          <w:rFonts w:cs="Arial" w:ascii="Arial" w:hAnsi="Arial"/>
+        </w:rPr>
+        <w:t xml:space="preserve">Release Notes for IBOS MusicXmlReader version </w:t>
+      </w:r>
+      <w:r>
+        <w:rPr>
+          <w:rFonts w:cs="Arial" w:ascii="Arial" w:hAnsi="Arial"/>
+        </w:rPr>
+        <w:t>4</w:t>
+      </w:r>
+      <w:r>
+        <w:rPr>
+          <w:rFonts w:cs="Arial" w:ascii="Arial" w:hAnsi="Arial"/>
+        </w:rPr>
+        <w:t>.0.0.0.doc</w:t>
+      </w:r>
+      <w:r>
+        <w:rPr>
+          <w:rFonts w:cs="Arial" w:ascii="Arial" w:hAnsi="Arial"/>
+        </w:rPr>
+        <w:t>x</w:t>
+      </w:r>
+    </w:p>
+    <w:p>
+      <w:pPr>
+        <w:pStyle w:val="Standard"/>
+        <w:bidi w:val="0"/>
+        <w:jc w:val="left"/>
+        <w:rPr>
+          <w:rFonts w:ascii="Arial" w:hAnsi="Arial" w:cs="Arial"/>
+        </w:rPr>
+      </w:pPr>
+      <w:r>
+        <w:rPr>
+          <w:rFonts w:cs="Arial" w:ascii="Arial" w:hAnsi="Arial"/>
+        </w:rPr>
+      </w:r>
+    </w:p>
+    <w:p>
+      <w:pPr>
+        <w:pStyle w:val="Standard"/>
+        <w:bidi w:val="0"/>
+        <w:jc w:val="left"/>
+        <w:rPr>
+          <w:rFonts w:ascii="Arial" w:hAnsi="Arial" w:cs="Arial"/>
+        </w:rPr>
+      </w:pPr>
+      <w:r>
+        <w:rPr>
+          <w:rFonts w:cs="Arial" w:ascii="Arial" w:hAnsi="Arial"/>
+        </w:rPr>
+      </w:r>
+    </w:p>
+    <w:p>
+      <w:pPr>
+        <w:pStyle w:val="Standard"/>
+        <w:bidi w:val="0"/>
+        <w:jc w:val="left"/>
+        <w:rPr/>
+      </w:pPr>
+      <w:r>
+        <w:rPr>
+          <w:rFonts w:cs="Arial" w:ascii="Arial" w:hAnsi="Arial"/>
+        </w:rPr>
+        <w:t>Start LibreOfficeWriter on each of the 6 .doc</w:t>
+      </w:r>
+      <w:r>
+        <w:rPr>
+          <w:rFonts w:cs="Arial" w:ascii="Arial" w:hAnsi="Arial"/>
+        </w:rPr>
+        <w:t>x</w:t>
+      </w:r>
+      <w:r>
+        <w:rPr>
+          <w:rFonts w:cs="Arial" w:ascii="Arial" w:hAnsi="Arial"/>
+        </w:rPr>
+        <w:t xml:space="preserve"> files and convert them to</w:t>
+      </w:r>
+    </w:p>
+    <w:p>
+      <w:pPr>
+        <w:pStyle w:val="Standard"/>
+        <w:bidi w:val="0"/>
+        <w:jc w:val="left"/>
+        <w:rPr>
+          <w:rFonts w:ascii="Arial" w:hAnsi="Arial" w:cs="Arial"/>
+        </w:rPr>
+      </w:pPr>
+      <w:r>
+        <w:rPr>
+          <w:rFonts w:cs="Arial" w:ascii="Arial" w:hAnsi="Arial"/>
+        </w:rPr>
+        <w:t>.pdf, .</w:t>
+      </w:r>
+      <w:r>
+        <w:rPr>
+          <w:rFonts w:cs="Arial" w:ascii="Arial" w:hAnsi="Arial"/>
+        </w:rPr>
+        <w:t>html</w:t>
+      </w:r>
+      <w:r>
+        <w:rPr>
+          <w:rFonts w:cs="Arial" w:ascii="Arial" w:hAnsi="Arial"/>
+        </w:rPr>
+        <w:t xml:space="preserve"> and .rtf in the same location</w:t>
+      </w:r>
+    </w:p>
+    <w:p>
+      <w:pPr>
+        <w:pStyle w:val="Standard"/>
+        <w:bidi w:val="0"/>
+        <w:jc w:val="left"/>
+        <w:rPr>
+          <w:rFonts w:ascii="Arial" w:hAnsi="Arial" w:cs="Arial"/>
+        </w:rPr>
+      </w:pPr>
+      <w:r>
+        <w:rPr>
+          <w:rFonts w:cs="Arial" w:ascii="Arial" w:hAnsi="Arial"/>
+        </w:rPr>
+      </w:r>
+    </w:p>
+    <w:p>
+      <w:pPr>
+        <w:pStyle w:val="Standard"/>
+        <w:bidi w:val="0"/>
+        <w:jc w:val="left"/>
+        <w:rPr/>
+      </w:pPr>
+      <w:r>
+        <w:rPr>
+          <w:rFonts w:cs="Arial" w:ascii="Arial" w:hAnsi="Arial"/>
+        </w:rPr>
+        <w:t>"Filer-&gt;Export</w:t>
+      </w:r>
+      <w:r>
+        <w:rPr>
+          <w:rFonts w:cs="Arial" w:ascii="Arial" w:hAnsi="Arial"/>
+        </w:rPr>
+        <w:t>é</w:t>
+      </w:r>
+      <w:r>
+        <w:rPr>
+          <w:rFonts w:cs="Arial" w:ascii="Arial" w:hAnsi="Arial"/>
+        </w:rPr>
+        <w:t>r som .pdf"</w:t>
+      </w:r>
+    </w:p>
+    <w:p>
+      <w:pPr>
+        <w:pStyle w:val="Standard"/>
+        <w:bidi w:val="0"/>
+        <w:jc w:val="left"/>
+        <w:rPr/>
       </w:pPr>
       <w:r>
         <w:rPr>
@@ -3723,44 +3771,71 @@
         <w:bidi w:val="0"/>
         <w:jc w:val="left"/>
         <w:rPr>
-          <w:rFonts w:ascii="Arial" w:hAnsi="Arial" w:cs="Arial"/>
-        </w:rPr>
-      </w:pPr>
-      <w:r>
-        <w:rPr>
-          <w:rFonts w:cs="Arial" w:ascii="Arial" w:hAnsi="Arial"/>
-        </w:rPr>
-      </w:r>
-    </w:p>
-    <w:p>
-      <w:pPr>
-        <w:pStyle w:val="Standard"/>
-        <w:bidi w:val="0"/>
-        <w:jc w:val="left"/>
-        <w:rPr>
-          <w:rFonts w:ascii="Arial" w:hAnsi="Arial" w:cs="Arial"/>
-        </w:rPr>
-      </w:pPr>
-      <w:r>
-        <w:rPr>
-          <w:rFonts w:cs="Arial" w:ascii="Arial" w:hAnsi="Arial"/>
-        </w:rPr>
-      </w:r>
-    </w:p>
-    <w:p>
-      <w:pPr>
-        <w:pStyle w:val="Standard"/>
-        <w:bidi w:val="0"/>
-        <w:jc w:val="left"/>
-        <w:rPr>
-          <w:rFonts w:ascii="Arial" w:hAnsi="Arial" w:cs="Arial"/>
-        </w:rPr>
-      </w:pPr>
-      <w:r>
-        <w:rPr>
-          <w:rFonts w:cs="Arial" w:ascii="Arial" w:hAnsi="Arial"/>
-        </w:rPr>
-        <w:t>Write protect the 6*3 + 1 resulting files</w:t>
+          <w:color w:val="FF5429"/>
+        </w:rPr>
+      </w:pPr>
+      <w:r>
+        <w:rPr>
+          <w:rFonts w:cs="Arial" w:ascii="Arial" w:hAnsi="Arial"/>
+          <w:color w:val="FF5429"/>
+        </w:rPr>
+        <w:t>Tilsvarende for html</w:t>
+      </w:r>
+    </w:p>
+    <w:p>
+      <w:pPr>
+        <w:pStyle w:val="Standard"/>
+        <w:bidi w:val="0"/>
+        <w:jc w:val="left"/>
+        <w:rPr>
+          <w:rFonts w:ascii="Arial" w:hAnsi="Arial" w:cs="Arial"/>
+        </w:rPr>
+      </w:pPr>
+      <w:r>
+        <w:rPr>
+          <w:rFonts w:cs="Arial" w:ascii="Arial" w:hAnsi="Arial"/>
+        </w:rPr>
+      </w:r>
+    </w:p>
+    <w:p>
+      <w:pPr>
+        <w:pStyle w:val="Standard"/>
+        <w:bidi w:val="0"/>
+        <w:jc w:val="left"/>
+        <w:rPr>
+          <w:rFonts w:ascii="Arial" w:hAnsi="Arial" w:cs="Arial"/>
+        </w:rPr>
+      </w:pPr>
+      <w:r>
+        <w:rPr>
+          <w:rFonts w:cs="Arial" w:ascii="Arial" w:hAnsi="Arial"/>
+        </w:rPr>
+      </w:r>
+    </w:p>
+    <w:p>
+      <w:pPr>
+        <w:pStyle w:val="Standard"/>
+        <w:bidi w:val="0"/>
+        <w:jc w:val="left"/>
+        <w:rPr/>
+      </w:pPr>
+      <w:r>
+        <w:rPr>
+          <w:rFonts w:cs="Arial" w:ascii="Arial" w:hAnsi="Arial"/>
+        </w:rPr>
+        <w:t>Write protect the 6*</w:t>
+      </w:r>
+      <w:r>
+        <w:rPr>
+          <w:rFonts w:cs="Arial" w:ascii="Arial" w:hAnsi="Arial"/>
+        </w:rPr>
+        <w:t>4</w:t>
+      </w:r>
+      <w:r>
+        <w:rPr>
+          <w:rFonts w:cs="Arial" w:ascii="Arial" w:hAnsi="Arial"/>
+        </w:rPr>
+        <w:t xml:space="preserve"> + 1 resulting files</w:t>
       </w:r>
       <w:r>
         <w:br w:type="page"/>
@@ -3896,9 +3971,7 @@
         <w:pStyle w:val="Standard"/>
         <w:bidi w:val="0"/>
         <w:jc w:val="left"/>
-        <w:rPr>
-          <w:rFonts w:ascii="Arial" w:hAnsi="Arial" w:cs="Arial"/>
-        </w:rPr>
+        <w:rPr/>
       </w:pPr>
       <w:r>
         <w:rPr>
@@ -3921,7 +3994,7 @@
           <w:bCs/>
           <w:lang w:val="en-US"/>
         </w:rPr>
-        <w:t>3</w:t>
+        <w:t>4</w:t>
       </w:r>
       <w:r>
         <w:rPr>
@@ -3967,9 +4040,7 @@
         <w:pStyle w:val="Standard"/>
         <w:bidi w:val="0"/>
         <w:jc w:val="left"/>
-        <w:rPr>
-          <w:rFonts w:ascii="Arial" w:hAnsi="Arial" w:cs="Arial"/>
-        </w:rPr>
+        <w:rPr/>
       </w:pPr>
       <w:r>
         <w:rPr>
@@ -3982,7 +4053,7 @@
           <w:rFonts w:cs="Arial" w:ascii="Arial" w:hAnsi="Arial"/>
           <w:lang w:val="en-US"/>
         </w:rPr>
-        <w:t>3</w:t>
+        <w:t>4</w:t>
       </w:r>
       <w:r>
         <w:rPr>
@@ -4092,32 +4163,34 @@
       <w:bookmarkEnd w:id="10"/>
       <w:r>
         <w:rPr/>
-        <w:t>Save a copy of the release IBOS office net:</w:t>
-      </w:r>
-    </w:p>
-    <w:p>
-      <w:pPr>
-        <w:pStyle w:val="Standard"/>
-        <w:bidi w:val="0"/>
-        <w:jc w:val="left"/>
-        <w:rPr>
-          <w:rFonts w:ascii="Arial" w:hAnsi="Arial" w:cs="Arial"/>
-        </w:rPr>
-      </w:pPr>
-      <w:r>
-        <w:rPr>
-          <w:rFonts w:cs="Arial" w:ascii="Arial" w:hAnsi="Arial"/>
-        </w:rPr>
-      </w:r>
-    </w:p>
-    <w:p>
-      <w:pPr>
-        <w:pStyle w:val="Standard"/>
-        <w:bidi w:val="0"/>
-        <w:jc w:val="left"/>
-        <w:rPr>
-          <w:rFonts w:ascii="Arial" w:hAnsi="Arial" w:cs="Arial"/>
-        </w:rPr>
+        <w:t xml:space="preserve">Save a copy of the release </w:t>
+      </w:r>
+      <w:r>
+        <w:rPr/>
+        <w:t>in Dropbox:</w:t>
+      </w:r>
+    </w:p>
+    <w:p>
+      <w:pPr>
+        <w:pStyle w:val="Standard"/>
+        <w:bidi w:val="0"/>
+        <w:jc w:val="left"/>
+        <w:rPr>
+          <w:rFonts w:ascii="Arial" w:hAnsi="Arial" w:cs="Arial"/>
+        </w:rPr>
+      </w:pPr>
+      <w:r>
+        <w:rPr>
+          <w:rFonts w:cs="Arial" w:ascii="Arial" w:hAnsi="Arial"/>
+        </w:rPr>
+      </w:r>
+    </w:p>
+    <w:p>
+      <w:pPr>
+        <w:pStyle w:val="Standard"/>
+        <w:bidi w:val="0"/>
+        <w:jc w:val="left"/>
+        <w:rPr/>
       </w:pPr>
       <w:r>
         <w:rPr>
@@ -4130,193 +4203,156 @@
           <w:rFonts w:cs="Arial" w:ascii="Arial" w:hAnsi="Arial"/>
           <w:lang w:val="en-US"/>
         </w:rPr>
-        <w:t>3</w:t>
-      </w:r>
-      <w:r>
-        <w:rPr>
-          <w:rFonts w:cs="Arial" w:ascii="Arial" w:hAnsi="Arial"/>
-        </w:rPr>
-        <w:t>.0.0.0" just created at</w:t>
-      </w:r>
-    </w:p>
-    <w:p>
-      <w:pPr>
-        <w:pStyle w:val="Standard"/>
-        <w:bidi w:val="0"/>
-        <w:jc w:val="left"/>
-        <w:rPr>
-          <w:rFonts w:ascii="Arial" w:hAnsi="Arial" w:cs="Arial"/>
-        </w:rPr>
-      </w:pPr>
-      <w:r>
-        <w:rPr>
-          <w:rFonts w:cs="Arial" w:ascii="Arial" w:hAnsi="Arial"/>
-        </w:rPr>
-      </w:r>
-    </w:p>
-    <w:p>
-      <w:pPr>
-        <w:pStyle w:val="Standard"/>
-        <w:bidi w:val="0"/>
-        <w:jc w:val="left"/>
-        <w:rPr>
-          <w:rFonts w:ascii="Arial" w:hAnsi="Arial" w:cs="Arial"/>
-        </w:rPr>
-      </w:pPr>
-      <w:r>
-        <w:rPr>
-          <w:rFonts w:cs="Arial" w:ascii="Arial" w:hAnsi="Arial"/>
-        </w:rPr>
-        <w:t>C:\Users\Jens\Dropbox\Root\Arkiv for releasede versioner</w:t>
-      </w:r>
-    </w:p>
-    <w:p>
-      <w:pPr>
-        <w:pStyle w:val="Standard"/>
-        <w:bidi w:val="0"/>
-        <w:jc w:val="left"/>
-        <w:rPr>
-          <w:rFonts w:ascii="Arial" w:hAnsi="Arial" w:cs="Arial"/>
-        </w:rPr>
-      </w:pPr>
-      <w:r>
-        <w:rPr>
-          <w:rFonts w:cs="Arial" w:ascii="Arial" w:hAnsi="Arial"/>
-        </w:rPr>
-      </w:r>
-    </w:p>
-    <w:p>
-      <w:pPr>
-        <w:pStyle w:val="Standard"/>
-        <w:bidi w:val="0"/>
-        <w:jc w:val="left"/>
-        <w:rPr>
-          <w:rFonts w:ascii="Arial" w:hAnsi="Arial" w:cs="Arial"/>
-        </w:rPr>
-      </w:pPr>
-      <w:r>
-        <w:rPr>
-          <w:rFonts w:cs="Arial" w:ascii="Arial" w:hAnsi="Arial"/>
-        </w:rPr>
-        <w:t>to a Usb memory stick</w:t>
-      </w:r>
-    </w:p>
-    <w:p>
-      <w:pPr>
-        <w:pStyle w:val="Standard"/>
-        <w:bidi w:val="0"/>
-        <w:jc w:val="left"/>
-        <w:rPr>
-          <w:rFonts w:ascii="Arial" w:hAnsi="Arial" w:cs="Arial"/>
-        </w:rPr>
-      </w:pPr>
-      <w:r>
-        <w:rPr>
-          <w:rFonts w:cs="Arial" w:ascii="Arial" w:hAnsi="Arial"/>
-        </w:rPr>
-      </w:r>
-    </w:p>
-    <w:p>
-      <w:pPr>
-        <w:pStyle w:val="Standard"/>
-        <w:bidi w:val="0"/>
-        <w:jc w:val="left"/>
-        <w:rPr>
-          <w:rFonts w:ascii="Arial" w:hAnsi="Arial" w:cs="Arial"/>
-        </w:rPr>
-      </w:pPr>
-      <w:r>
-        <w:rPr>
-          <w:rFonts w:cs="Arial" w:ascii="Arial" w:hAnsi="Arial"/>
-        </w:rPr>
-        <w:t>Move the USB memory stick to a PC connected to the IBOS Office net.</w:t>
-      </w:r>
-    </w:p>
-    <w:p>
-      <w:pPr>
-        <w:pStyle w:val="Standard"/>
-        <w:bidi w:val="0"/>
-        <w:jc w:val="left"/>
-        <w:rPr>
-          <w:rFonts w:ascii="Arial" w:hAnsi="Arial" w:cs="Arial"/>
-        </w:rPr>
-      </w:pPr>
-      <w:r>
-        <w:rPr>
-          <w:rFonts w:cs="Arial" w:ascii="Arial" w:hAnsi="Arial"/>
-        </w:rPr>
-      </w:r>
-    </w:p>
-    <w:p>
-      <w:pPr>
-        <w:pStyle w:val="Standard"/>
-        <w:bidi w:val="0"/>
-        <w:jc w:val="left"/>
-        <w:rPr>
-          <w:rFonts w:ascii="Arial" w:hAnsi="Arial" w:cs="Arial"/>
-        </w:rPr>
-      </w:pPr>
-      <w:r>
-        <w:rPr>
-          <w:rFonts w:cs="Arial" w:ascii="Arial" w:hAnsi="Arial"/>
-        </w:rPr>
-        <w:t xml:space="preserve">Copy the whole directory "Version </w:t>
-      </w:r>
-      <w:r>
-        <w:rPr>
-          <w:rFonts w:cs="Arial" w:ascii="Arial" w:hAnsi="Arial"/>
-          <w:lang w:val="en-US"/>
-        </w:rPr>
-        <w:t>3</w:t>
-      </w:r>
-      <w:r>
-        <w:rPr>
-          <w:rFonts w:cs="Arial" w:ascii="Arial" w:hAnsi="Arial"/>
-        </w:rPr>
-        <w:t>.0.0.0" from the USB memory stick to</w:t>
-      </w:r>
-    </w:p>
-    <w:p>
-      <w:pPr>
-        <w:pStyle w:val="Standard"/>
-        <w:bidi w:val="0"/>
-        <w:jc w:val="left"/>
-        <w:rPr>
-          <w:rFonts w:ascii="Arial" w:hAnsi="Arial" w:cs="Arial"/>
-        </w:rPr>
-      </w:pPr>
-      <w:r>
-        <w:rPr>
-          <w:rFonts w:cs="Arial" w:ascii="Arial" w:hAnsi="Arial"/>
-        </w:rPr>
-      </w:r>
-    </w:p>
-    <w:p>
-      <w:pPr>
-        <w:pStyle w:val="Standard"/>
-        <w:widowControl/>
-        <w:suppressAutoHyphens w:val="true"/>
-        <w:bidi w:val="0"/>
-        <w:jc w:val="left"/>
-        <w:textAlignment w:val="baseline"/>
-        <w:rPr>
-          <w:rFonts w:ascii="Arial" w:hAnsi="Arial" w:cs="Arial"/>
-        </w:rPr>
-      </w:pPr>
-      <w:hyperlink r:id="rId3">
-        <w:r>
-          <w:rPr>
-            <w:rStyle w:val="Hyperlink"/>
-            <w:rFonts w:cs="Arial" w:ascii="Arial" w:hAnsi="Arial"/>
-          </w:rPr>
-          <w:t>O:\IBos</w:t>
-        </w:r>
-      </w:hyperlink>
-      <w:r>
-        <w:rPr>
-          <w:rFonts w:cs="Arial" w:ascii="Arial" w:hAnsi="Arial"/>
-        </w:rPr>
-        <w:t xml:space="preserve"> Nodelæser\</w:t>
+        <w:t>4</w:t>
+      </w:r>
+      <w:r>
+        <w:rPr>
+          <w:rFonts w:cs="Arial" w:ascii="Arial" w:hAnsi="Arial"/>
+        </w:rPr>
+        <w:t xml:space="preserve">.0.0.0" just created </w:t>
+      </w:r>
+      <w:r>
+        <w:rPr>
+          <w:rFonts w:cs="Arial" w:ascii="Arial" w:hAnsi="Arial"/>
+        </w:rPr>
+        <w:t>to</w:t>
+      </w:r>
+    </w:p>
+    <w:p>
+      <w:pPr>
+        <w:pStyle w:val="Standard"/>
+        <w:bidi w:val="0"/>
+        <w:jc w:val="left"/>
+        <w:rPr>
+          <w:rFonts w:ascii="Arial" w:hAnsi="Arial" w:cs="Arial"/>
+        </w:rPr>
+      </w:pPr>
+      <w:r>
+        <w:rPr>
+          <w:rFonts w:cs="Arial" w:ascii="Arial" w:hAnsi="Arial"/>
+        </w:rPr>
+      </w:r>
+    </w:p>
+    <w:p>
+      <w:pPr>
+        <w:pStyle w:val="Standard"/>
+        <w:bidi w:val="0"/>
+        <w:jc w:val="left"/>
+        <w:rPr/>
+      </w:pPr>
+      <w:r>
+        <w:rPr>
+          <w:rFonts w:cs="Arial" w:ascii="Arial" w:hAnsi="Arial"/>
+        </w:rPr>
+        <w:t>”</w:t>
+      </w:r>
+      <w:r>
+        <w:rPr>
+          <w:rFonts w:cs="Arial" w:ascii="Arial" w:hAnsi="Arial"/>
+        </w:rPr>
+        <w:t>C:\Users\Jens\Dropbox\Root\Arkiv for releasede versioner”</w:t>
+      </w:r>
+    </w:p>
+    <w:p>
+      <w:pPr>
+        <w:pStyle w:val="Standard"/>
+        <w:bidi w:val="0"/>
+        <w:jc w:val="left"/>
+        <w:rPr>
+          <w:rFonts w:ascii="Arial" w:hAnsi="Arial" w:cs="Arial"/>
+        </w:rPr>
+      </w:pPr>
+      <w:r>
+        <w:rPr>
+          <w:rFonts w:cs="Arial" w:ascii="Arial" w:hAnsi="Arial"/>
+        </w:rPr>
+      </w:r>
+    </w:p>
+    <w:p>
+      <w:pPr>
+        <w:pStyle w:val="Standard"/>
+        <w:bidi w:val="0"/>
+        <w:jc w:val="left"/>
+        <w:rPr/>
+      </w:pPr>
+      <w:r>
+        <w:rPr>
+          <w:rFonts w:cs="Arial" w:ascii="Arial" w:hAnsi="Arial"/>
+        </w:rPr>
+        <w:t xml:space="preserve">and to </w:t>
+      </w:r>
+      <w:r>
+        <w:rPr>
+          <w:rFonts w:cs="Arial" w:ascii="Arial" w:hAnsi="Arial"/>
+        </w:rPr>
+        <w:t>a U</w:t>
+      </w:r>
+      <w:r>
+        <w:rPr>
+          <w:rFonts w:cs="Arial" w:ascii="Arial" w:hAnsi="Arial"/>
+        </w:rPr>
+        <w:t>SB</w:t>
+      </w:r>
+      <w:r>
+        <w:rPr>
+          <w:rFonts w:cs="Arial" w:ascii="Arial" w:hAnsi="Arial"/>
+        </w:rPr>
+        <w:t xml:space="preserve"> memory stick</w:t>
+      </w:r>
+    </w:p>
+    <w:p>
+      <w:pPr>
+        <w:pStyle w:val="Standard"/>
+        <w:bidi w:val="0"/>
+        <w:jc w:val="left"/>
+        <w:rPr>
+          <w:rFonts w:ascii="Arial" w:hAnsi="Arial" w:cs="Arial"/>
+        </w:rPr>
+      </w:pPr>
+      <w:r>
+        <w:rPr/>
+      </w:r>
+    </w:p>
+    <w:p>
+      <w:pPr>
+        <w:pStyle w:val="Standard"/>
+        <w:bidi w:val="0"/>
+        <w:jc w:val="left"/>
+        <w:rPr>
+          <w:rFonts w:ascii="Arial" w:hAnsi="Arial" w:cs="Arial"/>
+        </w:rPr>
+      </w:pPr>
+      <w:r>
+        <w:rPr/>
+      </w:r>
+    </w:p>
+    <w:p>
+      <w:pPr>
+        <w:pStyle w:val="Standard"/>
+        <w:bidi w:val="0"/>
+        <w:jc w:val="left"/>
+        <w:rPr/>
+      </w:pPr>
+      <w:r>
+        <w:rPr>
+          <w:rFonts w:cs="Arial" w:ascii="Arial" w:hAnsi="Arial"/>
+        </w:rPr>
+        <w:t>Create a Dropbox link to the .zip file and save it in a .txt document just beside the .zip file</w:t>
+      </w:r>
+    </w:p>
+    <w:p>
+      <w:pPr>
+        <w:pStyle w:val="Standard"/>
+        <w:bidi w:val="0"/>
+        <w:jc w:val="left"/>
+        <w:rPr>
+          <w:rFonts w:ascii="Arial" w:hAnsi="Arial" w:cs="Arial"/>
+        </w:rPr>
+      </w:pPr>
+      <w:r>
+        <w:rPr>
+          <w:rFonts w:cs="Arial" w:ascii="Arial" w:hAnsi="Arial"/>
+        </w:rPr>
       </w:r>
     </w:p>
     <w:p>
@@ -4933,7 +4969,7 @@
         </w:rPr>
         <w:t xml:space="preserve">Se </w:t>
       </w:r>
-      <w:hyperlink r:id="rId4">
+      <w:hyperlink r:id="rId3">
         <w:r>
           <w:rPr>
             <w:rStyle w:val="Hyperlink"/>
@@ -5199,7 +5235,7 @@
       </w:r>
     </w:p>
     <w:sectPr>
-      <w:footerReference w:type="default" r:id="rId5"/>
+      <w:footerReference w:type="default" r:id="rId4"/>
       <w:type w:val="continuous"/>
       <w:pgSz w:w="11906" w:h="16838"/>
       <w:pgMar w:left="1134" w:right="1134" w:header="0" w:top="1134" w:footer="708" w:bottom="1134" w:gutter="0"/>
@@ -5220,9 +5256,7 @@
       <w:suppressLineNumbers/>
       <w:bidi w:val="0"/>
       <w:jc w:val="left"/>
-      <w:rPr>
-        <w:lang w:val="da-DK"/>
-      </w:rPr>
+      <w:rPr/>
     </w:pPr>
     <w:r>
       <w:rPr/>
@@ -5243,19 +5277,6 @@
     <w:r>
       <w:rPr/>
       <w:fldChar w:fldCharType="end"/>
-    </w:r>
-    <w:r>
-      <w:rPr>
-        <w:rFonts w:eastAsia="Liberation Serif" w:cs="Liberation Serif"/>
-        <w:lang w:val="da-DK"/>
-      </w:rPr>
-      <w:t xml:space="preserve"> </w:t>
-    </w:r>
-    <w:r>
-      <w:rPr>
-        <w:lang w:val="da-DK"/>
-      </w:rPr>
-      <w:t>3.0.0.0</w:t>
     </w:r>
   </w:p>
   <w:p>
@@ -5301,9 +5322,7 @@
       <w:suppressLineNumbers/>
       <w:bidi w:val="0"/>
       <w:jc w:val="left"/>
-      <w:rPr>
-        <w:lang w:val="da-DK"/>
-      </w:rPr>
+      <w:rPr/>
     </w:pPr>
     <w:r>
       <w:rPr/>
@@ -5324,19 +5343,6 @@
     <w:r>
       <w:rPr/>
       <w:fldChar w:fldCharType="end"/>
-    </w:r>
-    <w:r>
-      <w:rPr>
-        <w:rFonts w:eastAsia="Liberation Serif" w:cs="Liberation Serif"/>
-        <w:lang w:val="da-DK"/>
-      </w:rPr>
-      <w:t xml:space="preserve"> </w:t>
-    </w:r>
-    <w:r>
-      <w:rPr>
-        <w:lang w:val="da-DK"/>
-      </w:rPr>
-      <w:t>3.0.0.0</w:t>
     </w:r>
   </w:p>
   <w:p>
@@ -6410,6 +6416,20 @@
       <w:bCs/>
     </w:rPr>
   </w:style>
+  <w:style w:type="paragraph" w:styleId="Indholdsfortegnelseoverskrift">
+    <w:name w:val="TOA Heading"/>
+    <w:basedOn w:val="Overskrift"/>
+    <w:pPr>
+      <w:suppressLineNumbers/>
+      <w:ind w:left="0" w:hanging="0"/>
+    </w:pPr>
+    <w:rPr>
+      <w:b/>
+      <w:bCs/>
+      <w:sz w:val="32"/>
+      <w:szCs w:val="32"/>
+    </w:rPr>
+  </w:style>
   <w:style w:type="numbering" w:styleId="WW8Num1">
     <w:name w:val="WW8Num1"/>
     <w:qFormat/>

</xml_diff>

<commit_message>
Updates to the Release generation manual
</commit_message>
<xml_diff>
--- a/Documentation/Generering af release 4.0.0.0.docx
+++ b/Documentation/Generering af release 4.0.0.0.docx
@@ -12,7 +12,7 @@
       <w:sdtContent>
         <w:p>
           <w:pPr>
-            <w:pStyle w:val="Indholdsfortegnelseoverskrift"/>
+            <w:pStyle w:val="TOAHeading"/>
             <w:suppressLineNumbers/>
             <w:bidi w:val="0"/>
             <w:spacing w:before="240" w:after="120"/>
@@ -49,7 +49,7 @@
         </w:p>
         <w:p>
           <w:pPr>
-            <w:pStyle w:val="Indholdsfortegnelseoverskrift"/>
+            <w:pStyle w:val="TOAHeading"/>
             <w:suppressLineNumbers/>
             <w:ind w:left="0" w:hanging="0"/>
             <w:rPr>
@@ -74,7 +74,7 @@
           <w:pPr>
             <w:pStyle w:val="Indholdsfortegnelse1"/>
             <w:tabs>
-              <w:tab w:val="clear" w:pos="709"/>
+              <w:tab w:val="clear" w:pos="720"/>
               <w:tab w:val="right" w:pos="9638" w:leader="dot"/>
             </w:tabs>
             <w:rPr/>
@@ -109,7 +109,7 @@
           <w:pPr>
             <w:pStyle w:val="Indholdsfortegnelse1"/>
             <w:tabs>
-              <w:tab w:val="clear" w:pos="709"/>
+              <w:tab w:val="clear" w:pos="720"/>
               <w:tab w:val="right" w:pos="9638" w:leader="dot"/>
             </w:tabs>
             <w:rPr/>
@@ -129,7 +129,7 @@
           <w:pPr>
             <w:pStyle w:val="Indholdsfortegnelse1"/>
             <w:tabs>
-              <w:tab w:val="clear" w:pos="709"/>
+              <w:tab w:val="clear" w:pos="720"/>
               <w:tab w:val="right" w:pos="9638" w:leader="dot"/>
             </w:tabs>
             <w:rPr/>
@@ -149,7 +149,7 @@
           <w:pPr>
             <w:pStyle w:val="Indholdsfortegnelse1"/>
             <w:tabs>
-              <w:tab w:val="clear" w:pos="709"/>
+              <w:tab w:val="clear" w:pos="720"/>
               <w:tab w:val="right" w:pos="9638" w:leader="dot"/>
             </w:tabs>
             <w:rPr/>
@@ -169,7 +169,7 @@
           <w:pPr>
             <w:pStyle w:val="Indholdsfortegnelse1"/>
             <w:tabs>
-              <w:tab w:val="clear" w:pos="709"/>
+              <w:tab w:val="clear" w:pos="720"/>
               <w:tab w:val="right" w:pos="9638" w:leader="dot"/>
             </w:tabs>
             <w:rPr/>
@@ -189,7 +189,7 @@
           <w:pPr>
             <w:pStyle w:val="Indholdsfortegnelse1"/>
             <w:tabs>
-              <w:tab w:val="clear" w:pos="709"/>
+              <w:tab w:val="clear" w:pos="720"/>
               <w:tab w:val="right" w:pos="9638" w:leader="dot"/>
             </w:tabs>
             <w:rPr/>
@@ -209,7 +209,7 @@
           <w:pPr>
             <w:pStyle w:val="Indholdsfortegnelse1"/>
             <w:tabs>
-              <w:tab w:val="clear" w:pos="709"/>
+              <w:tab w:val="clear" w:pos="720"/>
               <w:tab w:val="right" w:pos="9638" w:leader="dot"/>
             </w:tabs>
             <w:rPr/>
@@ -229,7 +229,7 @@
           <w:pPr>
             <w:pStyle w:val="Indholdsfortegnelse1"/>
             <w:tabs>
-              <w:tab w:val="clear" w:pos="709"/>
+              <w:tab w:val="clear" w:pos="720"/>
               <w:tab w:val="right" w:pos="9638" w:leader="dot"/>
             </w:tabs>
             <w:rPr/>
@@ -249,7 +249,7 @@
           <w:pPr>
             <w:pStyle w:val="Indholdsfortegnelse1"/>
             <w:tabs>
-              <w:tab w:val="clear" w:pos="709"/>
+              <w:tab w:val="clear" w:pos="720"/>
               <w:tab w:val="right" w:pos="9638" w:leader="dot"/>
             </w:tabs>
             <w:rPr/>
@@ -269,7 +269,7 @@
           <w:pPr>
             <w:pStyle w:val="Indholdsfortegnelse1"/>
             <w:tabs>
-              <w:tab w:val="clear" w:pos="709"/>
+              <w:tab w:val="clear" w:pos="720"/>
               <w:tab w:val="right" w:pos="9638" w:leader="dot"/>
             </w:tabs>
             <w:rPr/>
@@ -289,7 +289,7 @@
           <w:pPr>
             <w:pStyle w:val="Indholdsfortegnelse1"/>
             <w:tabs>
-              <w:tab w:val="clear" w:pos="709"/>
+              <w:tab w:val="clear" w:pos="720"/>
               <w:tab w:val="right" w:pos="9638" w:leader="dot"/>
             </w:tabs>
             <w:rPr/>
@@ -513,19 +513,6 @@
         <w:rPr/>
       </w:pPr>
       <w:r>
-        <w:rPr/>
-      </w:r>
-    </w:p>
-    <w:p>
-      <w:pPr>
-        <w:pStyle w:val="Textbody"/>
-        <w:bidi w:val="0"/>
-        <w:jc w:val="left"/>
-        <w:rPr>
-          <w:lang w:val="da-DK"/>
-        </w:rPr>
-      </w:pPr>
-      <w:r>
         <w:rPr>
           <w:lang w:val="da-DK"/>
         </w:rPr>
@@ -684,13 +671,7 @@
         <w:rPr>
           <w:rFonts w:cs="Arial" w:ascii="Arial" w:hAnsi="Arial"/>
         </w:rPr>
-        <w:t>.0.0.0.doc</w:t>
-      </w:r>
-      <w:r>
-        <w:rPr>
-          <w:rFonts w:cs="Arial" w:ascii="Arial" w:hAnsi="Arial"/>
-        </w:rPr>
-        <w:t>x</w:t>
+        <w:t>.0.0.0.docx</w:t>
       </w:r>
     </w:p>
     <w:p>
@@ -721,13 +702,7 @@
         <w:rPr>
           <w:rFonts w:cs="Arial" w:ascii="Arial" w:hAnsi="Arial"/>
         </w:rPr>
-        <w:t>.0.0.0.doc</w:t>
-      </w:r>
-      <w:r>
-        <w:rPr>
-          <w:rFonts w:cs="Arial" w:ascii="Arial" w:hAnsi="Arial"/>
-        </w:rPr>
-        <w:t>x</w:t>
+        <w:t>.0.0.0.docx</w:t>
       </w:r>
     </w:p>
     <w:p>
@@ -752,33 +727,13 @@
           <w:rFonts w:cs="Arial" w:ascii="Arial" w:hAnsi="Arial"/>
           <w:lang w:val="da-DK"/>
         </w:rPr>
-        <w:t xml:space="preserve"> </w:t>
-      </w:r>
-      <w:r>
-        <w:rPr>
-          <w:rFonts w:cs="Arial" w:ascii="Arial" w:hAnsi="Arial"/>
-          <w:lang w:val="da-DK"/>
-        </w:rPr>
-        <w:t>4</w:t>
-      </w:r>
-      <w:r>
-        <w:rPr>
-          <w:rFonts w:cs="Arial" w:ascii="Arial" w:hAnsi="Arial"/>
-          <w:lang w:val="da-DK"/>
-        </w:rPr>
-        <w:t>.0.0.0.</w:t>
-      </w:r>
-      <w:r>
-        <w:rPr>
-          <w:rFonts w:cs="Arial" w:ascii="Arial" w:hAnsi="Arial"/>
-        </w:rPr>
-        <w:t>doc</w:t>
-      </w:r>
-      <w:r>
-        <w:rPr>
-          <w:rFonts w:cs="Arial" w:ascii="Arial" w:hAnsi="Arial"/>
-        </w:rPr>
-        <w:t>x</w:t>
+        <w:t xml:space="preserve"> 4.0.0.0.</w:t>
+      </w:r>
+      <w:r>
+        <w:rPr>
+          <w:rFonts w:cs="Arial" w:ascii="Arial" w:hAnsi="Arial"/>
+        </w:rPr>
+        <w:t>docx</w:t>
       </w:r>
       <w:r>
         <w:rPr>
@@ -838,13 +793,7 @@
         <w:rPr>
           <w:rFonts w:cs="Arial" w:ascii="Arial" w:hAnsi="Arial"/>
         </w:rPr>
-        <w:t>.0.0.0.doc</w:t>
-      </w:r>
-      <w:r>
-        <w:rPr>
-          <w:rFonts w:cs="Arial" w:ascii="Arial" w:hAnsi="Arial"/>
-        </w:rPr>
-        <w:t>x</w:t>
+        <w:t>.0.0.0.docx</w:t>
       </w:r>
     </w:p>
     <w:p>
@@ -875,13 +824,7 @@
         <w:rPr>
           <w:rFonts w:cs="Arial" w:ascii="Arial" w:hAnsi="Arial"/>
         </w:rPr>
-        <w:t>.0.0.0.doc</w:t>
-      </w:r>
-      <w:r>
-        <w:rPr>
-          <w:rFonts w:cs="Arial" w:ascii="Arial" w:hAnsi="Arial"/>
-        </w:rPr>
-        <w:t>x</w:t>
+        <w:t>.0.0.0.docx</w:t>
       </w:r>
     </w:p>
     <w:p>
@@ -912,13 +855,49 @@
         <w:rPr>
           <w:rFonts w:cs="Arial" w:ascii="Arial" w:hAnsi="Arial"/>
         </w:rPr>
-        <w:t>.0.0.0.doc</w:t>
-      </w:r>
-      <w:r>
-        <w:rPr>
-          <w:rFonts w:cs="Arial" w:ascii="Arial" w:hAnsi="Arial"/>
-        </w:rPr>
-        <w:t>x</w:t>
+        <w:t>.0.0.0.docx</w:t>
+      </w:r>
+    </w:p>
+    <w:p>
+      <w:pPr>
+        <w:pStyle w:val="Standard"/>
+        <w:numPr>
+          <w:ilvl w:val="0"/>
+          <w:numId w:val="6"/>
+        </w:numPr>
+        <w:bidi w:val="0"/>
+        <w:jc w:val="left"/>
+        <w:rPr>
+          <w:b/>
+          <w:b/>
+          <w:bCs/>
+        </w:rPr>
+      </w:pPr>
+      <w:r>
+        <w:rPr>
+          <w:rFonts w:cs="Arial" w:ascii="Arial" w:hAnsi="Arial"/>
+          <w:b/>
+          <w:bCs/>
+        </w:rPr>
+        <w:t>Hollandsk sprog</w:t>
+      </w:r>
+    </w:p>
+    <w:p>
+      <w:pPr>
+        <w:pStyle w:val="Standard"/>
+        <w:numPr>
+          <w:ilvl w:val="0"/>
+          <w:numId w:val="6"/>
+        </w:numPr>
+        <w:bidi w:val="0"/>
+        <w:jc w:val="left"/>
+        <w:rPr/>
+      </w:pPr>
+      <w:r>
+        <w:rPr>
+          <w:rFonts w:cs="Arial" w:ascii="Arial" w:hAnsi="Arial"/>
+        </w:rPr>
+        <w:t>Gebruikershandleiding voor IBOS XML muzieklezer versie 4.0.0.0</w:t>
       </w:r>
     </w:p>
     <w:p>
@@ -937,6 +916,43 @@
           <w:rFonts w:cs="Arial" w:ascii="Arial" w:hAnsi="Arial"/>
           <w:lang w:val="da-DK"/>
         </w:rPr>
+      </w:r>
+    </w:p>
+    <w:p>
+      <w:pPr>
+        <w:pStyle w:val="Standard"/>
+        <w:bidi w:val="0"/>
+        <w:ind w:left="720" w:hanging="0"/>
+        <w:jc w:val="left"/>
+        <w:rPr>
+          <w:rFonts w:ascii="Arial" w:hAnsi="Arial" w:cs="Arial"/>
+          <w:lang w:val="da-DK"/>
+        </w:rPr>
+      </w:pPr>
+      <w:r>
+        <w:rPr>
+          <w:rFonts w:cs="Arial" w:ascii="Arial" w:hAnsi="Arial"/>
+          <w:lang w:val="da-DK"/>
+        </w:rPr>
+      </w:r>
+    </w:p>
+    <w:p>
+      <w:pPr>
+        <w:pStyle w:val="Standard"/>
+        <w:bidi w:val="0"/>
+        <w:ind w:left="720" w:hanging="0"/>
+        <w:jc w:val="left"/>
+        <w:rPr>
+          <w:rFonts w:ascii="Arial" w:hAnsi="Arial" w:cs="Arial"/>
+          <w:lang w:val="da-DK"/>
+        </w:rPr>
+      </w:pPr>
+      <w:r>
+        <w:rPr>
+          <w:rFonts w:cs="Arial" w:ascii="Arial" w:hAnsi="Arial"/>
+          <w:lang w:val="da-DK"/>
+        </w:rPr>
+        <w:t>Der findes endnu ikke Installationsvejledning og Release Notes på hollandsk.</w:t>
       </w:r>
       <w:r>
         <w:br w:type="page"/>
@@ -1024,81 +1040,106 @@
           <w:color w:val="FF0000"/>
           <w:lang w:val="da-DK"/>
         </w:rPr>
-        <w:t>Baggrundsviden, som ikke er en del af processen:</w:t>
-      </w:r>
-    </w:p>
-    <w:p>
-      <w:pPr>
-        <w:pStyle w:val="Textbody"/>
-        <w:bidi w:val="0"/>
-        <w:jc w:val="left"/>
-        <w:rPr>
-          <w:rFonts w:ascii="Arial" w:hAnsi="Arial" w:cs="Arial"/>
+        <w:t xml:space="preserve">Baggrundsviden, som ikke er en del af </w:t>
+      </w:r>
+      <w:r>
+        <w:rPr>
           <w:color w:val="FF0000"/>
           <w:lang w:val="da-DK"/>
         </w:rPr>
-      </w:pPr>
+        <w:t xml:space="preserve">selve </w:t>
+      </w:r>
       <w:r>
         <w:rPr>
           <w:color w:val="FF0000"/>
           <w:lang w:val="da-DK"/>
         </w:rPr>
-        <w:t xml:space="preserve">Når brugeren aktiverer ”Vis Brugervejledning” under Hjælp søger programmet efter de relevante dokumenter under </w:t>
-      </w:r>
-      <w:r>
-        <w:rPr>
-          <w:rFonts w:cs="Arial" w:ascii="Arial" w:hAnsi="Arial"/>
-          <w:color w:val="FF0000"/>
-        </w:rPr>
-        <w:t>MusicXmlReaderUI\</w:t>
-      </w:r>
-      <w:r>
-        <w:rPr>
-          <w:rFonts w:cs="Arial" w:ascii="Arial" w:hAnsi="Arial"/>
+        <w:t>processen:</w:t>
+      </w:r>
+    </w:p>
+    <w:p>
+      <w:pPr>
+        <w:pStyle w:val="Textbody"/>
+        <w:bidi w:val="0"/>
+        <w:jc w:val="left"/>
+        <w:rPr>
+          <w:rFonts w:ascii="Arial" w:hAnsi="Arial" w:cs="Arial"/>
           <w:color w:val="FF0000"/>
           <w:lang w:val="da-DK"/>
         </w:rPr>
-        <w:t xml:space="preserve"> </w:t>
-      </w:r>
-      <w:r>
-        <w:rPr>
-          <w:rFonts w:cs="Arial" w:ascii="Arial" w:hAnsi="Arial"/>
-          <w:color w:val="FF0000"/>
-        </w:rPr>
-        <w:t>MusicXmlReader\bin\Debug\Documentation</w:t>
-      </w:r>
-      <w:r>
-        <w:rPr>
-          <w:rFonts w:cs="Arial" w:ascii="Arial" w:hAnsi="Arial"/>
+      </w:pPr>
+      <w:r>
+        <w:rPr>
           <w:color w:val="FF0000"/>
           <w:lang w:val="da-DK"/>
         </w:rPr>
-        <w:t>\</w:t>
-      </w:r>
-    </w:p>
-    <w:p>
-      <w:pPr>
-        <w:pStyle w:val="Textbody"/>
-        <w:bidi w:val="0"/>
-        <w:jc w:val="left"/>
-        <w:rPr>
+        <w:t xml:space="preserve">Når brugeren aktiverer ”Vis Brugervejledning” under Hjælp søger programmet efter de relevante dokumenter under </w:t>
+      </w:r>
+      <w:r>
+        <w:rPr>
+          <w:rFonts w:cs="Arial" w:ascii="Arial" w:hAnsi="Arial"/>
+          <w:color w:val="FF0000"/>
+        </w:rPr>
+        <w:t>MusicXmlReaderUI\</w:t>
+      </w:r>
+      <w:r>
+        <w:rPr>
+          <w:rFonts w:cs="Arial" w:ascii="Arial" w:hAnsi="Arial"/>
           <w:color w:val="FF0000"/>
           <w:lang w:val="da-DK"/>
         </w:rPr>
-      </w:pPr>
-      <w:r>
-        <w:rPr>
+        <w:t xml:space="preserve"> </w:t>
+      </w:r>
+      <w:r>
+        <w:rPr>
+          <w:rFonts w:cs="Arial" w:ascii="Arial" w:hAnsi="Arial"/>
+          <w:color w:val="FF0000"/>
+        </w:rPr>
+        <w:t>MusicXmlReader\bin\Debug\Documentation</w:t>
+      </w:r>
+      <w:r>
+        <w:rPr>
+          <w:rFonts w:cs="Arial" w:ascii="Arial" w:hAnsi="Arial"/>
           <w:color w:val="FF0000"/>
           <w:lang w:val="da-DK"/>
         </w:rPr>
+        <w:t>\</w:t>
+      </w:r>
+    </w:p>
+    <w:p>
+      <w:pPr>
+        <w:pStyle w:val="Textbody"/>
+        <w:bidi w:val="0"/>
+        <w:jc w:val="left"/>
+        <w:rPr/>
+      </w:pPr>
+      <w:r>
+        <w:rPr>
+          <w:color w:val="FF0000"/>
+          <w:lang w:val="da-DK"/>
+        </w:rPr>
         <w:t>Både navnet på underdirectoriet og navnet på dokumentationsfilen er lokaliseret til henholdsvis:</w:t>
+      </w:r>
+    </w:p>
+    <w:p>
+      <w:pPr>
+        <w:pStyle w:val="Textbody"/>
+        <w:bidi w:val="0"/>
+        <w:jc w:val="left"/>
+        <w:rPr>
+          <w:color w:val="FF0000"/>
+          <w:lang w:val="da-DK"/>
+        </w:rPr>
+      </w:pPr>
+      <w:r>
+        <w:rPr/>
       </w:r>
     </w:p>
     <w:tbl>
       <w:tblPr>
-        <w:tblW w:w="9788" w:type="dxa"/>
-        <w:jc w:val="left"/>
-        <w:tblInd w:w="-113" w:type="dxa"/>
+        <w:tblW w:w="9300" w:type="dxa"/>
+        <w:jc w:val="left"/>
+        <w:tblInd w:w="126" w:type="dxa"/>
         <w:tblCellMar>
           <w:top w:w="0" w:type="dxa"/>
           <w:left w:w="108" w:type="dxa"/>
@@ -1107,15 +1148,15 @@
         </w:tblCellMar>
       </w:tblPr>
       <w:tblGrid>
-        <w:gridCol w:w="1242"/>
-        <w:gridCol w:w="1818"/>
-        <w:gridCol w:w="6728"/>
+        <w:gridCol w:w="1005"/>
+        <w:gridCol w:w="1815"/>
+        <w:gridCol w:w="6480"/>
       </w:tblGrid>
       <w:tr>
         <w:trPr/>
         <w:tc>
           <w:tcPr>
-            <w:tcW w:w="1242" w:type="dxa"/>
+            <w:tcW w:w="1005" w:type="dxa"/>
             <w:tcBorders>
               <w:top w:val="single" w:sz="4" w:space="0" w:color="000000"/>
               <w:left w:val="single" w:sz="4" w:space="0" w:color="000000"/>
@@ -1145,7 +1186,7 @@
         </w:tc>
         <w:tc>
           <w:tcPr>
-            <w:tcW w:w="1818" w:type="dxa"/>
+            <w:tcW w:w="1815" w:type="dxa"/>
             <w:tcBorders>
               <w:top w:val="single" w:sz="4" w:space="0" w:color="000000"/>
               <w:left w:val="single" w:sz="4" w:space="0" w:color="000000"/>
@@ -1175,7 +1216,7 @@
         </w:tc>
         <w:tc>
           <w:tcPr>
-            <w:tcW w:w="6728" w:type="dxa"/>
+            <w:tcW w:w="6480" w:type="dxa"/>
             <w:tcBorders>
               <w:top w:val="single" w:sz="4" w:space="0" w:color="000000"/>
               <w:left w:val="single" w:sz="4" w:space="0" w:color="000000"/>
@@ -1209,7 +1250,7 @@
         <w:trPr/>
         <w:tc>
           <w:tcPr>
-            <w:tcW w:w="1242" w:type="dxa"/>
+            <w:tcW w:w="1005" w:type="dxa"/>
             <w:tcBorders>
               <w:top w:val="single" w:sz="4" w:space="0" w:color="000000"/>
               <w:left w:val="single" w:sz="4" w:space="0" w:color="000000"/>
@@ -1239,7 +1280,7 @@
         </w:tc>
         <w:tc>
           <w:tcPr>
-            <w:tcW w:w="1818" w:type="dxa"/>
+            <w:tcW w:w="1815" w:type="dxa"/>
             <w:tcBorders>
               <w:top w:val="single" w:sz="4" w:space="0" w:color="000000"/>
               <w:left w:val="single" w:sz="4" w:space="0" w:color="000000"/>
@@ -1269,7 +1310,7 @@
         </w:tc>
         <w:tc>
           <w:tcPr>
-            <w:tcW w:w="6728" w:type="dxa"/>
+            <w:tcW w:w="6480" w:type="dxa"/>
             <w:tcBorders>
               <w:top w:val="single" w:sz="4" w:space="0" w:color="000000"/>
               <w:left w:val="single" w:sz="4" w:space="0" w:color="000000"/>
@@ -1291,14 +1332,7 @@
                 <w:color w:val="FF0000"/>
                 <w:lang w:val="da-DK"/>
               </w:rPr>
-              <w:t>Brugervejledning for IBOS Nodelæser version*.doc</w:t>
-            </w:r>
-            <w:r>
-              <w:rPr>
-                <w:color w:val="FF0000"/>
-                <w:lang w:val="da-DK"/>
-              </w:rPr>
-              <w:t>x</w:t>
+              <w:t>Brugervejledning for IBOS Nodelæser version*.docx</w:t>
             </w:r>
           </w:p>
         </w:tc>
@@ -1307,7 +1341,7 @@
         <w:trPr/>
         <w:tc>
           <w:tcPr>
-            <w:tcW w:w="1242" w:type="dxa"/>
+            <w:tcW w:w="1005" w:type="dxa"/>
             <w:tcBorders>
               <w:top w:val="single" w:sz="4" w:space="0" w:color="000000"/>
               <w:left w:val="single" w:sz="4" w:space="0" w:color="000000"/>
@@ -1337,7 +1371,7 @@
         </w:tc>
         <w:tc>
           <w:tcPr>
-            <w:tcW w:w="1818" w:type="dxa"/>
+            <w:tcW w:w="1815" w:type="dxa"/>
             <w:tcBorders>
               <w:top w:val="single" w:sz="4" w:space="0" w:color="000000"/>
               <w:left w:val="single" w:sz="4" w:space="0" w:color="000000"/>
@@ -1358,20 +1392,13 @@
                 <w:color w:val="FF0000"/>
                 <w:lang w:val="da-DK"/>
               </w:rPr>
-              <w:t>e</w:t>
-            </w:r>
-            <w:r>
-              <w:rPr>
-                <w:color w:val="FF0000"/>
-                <w:lang w:val="da-DK"/>
-              </w:rPr>
-              <w:t>n-US</w:t>
+              <w:t>en-US</w:t>
             </w:r>
           </w:p>
         </w:tc>
         <w:tc>
           <w:tcPr>
-            <w:tcW w:w="6728" w:type="dxa"/>
+            <w:tcW w:w="6480" w:type="dxa"/>
             <w:tcBorders>
               <w:top w:val="single" w:sz="4" w:space="0" w:color="000000"/>
               <w:left w:val="single" w:sz="4" w:space="0" w:color="000000"/>
@@ -1393,14 +1420,7 @@
                 <w:color w:val="FF0000"/>
                 <w:lang w:val="en-US"/>
               </w:rPr>
-              <w:t>User's manual for IBOS MusicXmlReader version*.doc</w:t>
-            </w:r>
-            <w:r>
-              <w:rPr>
-                <w:color w:val="FF0000"/>
-                <w:lang w:val="en-US"/>
-              </w:rPr>
-              <w:t>x</w:t>
+              <w:t>User's manual for IBOS MusicXmlReader version*.docx</w:t>
             </w:r>
           </w:p>
         </w:tc>
@@ -1409,7 +1429,7 @@
         <w:trPr/>
         <w:tc>
           <w:tcPr>
-            <w:tcW w:w="1242" w:type="dxa"/>
+            <w:tcW w:w="1005" w:type="dxa"/>
             <w:tcBorders>
               <w:left w:val="single" w:sz="4" w:space="0" w:color="000000"/>
               <w:bottom w:val="single" w:sz="4" w:space="0" w:color="000000"/>
@@ -1436,7 +1456,7 @@
         </w:tc>
         <w:tc>
           <w:tcPr>
-            <w:tcW w:w="1818" w:type="dxa"/>
+            <w:tcW w:w="1815" w:type="dxa"/>
             <w:tcBorders>
               <w:left w:val="single" w:sz="4" w:space="0" w:color="000000"/>
               <w:bottom w:val="single" w:sz="4" w:space="0" w:color="000000"/>
@@ -1463,7 +1483,7 @@
         </w:tc>
         <w:tc>
           <w:tcPr>
-            <w:tcW w:w="6728" w:type="dxa"/>
+            <w:tcW w:w="6480" w:type="dxa"/>
             <w:tcBorders>
               <w:left w:val="single" w:sz="4" w:space="0" w:color="000000"/>
               <w:bottom w:val="single" w:sz="4" w:space="0" w:color="000000"/>
@@ -1496,28 +1516,28 @@
         <w:pStyle w:val="Textbody"/>
         <w:bidi w:val="0"/>
         <w:jc w:val="left"/>
-        <w:rPr/>
-      </w:pPr>
-      <w:r>
         <w:rPr>
           <w:color w:val="FF0000"/>
           <w:lang w:val="da-DK"/>
         </w:rPr>
-        <w:t>Bemærk at ”Filnavn” ikke indeholder versionsn</w:t>
-      </w:r>
+      </w:pPr>
+      <w:r>
+        <w:rPr/>
+      </w:r>
+    </w:p>
+    <w:p>
+      <w:pPr>
+        <w:pStyle w:val="Textbody"/>
+        <w:bidi w:val="0"/>
+        <w:jc w:val="left"/>
+        <w:rPr/>
+      </w:pPr>
       <w:r>
         <w:rPr>
           <w:color w:val="FF0000"/>
           <w:lang w:val="da-DK"/>
         </w:rPr>
-        <w:t>ummer</w:t>
-      </w:r>
-      <w:r>
-        <w:rPr>
-          <w:color w:val="FF0000"/>
-          <w:lang w:val="da-DK"/>
-        </w:rPr>
-        <w:t>, men en stjerne, som i denne sammenhæng betyder ”hvad som helst” så det er ikke nødvendigt at ændre i programmet bare fordi brugervejledningen skifter versionsnummer.</w:t>
+        <w:t>Bemærk at ”Filnavn” ikke indeholder versionsnummer, men en stjerne, som i denne sammenhæng betyder ”hvad som helst” så det er ikke nødvendigt at ændre i programmet bare fordi brugervejledningen skifter versionsnummer.</w:t>
       </w:r>
     </w:p>
     <w:p>
@@ -1553,31 +1573,7 @@
         <w:rPr>
           <w:rFonts w:cs="Arial" w:ascii="Arial" w:hAnsi="Arial"/>
         </w:rPr>
-        <w:t>Kopi</w:t>
-      </w:r>
-      <w:r>
-        <w:rPr>
-          <w:rFonts w:cs="Arial" w:ascii="Arial" w:hAnsi="Arial"/>
-        </w:rPr>
-        <w:t>é</w:t>
-      </w:r>
-      <w:r>
-        <w:rPr>
-          <w:rFonts w:cs="Arial" w:ascii="Arial" w:hAnsi="Arial"/>
-        </w:rPr>
-        <w:t>r brugervejledninger til h</w:t>
-      </w:r>
-      <w:r>
-        <w:rPr>
-          <w:rFonts w:cs="Arial" w:ascii="Arial" w:hAnsi="Arial"/>
-        </w:rPr>
-        <w:t>enholdsvis</w:t>
-      </w:r>
-      <w:r>
-        <w:rPr>
-          <w:rFonts w:cs="Arial" w:ascii="Arial" w:hAnsi="Arial"/>
-        </w:rPr>
-        <w:t xml:space="preserve"> </w:t>
+        <w:t xml:space="preserve">Kopiér brugervejledninger til henholdsvis </w:t>
       </w:r>
       <w:r>
         <w:rPr>
@@ -1612,14 +1608,7 @@
           <w:rFonts w:cs="Arial" w:ascii="Arial" w:hAnsi="Arial"/>
           <w:lang w:val="da-DK"/>
         </w:rPr>
-        <w:t xml:space="preserve"> </w:t>
-      </w:r>
-      <w:r>
-        <w:rPr>
-          <w:rFonts w:cs="Arial" w:ascii="Arial" w:hAnsi="Arial"/>
-          <w:lang w:val="da-DK"/>
-        </w:rPr>
-        <w:t xml:space="preserve">og </w:t>
+        <w:t xml:space="preserve"> og </w:t>
       </w:r>
       <w:r>
         <w:rPr>
@@ -1704,22 +1693,6 @@
           <w:lang w:val="da-DK"/>
         </w:rPr>
         <w:t>så de bliver tilgængelige fra det installerede program.</w:t>
-      </w:r>
-    </w:p>
-    <w:p>
-      <w:pPr>
-        <w:pStyle w:val="Standard"/>
-        <w:bidi w:val="0"/>
-        <w:ind w:left="720" w:hanging="0"/>
-        <w:jc w:val="left"/>
-        <w:rPr/>
-      </w:pPr>
-      <w:r>
-        <w:rPr>
-          <w:rFonts w:cs="Arial" w:ascii="Arial" w:hAnsi="Arial"/>
-          <w:lang w:val="da-DK"/>
-        </w:rPr>
-        <w:t>Under nl-NL anbringes den engelsksprogede User’s manual, men renamet til det hollandske navn, så den uden videre kan udskiftes senere i en eksisterende hollandsk installation.</w:t>
       </w:r>
     </w:p>
     <w:p>
@@ -1752,17 +1725,28 @@
         </w:numPr>
         <w:bidi w:val="0"/>
         <w:jc w:val="left"/>
-        <w:rPr>
-          <w:rFonts w:ascii="Arial" w:hAnsi="Arial" w:cs="Arial"/>
+        <w:rPr/>
+      </w:pPr>
+      <w:r>
+        <w:rPr>
+          <w:rFonts w:cs="Arial" w:ascii="Arial" w:hAnsi="Arial"/>
           <w:lang w:val="da-DK"/>
         </w:rPr>
-      </w:pPr>
+        <w:t>Fjern eventuelle gamle dokumentationsfiler ”</w:t>
+      </w:r>
       <w:r>
         <w:rPr>
           <w:rFonts w:cs="Arial" w:ascii="Arial" w:hAnsi="Arial"/>
           <w:lang w:val="da-DK"/>
         </w:rPr>
-        <w:t>Fjern eventuelle gamle dokumentationsfiler ”2.0.0.0” sammesteds.</w:t>
+        <w:t>3</w:t>
+      </w:r>
+      <w:r>
+        <w:rPr>
+          <w:rFonts w:cs="Arial" w:ascii="Arial" w:hAnsi="Arial"/>
+          <w:lang w:val="da-DK"/>
+        </w:rPr>
+        <w:t>.0.0.0” sammesteds.</w:t>
       </w:r>
     </w:p>
     <w:p>
@@ -1774,34 +1758,82 @@
         </w:numPr>
         <w:bidi w:val="0"/>
         <w:jc w:val="left"/>
-        <w:rPr>
-          <w:rFonts w:ascii="Arial" w:hAnsi="Arial" w:cs="Arial"/>
+        <w:rPr/>
+      </w:pPr>
+      <w:r>
+        <w:rPr>
+          <w:rFonts w:cs="Arial" w:ascii="Arial" w:hAnsi="Arial"/>
           <w:lang w:val="da-DK"/>
         </w:rPr>
-      </w:pPr>
+        <w:t xml:space="preserve">Check at dokumentationsfilerne er tilgængelige fra Hjælp under applikationen. </w:t>
+      </w:r>
       <w:r>
         <w:rPr>
           <w:rFonts w:cs="Arial" w:ascii="Arial" w:hAnsi="Arial"/>
           <w:lang w:val="da-DK"/>
         </w:rPr>
-        <w:t>Check at dokumentationsfilerne er tilgængelige fra Hjælp under applikationen.</w:t>
-      </w:r>
-    </w:p>
-    <w:p>
-      <w:pPr>
-        <w:pStyle w:val="Standard"/>
-        <w:bidi w:val="0"/>
-        <w:jc w:val="left"/>
-        <w:rPr>
-          <w:rFonts w:ascii="Arial" w:hAnsi="Arial" w:cs="Arial"/>
+        <w:t xml:space="preserve">Dette skal gælde for alle 3 sprog. </w:t>
+      </w:r>
+      <w:r>
+        <w:rPr>
+          <w:rFonts w:cs="Arial" w:ascii="Arial" w:hAnsi="Arial"/>
+          <w:color w:val="000000"/>
+          <w:sz w:val="24"/>
+          <w:szCs w:val="24"/>
           <w:lang w:val="da-DK"/>
         </w:rPr>
-      </w:pPr>
-      <w:r>
-        <w:rPr>
-          <w:rFonts w:cs="Arial" w:ascii="Arial" w:hAnsi="Arial"/>
+        <w:t xml:space="preserve">Brug </w:t>
+      </w:r>
+      <w:r>
+        <w:rPr>
+          <w:rFonts w:cs="Arial" w:ascii="Arial" w:hAnsi="Arial"/>
+          <w:color w:val="000000"/>
+          <w:sz w:val="24"/>
+          <w:szCs w:val="24"/>
           <w:lang w:val="da-DK"/>
         </w:rPr>
+        <w:t xml:space="preserve">"DeveloperCulture" i </w:t>
+      </w:r>
+      <w:r>
+        <w:rPr>
+          <w:rFonts w:cs="Arial" w:ascii="Arial" w:hAnsi="Arial"/>
+          <w:color w:val="000000"/>
+          <w:sz w:val="24"/>
+          <w:szCs w:val="24"/>
+          <w:lang w:val="da-DK"/>
+        </w:rPr>
+        <w:t xml:space="preserve">app.config </w:t>
+      </w:r>
+    </w:p>
+    <w:p>
+      <w:pPr>
+        <w:pStyle w:val="Standard"/>
+        <w:bidi w:val="0"/>
+        <w:jc w:val="left"/>
+        <w:rPr>
+          <w:rFonts w:ascii="Arial" w:hAnsi="Arial" w:cs="Arial"/>
+          <w:lang w:val="da-DK"/>
+        </w:rPr>
+      </w:pPr>
+      <w:r>
+        <w:rPr/>
+      </w:r>
+    </w:p>
+    <w:p>
+      <w:pPr>
+        <w:pStyle w:val="Standard"/>
+        <w:bidi w:val="0"/>
+        <w:jc w:val="left"/>
+        <w:rPr>
+          <w:rFonts w:ascii="Arial" w:hAnsi="Arial" w:cs="Arial"/>
+          <w:lang w:val="da-DK"/>
+        </w:rPr>
+      </w:pPr>
+      <w:r>
+        <w:rPr>
+          <w:rFonts w:cs="Arial" w:ascii="Arial" w:hAnsi="Arial"/>
+          <w:lang w:val="da-DK"/>
+        </w:rPr>
       </w:r>
     </w:p>
     <w:p>
@@ -1819,6 +1851,39 @@
     </w:p>
     <w:p>
       <w:pPr>
+        <w:pStyle w:val="Overskrift1"/>
+        <w:rPr/>
+      </w:pPr>
+      <w:r>
+        <w:rPr/>
+        <w:t xml:space="preserve">Fjern </w:t>
+      </w:r>
+      <w:r>
+        <w:rPr/>
+        <w:t>eventuelle DropBox filer af typen ”...modstridende kopi...”</w:t>
+      </w:r>
+    </w:p>
+    <w:p>
+      <w:pPr>
+        <w:pStyle w:val="Textbody"/>
+        <w:rPr/>
+      </w:pPr>
+      <w:r>
+        <w:rPr/>
+      </w:r>
+    </w:p>
+    <w:p>
+      <w:pPr>
+        <w:pStyle w:val="Textbody"/>
+        <w:rPr/>
+      </w:pPr>
+      <w:r>
+        <w:rPr/>
+        <w:t>Disse filer kan findes ved hjælp af værktøjet ”ReleaseTools” i MusicXmlReaderUI solutionen, men skal for en sikkerheds skyld slettes manuelt.</w:t>
+      </w:r>
+    </w:p>
+    <w:p>
+      <w:pPr>
         <w:pStyle w:val="Normal"/>
         <w:rPr>
           <w:lang w:val="da-DK" w:eastAsia="da-DK" w:bidi="da-DK"/>
@@ -1845,22 +1910,9 @@
     </w:p>
     <w:p>
       <w:pPr>
-        <w:pStyle w:val="Normal"/>
-        <w:rPr>
-          <w:lang w:val="da-DK" w:eastAsia="da-DK" w:bidi="da-DK"/>
-        </w:rPr>
-      </w:pPr>
-      <w:r>
-        <w:rPr>
-          <w:lang w:val="da-DK" w:eastAsia="da-DK" w:bidi="da-DK"/>
-        </w:rPr>
-      </w:r>
-    </w:p>
-    <w:p>
-      <w:pPr>
         <w:pStyle w:val="Standard"/>
         <w:tabs>
-          <w:tab w:val="clear" w:pos="709"/>
+          <w:tab w:val="clear" w:pos="720"/>
           <w:tab w:val="left" w:pos="1575" w:leader="none"/>
         </w:tabs>
         <w:bidi w:val="0"/>
@@ -2014,6 +2066,19 @@
         </w:rPr>
       </w:pPr>
       <w:r>
+        <w:rPr/>
+      </w:r>
+    </w:p>
+    <w:p>
+      <w:pPr>
+        <w:pStyle w:val="Standard"/>
+        <w:bidi w:val="0"/>
+        <w:jc w:val="left"/>
+        <w:rPr>
+          <w:rFonts w:ascii="Arial" w:hAnsi="Arial" w:cs="Arial"/>
+        </w:rPr>
+      </w:pPr>
+      <w:r>
         <w:rPr>
           <w:rFonts w:cs="Arial" w:ascii="Arial" w:hAnsi="Arial"/>
         </w:rPr>
@@ -2029,9 +2094,7 @@
         </w:numPr>
         <w:bidi w:val="0"/>
         <w:jc w:val="left"/>
-        <w:rPr>
-          <w:rFonts w:ascii="Arial" w:hAnsi="Arial" w:cs="Arial"/>
-        </w:rPr>
+        <w:rPr/>
       </w:pPr>
       <w:r>
         <w:rPr>
@@ -2043,6 +2106,817 @@
     <w:p>
       <w:pPr>
         <w:pStyle w:val="Standard"/>
+        <w:numPr>
+          <w:ilvl w:val="0"/>
+          <w:numId w:val="0"/>
+        </w:numPr>
+        <w:bidi w:val="0"/>
+        <w:ind w:left="720" w:hanging="0"/>
+        <w:jc w:val="left"/>
+        <w:rPr>
+          <w:rFonts w:ascii="Arial" w:hAnsi="Arial" w:cs="Arial"/>
+        </w:rPr>
+      </w:pPr>
+      <w:r>
+        <w:rPr/>
+      </w:r>
+    </w:p>
+    <w:p>
+      <w:pPr>
+        <w:pStyle w:val="Standard"/>
+        <w:bidi w:val="0"/>
+        <w:jc w:val="left"/>
+        <w:rPr/>
+      </w:pPr>
+      <w:r>
+        <w:rPr>
+          <w:rFonts w:cs="Arial" w:ascii="Arial" w:hAnsi="Arial"/>
+        </w:rPr>
+        <w:t>I App.config sæt</w:t>
+      </w:r>
+    </w:p>
+    <w:p>
+      <w:pPr>
+        <w:pStyle w:val="Standard"/>
+        <w:bidi w:val="0"/>
+        <w:jc w:val="left"/>
+        <w:rPr>
+          <w:rFonts w:ascii="Arial" w:hAnsi="Arial" w:cs="Arial"/>
+        </w:rPr>
+      </w:pPr>
+      <w:r>
+        <w:rPr/>
+      </w:r>
+    </w:p>
+    <w:tbl>
+      <w:tblPr>
+        <w:tblW w:w="9638" w:type="dxa"/>
+        <w:jc w:val="left"/>
+        <w:tblInd w:w="0" w:type="dxa"/>
+        <w:tblCellMar>
+          <w:top w:w="55" w:type="dxa"/>
+          <w:left w:w="55" w:type="dxa"/>
+          <w:bottom w:w="55" w:type="dxa"/>
+          <w:right w:w="55" w:type="dxa"/>
+        </w:tblCellMar>
+      </w:tblPr>
+      <w:tblGrid>
+        <w:gridCol w:w="9638"/>
+      </w:tblGrid>
+      <w:tr>
+        <w:trPr/>
+        <w:tc>
+          <w:tcPr>
+            <w:tcW w:w="9638" w:type="dxa"/>
+            <w:tcBorders>
+              <w:top w:val="single" w:sz="4" w:space="0" w:color="000000"/>
+              <w:left w:val="single" w:sz="4" w:space="0" w:color="000000"/>
+              <w:bottom w:val="single" w:sz="4" w:space="0" w:color="000000"/>
+            </w:tcBorders>
+            <w:shd w:fill="auto" w:val="clear"/>
+          </w:tcPr>
+          <w:p>
+            <w:pPr>
+              <w:pStyle w:val="Normal"/>
+              <w:jc w:val="left"/>
+              <w:rPr>
+                <w:rFonts w:ascii="Liberation Serif" w:hAnsi="Liberation Serif"/>
+                <w:b w:val="false"/>
+                <w:b w:val="false"/>
+                <w:bCs w:val="false"/>
+                <w:i w:val="false"/>
+                <w:i w:val="false"/>
+                <w:iCs w:val="false"/>
+                <w:strike w:val="false"/>
+                <w:dstrike w:val="false"/>
+                <w:outline w:val="false"/>
+                <w:shadow w:val="false"/>
+                <w:color w:val="000000"/>
+                <w:sz w:val="24"/>
+                <w:szCs w:val="24"/>
+                <w:u w:val="none"/>
+              </w:rPr>
+            </w:pPr>
+            <w:r>
+              <w:rPr>
+                <w:rFonts w:ascii="Consolas" w:hAnsi="Consolas"/>
+                <w:b w:val="false"/>
+                <w:bCs w:val="false"/>
+                <w:i w:val="false"/>
+                <w:iCs w:val="false"/>
+                <w:strike w:val="false"/>
+                <w:dstrike w:val="false"/>
+                <w:outline w:val="false"/>
+                <w:shadow w:val="false"/>
+                <w:color w:val="0000FF"/>
+                <w:sz w:val="19"/>
+                <w:szCs w:val="24"/>
+                <w:u w:val="none"/>
+              </w:rPr>
+              <w:t xml:space="preserve">    </w:t>
+            </w:r>
+            <w:r>
+              <w:rPr>
+                <w:rFonts w:ascii="Consolas" w:hAnsi="Consolas"/>
+                <w:b w:val="false"/>
+                <w:bCs w:val="false"/>
+                <w:i w:val="false"/>
+                <w:iCs w:val="false"/>
+                <w:strike w:val="false"/>
+                <w:dstrike w:val="false"/>
+                <w:outline w:val="false"/>
+                <w:shadow w:val="false"/>
+                <w:color w:val="0000FF"/>
+                <w:sz w:val="19"/>
+                <w:szCs w:val="24"/>
+                <w:u w:val="none"/>
+              </w:rPr>
+              <w:t>&lt;</w:t>
+            </w:r>
+            <w:r>
+              <w:rPr>
+                <w:rFonts w:ascii="Consolas" w:hAnsi="Consolas"/>
+                <w:b w:val="false"/>
+                <w:bCs w:val="false"/>
+                <w:i w:val="false"/>
+                <w:iCs w:val="false"/>
+                <w:strike w:val="false"/>
+                <w:dstrike w:val="false"/>
+                <w:outline w:val="false"/>
+                <w:shadow w:val="false"/>
+                <w:color w:val="A31515"/>
+                <w:sz w:val="19"/>
+                <w:szCs w:val="24"/>
+                <w:u w:val="none"/>
+              </w:rPr>
+              <w:t>appSettings</w:t>
+            </w:r>
+            <w:r>
+              <w:rPr>
+                <w:rFonts w:ascii="Consolas" w:hAnsi="Consolas"/>
+                <w:b w:val="false"/>
+                <w:bCs w:val="false"/>
+                <w:i w:val="false"/>
+                <w:iCs w:val="false"/>
+                <w:strike w:val="false"/>
+                <w:dstrike w:val="false"/>
+                <w:outline w:val="false"/>
+                <w:shadow w:val="false"/>
+                <w:color w:val="0000FF"/>
+                <w:sz w:val="19"/>
+                <w:szCs w:val="24"/>
+                <w:u w:val="none"/>
+              </w:rPr>
+              <w:t>&gt;</w:t>
+            </w:r>
+          </w:p>
+          <w:p>
+            <w:pPr>
+              <w:pStyle w:val="Normal"/>
+              <w:rPr/>
+            </w:pPr>
+            <w:r>
+              <w:rPr>
+                <w:rFonts w:ascii="Consolas" w:hAnsi="Consolas"/>
+                <w:color w:val="0000FF"/>
+                <w:sz w:val="19"/>
+              </w:rPr>
+              <w:t xml:space="preserve">      </w:t>
+            </w:r>
+            <w:r>
+              <w:rPr>
+                <w:rFonts w:ascii="Consolas" w:hAnsi="Consolas"/>
+                <w:color w:val="0000FF"/>
+                <w:sz w:val="19"/>
+              </w:rPr>
+              <w:t>&lt;!--</w:t>
+            </w:r>
+            <w:r>
+              <w:rPr>
+                <w:rFonts w:ascii="Consolas" w:hAnsi="Consolas"/>
+                <w:color w:val="008000"/>
+                <w:sz w:val="19"/>
+              </w:rPr>
+              <w:t xml:space="preserve"> &lt;add key="DeveloperCulture" value="sv-SE" /&gt; </w:t>
+            </w:r>
+            <w:r>
+              <w:rPr>
+                <w:rFonts w:ascii="Consolas" w:hAnsi="Consolas"/>
+                <w:color w:val="0000FF"/>
+                <w:sz w:val="19"/>
+              </w:rPr>
+              <w:t>--&gt;</w:t>
+            </w:r>
+          </w:p>
+          <w:p>
+            <w:pPr>
+              <w:pStyle w:val="Normal"/>
+              <w:rPr/>
+            </w:pPr>
+            <w:r>
+              <w:rPr>
+                <w:rFonts w:ascii="Consolas" w:hAnsi="Consolas"/>
+                <w:color w:val="0000FF"/>
+                <w:sz w:val="19"/>
+              </w:rPr>
+              <w:t xml:space="preserve">      </w:t>
+            </w:r>
+            <w:r>
+              <w:rPr>
+                <w:rFonts w:ascii="Consolas" w:hAnsi="Consolas"/>
+                <w:color w:val="0000FF"/>
+                <w:sz w:val="19"/>
+              </w:rPr>
+              <w:t>&lt;!--</w:t>
+            </w:r>
+            <w:r>
+              <w:rPr>
+                <w:rFonts w:ascii="Consolas" w:hAnsi="Consolas"/>
+                <w:color w:val="008000"/>
+                <w:sz w:val="19"/>
+              </w:rPr>
+              <w:t xml:space="preserve"> &lt;add key="DeveloperCulture" value="en-US" /&gt; </w:t>
+            </w:r>
+            <w:r>
+              <w:rPr>
+                <w:rFonts w:ascii="Consolas" w:hAnsi="Consolas"/>
+                <w:color w:val="0000FF"/>
+                <w:sz w:val="19"/>
+              </w:rPr>
+              <w:t>--&gt;</w:t>
+            </w:r>
+          </w:p>
+          <w:p>
+            <w:pPr>
+              <w:pStyle w:val="Normal"/>
+              <w:rPr/>
+            </w:pPr>
+            <w:r>
+              <w:rPr>
+                <w:rFonts w:ascii="Consolas" w:hAnsi="Consolas"/>
+                <w:color w:val="0000FF"/>
+                <w:sz w:val="19"/>
+              </w:rPr>
+              <w:t xml:space="preserve">      </w:t>
+            </w:r>
+            <w:r>
+              <w:rPr>
+                <w:rFonts w:ascii="Consolas" w:hAnsi="Consolas"/>
+                <w:color w:val="0000FF"/>
+                <w:sz w:val="19"/>
+              </w:rPr>
+              <w:t>&lt;!--</w:t>
+            </w:r>
+            <w:r>
+              <w:rPr>
+                <w:rFonts w:ascii="Consolas" w:hAnsi="Consolas"/>
+                <w:color w:val="008000"/>
+                <w:sz w:val="19"/>
+              </w:rPr>
+              <w:t xml:space="preserve"> &lt;add key="DeveloperCulture" value="nl-NL" /&gt; </w:t>
+            </w:r>
+            <w:r>
+              <w:rPr>
+                <w:rFonts w:ascii="Consolas" w:hAnsi="Consolas"/>
+                <w:color w:val="0000FF"/>
+                <w:sz w:val="19"/>
+              </w:rPr>
+              <w:t>--&gt;</w:t>
+            </w:r>
+          </w:p>
+          <w:p>
+            <w:pPr>
+              <w:pStyle w:val="Normal"/>
+              <w:rPr/>
+            </w:pPr>
+            <w:r>
+              <w:rPr>
+                <w:rFonts w:ascii="Consolas" w:hAnsi="Consolas"/>
+                <w:color w:val="0000FF"/>
+                <w:sz w:val="19"/>
+              </w:rPr>
+              <w:t xml:space="preserve">      </w:t>
+            </w:r>
+            <w:r>
+              <w:rPr>
+                <w:rFonts w:ascii="Consolas" w:hAnsi="Consolas"/>
+                <w:color w:val="0000FF"/>
+                <w:sz w:val="19"/>
+              </w:rPr>
+              <w:t>&lt;</w:t>
+            </w:r>
+            <w:r>
+              <w:rPr>
+                <w:rFonts w:ascii="Consolas" w:hAnsi="Consolas"/>
+                <w:color w:val="A31515"/>
+                <w:sz w:val="19"/>
+              </w:rPr>
+              <w:t>add</w:t>
+            </w:r>
+            <w:r>
+              <w:rPr>
+                <w:rFonts w:ascii="Consolas" w:hAnsi="Consolas"/>
+                <w:color w:val="0000FF"/>
+                <w:sz w:val="19"/>
+              </w:rPr>
+              <w:t xml:space="preserve"> </w:t>
+            </w:r>
+            <w:r>
+              <w:rPr>
+                <w:rFonts w:ascii="Consolas" w:hAnsi="Consolas"/>
+                <w:color w:val="FF0000"/>
+                <w:sz w:val="19"/>
+              </w:rPr>
+              <w:t>key</w:t>
+            </w:r>
+            <w:r>
+              <w:rPr>
+                <w:rFonts w:ascii="Consolas" w:hAnsi="Consolas"/>
+                <w:color w:val="0000FF"/>
+                <w:sz w:val="19"/>
+              </w:rPr>
+              <w:t>=</w:t>
+            </w:r>
+            <w:r>
+              <w:rPr>
+                <w:rFonts w:ascii="Consolas" w:hAnsi="Consolas"/>
+                <w:color w:val="000000"/>
+                <w:sz w:val="19"/>
+              </w:rPr>
+              <w:t>"</w:t>
+            </w:r>
+            <w:r>
+              <w:rPr>
+                <w:rFonts w:ascii="Consolas" w:hAnsi="Consolas"/>
+                <w:color w:val="0000FF"/>
+                <w:sz w:val="19"/>
+              </w:rPr>
+              <w:t>DeveloperMode</w:t>
+            </w:r>
+            <w:r>
+              <w:rPr>
+                <w:rFonts w:ascii="Consolas" w:hAnsi="Consolas"/>
+                <w:color w:val="000000"/>
+                <w:sz w:val="19"/>
+              </w:rPr>
+              <w:t>"</w:t>
+            </w:r>
+            <w:r>
+              <w:rPr>
+                <w:rFonts w:ascii="Consolas" w:hAnsi="Consolas"/>
+                <w:color w:val="0000FF"/>
+                <w:sz w:val="19"/>
+              </w:rPr>
+              <w:t xml:space="preserve"> </w:t>
+            </w:r>
+            <w:r>
+              <w:rPr>
+                <w:rFonts w:ascii="Consolas" w:hAnsi="Consolas"/>
+                <w:color w:val="FF0000"/>
+                <w:sz w:val="19"/>
+              </w:rPr>
+              <w:t>value</w:t>
+            </w:r>
+            <w:r>
+              <w:rPr>
+                <w:rFonts w:ascii="Consolas" w:hAnsi="Consolas"/>
+                <w:color w:val="0000FF"/>
+                <w:sz w:val="19"/>
+              </w:rPr>
+              <w:t>=</w:t>
+            </w:r>
+            <w:r>
+              <w:rPr>
+                <w:rFonts w:ascii="Consolas" w:hAnsi="Consolas"/>
+                <w:color w:val="000000"/>
+                <w:sz w:val="19"/>
+              </w:rPr>
+              <w:t>"</w:t>
+            </w:r>
+            <w:r>
+              <w:rPr>
+                <w:rFonts w:ascii="Consolas" w:hAnsi="Consolas"/>
+                <w:color w:val="0000FF"/>
+                <w:sz w:val="19"/>
+              </w:rPr>
+              <w:t>no</w:t>
+            </w:r>
+            <w:r>
+              <w:rPr>
+                <w:rFonts w:ascii="Consolas" w:hAnsi="Consolas"/>
+                <w:color w:val="000000"/>
+                <w:sz w:val="19"/>
+              </w:rPr>
+              <w:t>"</w:t>
+            </w:r>
+            <w:r>
+              <w:rPr>
+                <w:rFonts w:ascii="Consolas" w:hAnsi="Consolas"/>
+                <w:color w:val="0000FF"/>
+                <w:sz w:val="19"/>
+              </w:rPr>
+              <w:t xml:space="preserve"> /&gt;</w:t>
+            </w:r>
+          </w:p>
+          <w:p>
+            <w:pPr>
+              <w:pStyle w:val="Normal"/>
+              <w:rPr/>
+            </w:pPr>
+            <w:r>
+              <w:rPr>
+                <w:rFonts w:ascii="Consolas" w:hAnsi="Consolas"/>
+                <w:color w:val="0000FF"/>
+                <w:sz w:val="19"/>
+              </w:rPr>
+              <w:t xml:space="preserve">      </w:t>
+            </w:r>
+            <w:r>
+              <w:rPr>
+                <w:rFonts w:ascii="Consolas" w:hAnsi="Consolas"/>
+                <w:color w:val="0000FF"/>
+                <w:sz w:val="19"/>
+              </w:rPr>
+              <w:t>&lt;</w:t>
+            </w:r>
+            <w:r>
+              <w:rPr>
+                <w:rFonts w:ascii="Consolas" w:hAnsi="Consolas"/>
+                <w:color w:val="A31515"/>
+                <w:sz w:val="19"/>
+              </w:rPr>
+              <w:t>add</w:t>
+            </w:r>
+            <w:r>
+              <w:rPr>
+                <w:rFonts w:ascii="Consolas" w:hAnsi="Consolas"/>
+                <w:color w:val="0000FF"/>
+                <w:sz w:val="19"/>
+              </w:rPr>
+              <w:t xml:space="preserve"> </w:t>
+            </w:r>
+            <w:r>
+              <w:rPr>
+                <w:rFonts w:ascii="Consolas" w:hAnsi="Consolas"/>
+                <w:color w:val="FF0000"/>
+                <w:sz w:val="19"/>
+              </w:rPr>
+              <w:t>key</w:t>
+            </w:r>
+            <w:r>
+              <w:rPr>
+                <w:rFonts w:ascii="Consolas" w:hAnsi="Consolas"/>
+                <w:color w:val="0000FF"/>
+                <w:sz w:val="19"/>
+              </w:rPr>
+              <w:t>=</w:t>
+            </w:r>
+            <w:r>
+              <w:rPr>
+                <w:rFonts w:ascii="Consolas" w:hAnsi="Consolas"/>
+                <w:color w:val="000000"/>
+                <w:sz w:val="19"/>
+              </w:rPr>
+              <w:t>"</w:t>
+            </w:r>
+            <w:r>
+              <w:rPr>
+                <w:rFonts w:ascii="Consolas" w:hAnsi="Consolas"/>
+                <w:color w:val="0000FF"/>
+                <w:sz w:val="19"/>
+              </w:rPr>
+              <w:t>ExperimentalCode</w:t>
+            </w:r>
+            <w:r>
+              <w:rPr>
+                <w:rFonts w:ascii="Consolas" w:hAnsi="Consolas"/>
+                <w:color w:val="000000"/>
+                <w:sz w:val="19"/>
+              </w:rPr>
+              <w:t>"</w:t>
+            </w:r>
+            <w:r>
+              <w:rPr>
+                <w:rFonts w:ascii="Consolas" w:hAnsi="Consolas"/>
+                <w:color w:val="0000FF"/>
+                <w:sz w:val="19"/>
+              </w:rPr>
+              <w:t xml:space="preserve"> </w:t>
+            </w:r>
+            <w:r>
+              <w:rPr>
+                <w:rFonts w:ascii="Consolas" w:hAnsi="Consolas"/>
+                <w:color w:val="FF0000"/>
+                <w:sz w:val="19"/>
+              </w:rPr>
+              <w:t>value</w:t>
+            </w:r>
+            <w:r>
+              <w:rPr>
+                <w:rFonts w:ascii="Consolas" w:hAnsi="Consolas"/>
+                <w:color w:val="0000FF"/>
+                <w:sz w:val="19"/>
+              </w:rPr>
+              <w:t>=</w:t>
+            </w:r>
+            <w:r>
+              <w:rPr>
+                <w:rFonts w:ascii="Consolas" w:hAnsi="Consolas"/>
+                <w:color w:val="000000"/>
+                <w:sz w:val="19"/>
+              </w:rPr>
+              <w:t>"</w:t>
+            </w:r>
+            <w:r>
+              <w:rPr>
+                <w:rFonts w:ascii="Consolas" w:hAnsi="Consolas"/>
+                <w:color w:val="0000FF"/>
+                <w:sz w:val="19"/>
+              </w:rPr>
+              <w:t>no</w:t>
+            </w:r>
+            <w:r>
+              <w:rPr>
+                <w:rFonts w:ascii="Consolas" w:hAnsi="Consolas"/>
+                <w:color w:val="000000"/>
+                <w:sz w:val="19"/>
+              </w:rPr>
+              <w:t>"</w:t>
+            </w:r>
+            <w:r>
+              <w:rPr>
+                <w:rFonts w:ascii="Consolas" w:hAnsi="Consolas"/>
+                <w:color w:val="0000FF"/>
+                <w:sz w:val="19"/>
+              </w:rPr>
+              <w:t xml:space="preserve"> /&gt;</w:t>
+            </w:r>
+          </w:p>
+          <w:p>
+            <w:pPr>
+              <w:pStyle w:val="Normal"/>
+              <w:rPr/>
+            </w:pPr>
+            <w:r>
+              <w:rPr>
+                <w:rFonts w:ascii="Consolas" w:hAnsi="Consolas"/>
+                <w:color w:val="0000FF"/>
+                <w:sz w:val="19"/>
+              </w:rPr>
+              <w:t xml:space="preserve">      </w:t>
+            </w:r>
+            <w:r>
+              <w:rPr>
+                <w:rFonts w:ascii="Consolas" w:hAnsi="Consolas"/>
+                <w:color w:val="0000FF"/>
+                <w:sz w:val="19"/>
+              </w:rPr>
+              <w:t>&lt;</w:t>
+            </w:r>
+            <w:r>
+              <w:rPr>
+                <w:rFonts w:ascii="Consolas" w:hAnsi="Consolas"/>
+                <w:color w:val="A31515"/>
+                <w:sz w:val="19"/>
+              </w:rPr>
+              <w:t>add</w:t>
+            </w:r>
+            <w:r>
+              <w:rPr>
+                <w:rFonts w:ascii="Consolas" w:hAnsi="Consolas"/>
+                <w:color w:val="0000FF"/>
+                <w:sz w:val="19"/>
+              </w:rPr>
+              <w:t xml:space="preserve"> </w:t>
+            </w:r>
+            <w:r>
+              <w:rPr>
+                <w:rFonts w:ascii="Consolas" w:hAnsi="Consolas"/>
+                <w:color w:val="FF0000"/>
+                <w:sz w:val="19"/>
+              </w:rPr>
+              <w:t>key</w:t>
+            </w:r>
+            <w:r>
+              <w:rPr>
+                <w:rFonts w:ascii="Consolas" w:hAnsi="Consolas"/>
+                <w:color w:val="0000FF"/>
+                <w:sz w:val="19"/>
+              </w:rPr>
+              <w:t>=</w:t>
+            </w:r>
+            <w:r>
+              <w:rPr>
+                <w:rFonts w:ascii="Consolas" w:hAnsi="Consolas"/>
+                <w:color w:val="000000"/>
+                <w:sz w:val="19"/>
+              </w:rPr>
+              <w:t>"</w:t>
+            </w:r>
+            <w:r>
+              <w:rPr>
+                <w:rFonts w:ascii="Consolas" w:hAnsi="Consolas"/>
+                <w:color w:val="0000FF"/>
+                <w:sz w:val="19"/>
+              </w:rPr>
+              <w:t>HandleGraphics</w:t>
+            </w:r>
+            <w:r>
+              <w:rPr>
+                <w:rFonts w:ascii="Consolas" w:hAnsi="Consolas"/>
+                <w:color w:val="000000"/>
+                <w:sz w:val="19"/>
+              </w:rPr>
+              <w:t>"</w:t>
+            </w:r>
+            <w:r>
+              <w:rPr>
+                <w:rFonts w:ascii="Consolas" w:hAnsi="Consolas"/>
+                <w:color w:val="0000FF"/>
+                <w:sz w:val="19"/>
+              </w:rPr>
+              <w:t xml:space="preserve"> </w:t>
+            </w:r>
+            <w:r>
+              <w:rPr>
+                <w:rFonts w:ascii="Consolas" w:hAnsi="Consolas"/>
+                <w:color w:val="FF0000"/>
+                <w:sz w:val="19"/>
+              </w:rPr>
+              <w:t>value</w:t>
+            </w:r>
+            <w:r>
+              <w:rPr>
+                <w:rFonts w:ascii="Consolas" w:hAnsi="Consolas"/>
+                <w:color w:val="0000FF"/>
+                <w:sz w:val="19"/>
+              </w:rPr>
+              <w:t>=</w:t>
+            </w:r>
+            <w:r>
+              <w:rPr>
+                <w:rFonts w:ascii="Consolas" w:hAnsi="Consolas"/>
+                <w:color w:val="000000"/>
+                <w:sz w:val="19"/>
+              </w:rPr>
+              <w:t>"</w:t>
+            </w:r>
+            <w:r>
+              <w:rPr>
+                <w:rFonts w:ascii="Consolas" w:hAnsi="Consolas"/>
+                <w:color w:val="0000FF"/>
+                <w:sz w:val="19"/>
+              </w:rPr>
+              <w:t>no</w:t>
+            </w:r>
+            <w:r>
+              <w:rPr>
+                <w:rFonts w:ascii="Consolas" w:hAnsi="Consolas"/>
+                <w:color w:val="000000"/>
+                <w:sz w:val="19"/>
+              </w:rPr>
+              <w:t>"</w:t>
+            </w:r>
+            <w:r>
+              <w:rPr>
+                <w:rFonts w:ascii="Consolas" w:hAnsi="Consolas"/>
+                <w:color w:val="0000FF"/>
+                <w:sz w:val="19"/>
+              </w:rPr>
+              <w:t xml:space="preserve"> /&gt;</w:t>
+            </w:r>
+          </w:p>
+          <w:p>
+            <w:pPr>
+              <w:pStyle w:val="Normal"/>
+              <w:jc w:val="left"/>
+              <w:rPr>
+                <w:rFonts w:ascii="Liberation Serif" w:hAnsi="Liberation Serif"/>
+                <w:b w:val="false"/>
+                <w:b w:val="false"/>
+                <w:bCs w:val="false"/>
+                <w:i w:val="false"/>
+                <w:i w:val="false"/>
+                <w:iCs w:val="false"/>
+                <w:strike w:val="false"/>
+                <w:dstrike w:val="false"/>
+                <w:outline w:val="false"/>
+                <w:shadow w:val="false"/>
+                <w:color w:val="000000"/>
+                <w:sz w:val="24"/>
+                <w:szCs w:val="24"/>
+                <w:u w:val="none"/>
+              </w:rPr>
+            </w:pPr>
+            <w:r>
+              <w:rPr>
+                <w:rFonts w:ascii="Consolas" w:hAnsi="Consolas"/>
+                <w:b w:val="false"/>
+                <w:bCs w:val="false"/>
+                <w:i w:val="false"/>
+                <w:iCs w:val="false"/>
+                <w:strike w:val="false"/>
+                <w:dstrike w:val="false"/>
+                <w:outline w:val="false"/>
+                <w:shadow w:val="false"/>
+                <w:color w:val="0000FF"/>
+                <w:sz w:val="19"/>
+                <w:szCs w:val="24"/>
+                <w:u w:val="none"/>
+              </w:rPr>
+              <w:t xml:space="preserve">    </w:t>
+            </w:r>
+            <w:r>
+              <w:rPr>
+                <w:rFonts w:ascii="Consolas" w:hAnsi="Consolas"/>
+                <w:b w:val="false"/>
+                <w:bCs w:val="false"/>
+                <w:i w:val="false"/>
+                <w:iCs w:val="false"/>
+                <w:strike w:val="false"/>
+                <w:dstrike w:val="false"/>
+                <w:outline w:val="false"/>
+                <w:shadow w:val="false"/>
+                <w:color w:val="0000FF"/>
+                <w:sz w:val="19"/>
+                <w:szCs w:val="24"/>
+                <w:u w:val="none"/>
+              </w:rPr>
+              <w:t>&lt;/</w:t>
+            </w:r>
+            <w:r>
+              <w:rPr>
+                <w:rFonts w:ascii="Consolas" w:hAnsi="Consolas"/>
+                <w:b w:val="false"/>
+                <w:bCs w:val="false"/>
+                <w:i w:val="false"/>
+                <w:iCs w:val="false"/>
+                <w:strike w:val="false"/>
+                <w:dstrike w:val="false"/>
+                <w:outline w:val="false"/>
+                <w:shadow w:val="false"/>
+                <w:color w:val="A31515"/>
+                <w:sz w:val="19"/>
+                <w:szCs w:val="24"/>
+                <w:u w:val="none"/>
+              </w:rPr>
+              <w:t>appSettings</w:t>
+            </w:r>
+            <w:r>
+              <w:rPr>
+                <w:rFonts w:ascii="Consolas" w:hAnsi="Consolas"/>
+                <w:b w:val="false"/>
+                <w:bCs w:val="false"/>
+                <w:i w:val="false"/>
+                <w:iCs w:val="false"/>
+                <w:strike w:val="false"/>
+                <w:dstrike w:val="false"/>
+                <w:outline w:val="false"/>
+                <w:shadow w:val="false"/>
+                <w:color w:val="0000FF"/>
+                <w:sz w:val="19"/>
+                <w:szCs w:val="24"/>
+                <w:u w:val="none"/>
+              </w:rPr>
+              <w:t>&gt;</w:t>
+            </w:r>
+          </w:p>
+        </w:tc>
+      </w:tr>
+    </w:tbl>
+    <w:p>
+      <w:pPr>
+        <w:pStyle w:val="Standard"/>
+        <w:bidi w:val="0"/>
+        <w:jc w:val="left"/>
+        <w:rPr>
+          <w:rFonts w:ascii="Arial" w:hAnsi="Arial" w:cs="Arial"/>
+        </w:rPr>
+      </w:pPr>
+      <w:r>
+        <w:rPr/>
+      </w:r>
+    </w:p>
+    <w:p>
+      <w:pPr>
+        <w:pStyle w:val="Standard"/>
+        <w:bidi w:val="0"/>
+        <w:jc w:val="left"/>
+        <w:rPr>
+          <w:rFonts w:ascii="Arial" w:hAnsi="Arial" w:cs="Arial"/>
+        </w:rPr>
+      </w:pPr>
+      <w:r>
+        <w:rPr/>
+      </w:r>
+    </w:p>
+    <w:p>
+      <w:pPr>
+        <w:pStyle w:val="Standard"/>
+        <w:numPr>
+          <w:ilvl w:val="0"/>
+          <w:numId w:val="7"/>
+        </w:numPr>
         <w:bidi w:val="0"/>
         <w:jc w:val="left"/>
         <w:rPr>
@@ -2059,6 +2933,10 @@
     <w:p>
       <w:pPr>
         <w:pStyle w:val="Standard"/>
+        <w:numPr>
+          <w:ilvl w:val="0"/>
+          <w:numId w:val="7"/>
+        </w:numPr>
         <w:bidi w:val="0"/>
         <w:jc w:val="left"/>
         <w:rPr>
@@ -2075,6 +2953,10 @@
     <w:p>
       <w:pPr>
         <w:pStyle w:val="Standard"/>
+        <w:numPr>
+          <w:ilvl w:val="0"/>
+          <w:numId w:val="7"/>
+        </w:numPr>
         <w:bidi w:val="0"/>
         <w:jc w:val="left"/>
         <w:rPr>
@@ -2410,7 +3292,27 @@
           <w:rFonts w:cs="Arial" w:ascii="Arial" w:hAnsi="Arial"/>
           <w:lang w:val="en-US"/>
         </w:rPr>
-        <w:t xml:space="preserve"> </w:t>
+        <w:t xml:space="preserve"> 4.0.0.0</w:t>
+      </w:r>
+      <w:r>
+        <w:rPr>
+          <w:rFonts w:cs="Arial" w:ascii="Arial" w:hAnsi="Arial"/>
+        </w:rPr>
+        <w:t>.exe"</w:t>
+      </w:r>
+    </w:p>
+    <w:p>
+      <w:pPr>
+        <w:pStyle w:val="Standard"/>
+        <w:bidi w:val="0"/>
+        <w:jc w:val="left"/>
+        <w:rPr/>
+      </w:pPr>
+      <w:r>
+        <w:rPr>
+          <w:rFonts w:cs="Arial" w:ascii="Arial" w:hAnsi="Arial"/>
+        </w:rPr>
+        <w:t xml:space="preserve">Product Name = "IBOS MusicXmlReader"   Version = </w:t>
       </w:r>
       <w:r>
         <w:rPr>
@@ -2422,68 +3324,22 @@
       <w:r>
         <w:rPr>
           <w:rFonts w:cs="Arial" w:ascii="Arial" w:hAnsi="Arial"/>
-          <w:lang w:val="en-US"/>
         </w:rPr>
         <w:t>.0.0.0</w:t>
       </w:r>
-      <w:r>
-        <w:rPr>
-          <w:rFonts w:cs="Arial" w:ascii="Arial" w:hAnsi="Arial"/>
-        </w:rPr>
-        <w:t>.exe"</w:t>
-      </w:r>
-    </w:p>
-    <w:p>
-      <w:pPr>
-        <w:pStyle w:val="Standard"/>
-        <w:bidi w:val="0"/>
-        <w:jc w:val="left"/>
-        <w:rPr/>
-      </w:pPr>
-      <w:r>
-        <w:rPr>
-          <w:rFonts w:cs="Arial" w:ascii="Arial" w:hAnsi="Arial"/>
-        </w:rPr>
-        <w:t xml:space="preserve">Product Name = "IBOS MusicXmlReader"   Version = </w:t>
-      </w:r>
-      <w:r>
-        <w:rPr>
-          <w:rFonts w:cs="Arial" w:ascii="Arial" w:hAnsi="Arial"/>
-          <w:lang w:val="en-US"/>
-        </w:rPr>
-        <w:t>4</w:t>
-      </w:r>
-      <w:r>
-        <w:rPr>
-          <w:rFonts w:cs="Arial" w:ascii="Arial" w:hAnsi="Arial"/>
-        </w:rPr>
-        <w:t>.0.0.0</w:t>
-      </w:r>
-    </w:p>
-    <w:p>
-      <w:pPr>
-        <w:pStyle w:val="Standard"/>
-        <w:bidi w:val="0"/>
-        <w:jc w:val="left"/>
-        <w:rPr/>
-      </w:pPr>
-      <w:r>
-        <w:rPr>
-          <w:rFonts w:cs="Arial" w:ascii="Arial" w:hAnsi="Arial"/>
-        </w:rPr>
-        <w:t xml:space="preserve">Company </w:t>
-      </w:r>
-      <w:r>
-        <w:rPr>
-          <w:rFonts w:cs="Arial" w:ascii="Arial" w:hAnsi="Arial"/>
-        </w:rPr>
-        <w:t>N</w:t>
-      </w:r>
-      <w:r>
-        <w:rPr>
-          <w:rFonts w:cs="Arial" w:ascii="Arial" w:hAnsi="Arial"/>
-        </w:rPr>
-        <w:t>ame = IBOS</w:t>
+    </w:p>
+    <w:p>
+      <w:pPr>
+        <w:pStyle w:val="Standard"/>
+        <w:bidi w:val="0"/>
+        <w:jc w:val="left"/>
+        <w:rPr/>
+      </w:pPr>
+      <w:r>
+        <w:rPr>
+          <w:rFonts w:cs="Arial" w:ascii="Arial" w:hAnsi="Arial"/>
+        </w:rPr>
+        <w:t>Company Name = IBOS</w:t>
       </w:r>
     </w:p>
     <w:p>
@@ -2590,43 +3446,7 @@
         <w:rPr>
           <w:rFonts w:cs="Arial" w:ascii="Arial" w:hAnsi="Arial"/>
         </w:rPr>
-        <w:t>I</w:t>
-      </w:r>
-      <w:r>
-        <w:rPr>
-          <w:rFonts w:cs="Arial" w:ascii="Arial" w:hAnsi="Arial"/>
-        </w:rPr>
-        <w:t>f</w:t>
-      </w:r>
-      <w:r>
-        <w:rPr>
-          <w:rFonts w:cs="Arial" w:ascii="Arial" w:hAnsi="Arial"/>
-        </w:rPr>
-        <w:t xml:space="preserve"> </w:t>
-      </w:r>
-      <w:r>
-        <w:rPr>
-          <w:rFonts w:cs="Arial" w:ascii="Arial" w:hAnsi="Arial"/>
-        </w:rPr>
-        <w:t>a</w:t>
-      </w:r>
-      <w:r>
-        <w:rPr>
-          <w:rFonts w:cs="Arial" w:ascii="Arial" w:hAnsi="Arial"/>
-        </w:rPr>
-        <w:t xml:space="preserve">n error </w:t>
-      </w:r>
-      <w:r>
-        <w:rPr>
-          <w:rFonts w:cs="Arial" w:ascii="Arial" w:hAnsi="Arial"/>
-        </w:rPr>
-        <w:t>o</w:t>
-      </w:r>
-      <w:r>
-        <w:rPr>
-          <w:rFonts w:cs="Arial" w:ascii="Arial" w:hAnsi="Arial"/>
-        </w:rPr>
-        <w:t>ccurs "Cannot open because in use by another process" just click "Try Again"</w:t>
+        <w:t>If an error occurs "Cannot open because in use by another process" just click "Try Again"</w:t>
       </w:r>
     </w:p>
     <w:p>
@@ -2794,9 +3614,7 @@
         <w:pStyle w:val="Standard"/>
         <w:bidi w:val="0"/>
         <w:jc w:val="left"/>
-        <w:rPr>
-          <w:rFonts w:ascii="Arial" w:hAnsi="Arial" w:cs="Arial"/>
-        </w:rPr>
+        <w:rPr/>
       </w:pPr>
       <w:r>
         <w:rPr>
@@ -2809,7 +3627,7 @@
           <w:rFonts w:cs="Arial" w:ascii="Arial" w:hAnsi="Arial"/>
           <w:lang w:val="da-DK"/>
         </w:rPr>
-        <w:t>3</w:t>
+        <w:t>4</w:t>
       </w:r>
       <w:r>
         <w:rPr>
@@ -2869,9 +3687,7 @@
         <w:pStyle w:val="Standard"/>
         <w:bidi w:val="0"/>
         <w:jc w:val="left"/>
-        <w:rPr>
-          <w:rFonts w:ascii="Arial" w:hAnsi="Arial" w:cs="Arial"/>
-        </w:rPr>
+        <w:rPr/>
       </w:pPr>
       <w:r>
         <w:rPr>
@@ -2884,7 +3700,7 @@
           <w:rFonts w:cs="Arial" w:ascii="Arial" w:hAnsi="Arial"/>
           <w:lang w:val="da-DK"/>
         </w:rPr>
-        <w:t>3</w:t>
+        <w:t>4</w:t>
       </w:r>
       <w:r>
         <w:rPr>
@@ -3149,19 +3965,7 @@
         <w:rPr>
           <w:rFonts w:cs="Arial" w:ascii="Arial" w:hAnsi="Arial"/>
         </w:rPr>
-        <w:t>Keep Program Group Name = "IBOS MusicXmlR</w:t>
-      </w:r>
-      <w:r>
-        <w:rPr>
-          <w:rFonts w:cs="Arial" w:ascii="Arial" w:hAnsi="Arial"/>
-        </w:rPr>
-        <w:t>e</w:t>
-      </w:r>
-      <w:r>
-        <w:rPr>
-          <w:rFonts w:cs="Arial" w:ascii="Arial" w:hAnsi="Arial"/>
-        </w:rPr>
-        <w:t>ader"</w:t>
+        <w:t>Keep Program Group Name = "IBOS MusicXmlReader"</w:t>
       </w:r>
     </w:p>
     <w:p>
@@ -3223,19 +4027,7 @@
         <w:rPr>
           <w:rFonts w:cs="Arial" w:ascii="Arial" w:hAnsi="Arial"/>
         </w:rPr>
-        <w:t>Keep "Launch IBOS MusicXmlReader" c</w:t>
-      </w:r>
-      <w:r>
-        <w:rPr>
-          <w:rFonts w:cs="Arial" w:ascii="Arial" w:hAnsi="Arial"/>
-        </w:rPr>
-        <w:t>h</w:t>
-      </w:r>
-      <w:r>
-        <w:rPr>
-          <w:rFonts w:cs="Arial" w:ascii="Arial" w:hAnsi="Arial"/>
-        </w:rPr>
-        <w:t>ecked</w:t>
+        <w:t>Keep "Launch IBOS MusicXmlReader" checked</w:t>
       </w:r>
     </w:p>
     <w:p>
@@ -3407,13 +4199,7 @@
         <w:rPr>
           <w:rFonts w:cs="Arial" w:ascii="Arial" w:hAnsi="Arial"/>
         </w:rPr>
-        <w:t>.0.0.0.doc</w:t>
-      </w:r>
-      <w:r>
-        <w:rPr>
-          <w:rFonts w:cs="Arial" w:ascii="Arial" w:hAnsi="Arial"/>
-        </w:rPr>
-        <w:t>x</w:t>
+        <w:t>.0.0.0.docx</w:t>
       </w:r>
     </w:p>
     <w:p>
@@ -3444,13 +4230,7 @@
         <w:rPr>
           <w:rFonts w:cs="Arial" w:ascii="Arial" w:hAnsi="Arial"/>
         </w:rPr>
-        <w:t>.0.0.0.doc</w:t>
-      </w:r>
-      <w:r>
-        <w:rPr>
-          <w:rFonts w:cs="Arial" w:ascii="Arial" w:hAnsi="Arial"/>
-        </w:rPr>
-        <w:t>x</w:t>
+        <w:t>.0.0.0.docx</w:t>
       </w:r>
     </w:p>
     <w:p>
@@ -3481,26 +4261,7 @@
         <w:rPr>
           <w:rFonts w:cs="Arial" w:ascii="Arial" w:hAnsi="Arial"/>
         </w:rPr>
-        <w:t>.0.0.0.doc</w:t>
-      </w:r>
-      <w:r>
-        <w:rPr>
-          <w:rFonts w:cs="Arial" w:ascii="Arial" w:hAnsi="Arial"/>
-        </w:rPr>
-        <w:t>x</w:t>
-      </w:r>
-      <w:r>
-        <w:rPr>
-          <w:rFonts w:cs="Arial" w:ascii="Arial" w:hAnsi="Arial"/>
-        </w:rPr>
-        <w:t xml:space="preserve"> </w:t>
-      </w:r>
-      <w:r>
-        <w:rPr>
-          <w:rFonts w:cs="Arial" w:ascii="Arial" w:hAnsi="Arial"/>
-          <w:lang w:val="da-DK"/>
-        </w:rPr>
-        <w:t>(Engelsk version!!)</w:t>
+        <w:t>.0.0.0.docx</w:t>
       </w:r>
     </w:p>
     <w:p>
@@ -3533,25 +4294,7 @@
         <w:rPr>
           <w:rFonts w:cs="Arial" w:ascii="Arial" w:hAnsi="Arial"/>
         </w:rPr>
-        <w:t xml:space="preserve">User's manual for IBOS MusicXmlReader version </w:t>
-      </w:r>
-      <w:r>
-        <w:rPr>
-          <w:rFonts w:cs="Arial" w:ascii="Arial" w:hAnsi="Arial"/>
-        </w:rPr>
-        <w:t>4</w:t>
-      </w:r>
-      <w:r>
-        <w:rPr>
-          <w:rFonts w:cs="Arial" w:ascii="Arial" w:hAnsi="Arial"/>
-        </w:rPr>
-        <w:t>.0.0.0.doc</w:t>
-      </w:r>
-      <w:r>
-        <w:rPr>
-          <w:rFonts w:cs="Arial" w:ascii="Arial" w:hAnsi="Arial"/>
-        </w:rPr>
-        <w:t>x</w:t>
+        <w:t>User's manual for IBOS MusicXmlReader version 4.0.0.0.docx</w:t>
       </w:r>
     </w:p>
     <w:p>
@@ -3569,25 +4312,7 @@
         <w:rPr>
           <w:rFonts w:cs="Arial" w:ascii="Arial" w:hAnsi="Arial"/>
         </w:rPr>
-        <w:t xml:space="preserve">Installation guide for IBOS MusicXmlReader version </w:t>
-      </w:r>
-      <w:r>
-        <w:rPr>
-          <w:rFonts w:cs="Arial" w:ascii="Arial" w:hAnsi="Arial"/>
-        </w:rPr>
-        <w:t>4</w:t>
-      </w:r>
-      <w:r>
-        <w:rPr>
-          <w:rFonts w:cs="Arial" w:ascii="Arial" w:hAnsi="Arial"/>
-        </w:rPr>
-        <w:t>.0.0.0.doc</w:t>
-      </w:r>
-      <w:r>
-        <w:rPr>
-          <w:rFonts w:cs="Arial" w:ascii="Arial" w:hAnsi="Arial"/>
-        </w:rPr>
-        <w:t>x</w:t>
+        <w:t>Installation guide for IBOS MusicXmlReader version 4.0.0.0.docx</w:t>
       </w:r>
     </w:p>
     <w:p>
@@ -3605,237 +4330,256 @@
         <w:rPr>
           <w:rFonts w:cs="Arial" w:ascii="Arial" w:hAnsi="Arial"/>
         </w:rPr>
-        <w:t xml:space="preserve">Release Notes for IBOS MusicXmlReader version </w:t>
-      </w:r>
-      <w:r>
-        <w:rPr>
-          <w:rFonts w:cs="Arial" w:ascii="Arial" w:hAnsi="Arial"/>
-        </w:rPr>
-        <w:t>4</w:t>
-      </w:r>
-      <w:r>
-        <w:rPr>
-          <w:rFonts w:cs="Arial" w:ascii="Arial" w:hAnsi="Arial"/>
-        </w:rPr>
-        <w:t>.0.0.0.doc</w:t>
-      </w:r>
-      <w:r>
-        <w:rPr>
-          <w:rFonts w:cs="Arial" w:ascii="Arial" w:hAnsi="Arial"/>
-        </w:rPr>
-        <w:t>x</w:t>
-      </w:r>
-    </w:p>
-    <w:p>
-      <w:pPr>
-        <w:pStyle w:val="Standard"/>
-        <w:bidi w:val="0"/>
-        <w:jc w:val="left"/>
-        <w:rPr>
-          <w:rFonts w:ascii="Arial" w:hAnsi="Arial" w:cs="Arial"/>
-        </w:rPr>
-      </w:pPr>
-      <w:r>
-        <w:rPr>
-          <w:rFonts w:cs="Arial" w:ascii="Arial" w:hAnsi="Arial"/>
-        </w:rPr>
-      </w:r>
-    </w:p>
-    <w:p>
-      <w:pPr>
-        <w:pStyle w:val="Standard"/>
-        <w:bidi w:val="0"/>
-        <w:jc w:val="left"/>
-        <w:rPr>
-          <w:rFonts w:ascii="Arial" w:hAnsi="Arial" w:cs="Arial"/>
-        </w:rPr>
-      </w:pPr>
-      <w:r>
-        <w:rPr>
-          <w:rFonts w:cs="Arial" w:ascii="Arial" w:hAnsi="Arial"/>
-        </w:rPr>
-      </w:r>
-    </w:p>
-    <w:p>
-      <w:pPr>
-        <w:pStyle w:val="Standard"/>
-        <w:bidi w:val="0"/>
-        <w:jc w:val="left"/>
-        <w:rPr/>
-      </w:pPr>
-      <w:r>
-        <w:rPr>
-          <w:rFonts w:cs="Arial" w:ascii="Arial" w:hAnsi="Arial"/>
-        </w:rPr>
-        <w:t>Start LibreOfficeWriter on each of the 6 .doc</w:t>
-      </w:r>
-      <w:r>
-        <w:rPr>
-          <w:rFonts w:cs="Arial" w:ascii="Arial" w:hAnsi="Arial"/>
-        </w:rPr>
-        <w:t>x</w:t>
-      </w:r>
-      <w:r>
-        <w:rPr>
-          <w:rFonts w:cs="Arial" w:ascii="Arial" w:hAnsi="Arial"/>
-        </w:rPr>
-        <w:t xml:space="preserve"> files and convert them to</w:t>
-      </w:r>
-    </w:p>
-    <w:p>
-      <w:pPr>
-        <w:pStyle w:val="Standard"/>
-        <w:bidi w:val="0"/>
-        <w:jc w:val="left"/>
-        <w:rPr>
-          <w:rFonts w:ascii="Arial" w:hAnsi="Arial" w:cs="Arial"/>
-        </w:rPr>
-      </w:pPr>
-      <w:r>
-        <w:rPr>
-          <w:rFonts w:cs="Arial" w:ascii="Arial" w:hAnsi="Arial"/>
-        </w:rPr>
-        <w:t>.pdf, .</w:t>
-      </w:r>
-      <w:r>
-        <w:rPr>
-          <w:rFonts w:cs="Arial" w:ascii="Arial" w:hAnsi="Arial"/>
-        </w:rPr>
-        <w:t>html</w:t>
-      </w:r>
-      <w:r>
-        <w:rPr>
-          <w:rFonts w:cs="Arial" w:ascii="Arial" w:hAnsi="Arial"/>
-        </w:rPr>
-        <w:t xml:space="preserve"> and .rtf in the same location</w:t>
-      </w:r>
-    </w:p>
-    <w:p>
-      <w:pPr>
-        <w:pStyle w:val="Standard"/>
-        <w:bidi w:val="0"/>
-        <w:jc w:val="left"/>
-        <w:rPr>
-          <w:rFonts w:ascii="Arial" w:hAnsi="Arial" w:cs="Arial"/>
-        </w:rPr>
-      </w:pPr>
-      <w:r>
-        <w:rPr>
-          <w:rFonts w:cs="Arial" w:ascii="Arial" w:hAnsi="Arial"/>
-        </w:rPr>
-      </w:r>
-    </w:p>
-    <w:p>
-      <w:pPr>
-        <w:pStyle w:val="Standard"/>
-        <w:bidi w:val="0"/>
-        <w:jc w:val="left"/>
-        <w:rPr/>
-      </w:pPr>
-      <w:r>
-        <w:rPr>
-          <w:rFonts w:cs="Arial" w:ascii="Arial" w:hAnsi="Arial"/>
-        </w:rPr>
-        <w:t>"Filer-&gt;Export</w:t>
-      </w:r>
-      <w:r>
-        <w:rPr>
-          <w:rFonts w:cs="Arial" w:ascii="Arial" w:hAnsi="Arial"/>
-        </w:rPr>
-        <w:t>é</w:t>
-      </w:r>
-      <w:r>
-        <w:rPr>
-          <w:rFonts w:cs="Arial" w:ascii="Arial" w:hAnsi="Arial"/>
-        </w:rPr>
-        <w:t>r som .pdf"</w:t>
-      </w:r>
-    </w:p>
-    <w:p>
-      <w:pPr>
-        <w:pStyle w:val="Standard"/>
-        <w:bidi w:val="0"/>
-        <w:jc w:val="left"/>
-        <w:rPr/>
-      </w:pPr>
-      <w:r>
-        <w:rPr>
-          <w:rFonts w:cs="Arial" w:ascii="Arial" w:hAnsi="Arial"/>
-        </w:rPr>
-        <w:t>"Filer-&gt;Gem som"   Vælg .rtf, accepter det foreslåede</w:t>
-      </w:r>
-    </w:p>
-    <w:p>
-      <w:pPr>
-        <w:pStyle w:val="Standard"/>
-        <w:bidi w:val="0"/>
-        <w:jc w:val="left"/>
-        <w:rPr>
-          <w:color w:val="FF5429"/>
-        </w:rPr>
-      </w:pPr>
-      <w:r>
-        <w:rPr>
-          <w:rFonts w:cs="Arial" w:ascii="Arial" w:hAnsi="Arial"/>
-          <w:color w:val="FF5429"/>
-        </w:rPr>
-        <w:t>Tilsvarende for html</w:t>
-      </w:r>
-    </w:p>
-    <w:p>
-      <w:pPr>
-        <w:pStyle w:val="Standard"/>
-        <w:bidi w:val="0"/>
-        <w:jc w:val="left"/>
-        <w:rPr>
-          <w:rFonts w:ascii="Arial" w:hAnsi="Arial" w:cs="Arial"/>
-        </w:rPr>
-      </w:pPr>
-      <w:r>
-        <w:rPr>
-          <w:rFonts w:cs="Arial" w:ascii="Arial" w:hAnsi="Arial"/>
-        </w:rPr>
-      </w:r>
-    </w:p>
-    <w:p>
-      <w:pPr>
-        <w:pStyle w:val="Standard"/>
-        <w:bidi w:val="0"/>
-        <w:jc w:val="left"/>
-        <w:rPr>
-          <w:rFonts w:ascii="Arial" w:hAnsi="Arial" w:cs="Arial"/>
-        </w:rPr>
-      </w:pPr>
-      <w:r>
-        <w:rPr>
-          <w:rFonts w:cs="Arial" w:ascii="Arial" w:hAnsi="Arial"/>
-        </w:rPr>
-      </w:r>
-    </w:p>
-    <w:p>
-      <w:pPr>
-        <w:pStyle w:val="Standard"/>
-        <w:bidi w:val="0"/>
-        <w:jc w:val="left"/>
-        <w:rPr/>
-      </w:pPr>
-      <w:r>
-        <w:rPr>
-          <w:rFonts w:cs="Arial" w:ascii="Arial" w:hAnsi="Arial"/>
-        </w:rPr>
-        <w:t>Write protect the 6*</w:t>
-      </w:r>
-      <w:r>
-        <w:rPr>
-          <w:rFonts w:cs="Arial" w:ascii="Arial" w:hAnsi="Arial"/>
-        </w:rPr>
-        <w:t>4</w:t>
-      </w:r>
-      <w:r>
-        <w:rPr>
-          <w:rFonts w:cs="Arial" w:ascii="Arial" w:hAnsi="Arial"/>
-        </w:rPr>
-        <w:t xml:space="preserve"> + 1 resulting files</w:t>
+        <w:t>Release Notes for IBOS MusicXmlReader version 4.0.0.0.docx</w:t>
+      </w:r>
+    </w:p>
+    <w:p>
+      <w:pPr>
+        <w:pStyle w:val="Standard"/>
+        <w:numPr>
+          <w:ilvl w:val="0"/>
+          <w:numId w:val="6"/>
+        </w:numPr>
+        <w:bidi w:val="0"/>
+        <w:jc w:val="left"/>
+        <w:rPr/>
+      </w:pPr>
+      <w:r>
+        <w:rPr>
+          <w:rFonts w:cs="Arial" w:ascii="Arial" w:hAnsi="Arial"/>
+        </w:rPr>
+        <w:t xml:space="preserve"> </w:t>
+      </w:r>
+    </w:p>
+    <w:p>
+      <w:pPr>
+        <w:pStyle w:val="Standard"/>
+        <w:numPr>
+          <w:ilvl w:val="0"/>
+          <w:numId w:val="6"/>
+        </w:numPr>
+        <w:bidi w:val="0"/>
+        <w:jc w:val="left"/>
+        <w:rPr/>
+      </w:pPr>
+      <w:r>
+        <w:rPr>
+          <w:rFonts w:cs="Arial" w:ascii="Arial" w:hAnsi="Arial"/>
+        </w:rPr>
+        <w:t>Gebruikershandleiding voor IBOS XML muzieklezer versie 4.0.0.0.docx</w:t>
+      </w:r>
+    </w:p>
+    <w:p>
+      <w:pPr>
+        <w:pStyle w:val="Standard"/>
+        <w:bidi w:val="0"/>
+        <w:jc w:val="left"/>
+        <w:rPr>
+          <w:rFonts w:ascii="Arial" w:hAnsi="Arial" w:cs="Arial"/>
+        </w:rPr>
+      </w:pPr>
+      <w:r>
+        <w:rPr>
+          <w:rFonts w:cs="Arial" w:ascii="Arial" w:hAnsi="Arial"/>
+        </w:rPr>
+      </w:r>
+    </w:p>
+    <w:p>
+      <w:pPr>
+        <w:pStyle w:val="Standard"/>
+        <w:bidi w:val="0"/>
+        <w:jc w:val="left"/>
+        <w:rPr>
+          <w:rFonts w:ascii="Arial" w:hAnsi="Arial" w:cs="Arial"/>
+        </w:rPr>
+      </w:pPr>
+      <w:r>
+        <w:rPr>
+          <w:rFonts w:cs="Arial" w:ascii="Arial" w:hAnsi="Arial"/>
+        </w:rPr>
+      </w:r>
+    </w:p>
+    <w:p>
+      <w:pPr>
+        <w:pStyle w:val="Standard"/>
+        <w:bidi w:val="0"/>
+        <w:jc w:val="left"/>
+        <w:rPr/>
+      </w:pPr>
+      <w:r>
+        <w:rPr>
+          <w:rFonts w:cs="Arial" w:ascii="Arial" w:hAnsi="Arial"/>
+        </w:rPr>
+        <w:t xml:space="preserve">Start LibreOfficeWriter on each of the </w:t>
+      </w:r>
+      <w:r>
+        <w:rPr>
+          <w:rFonts w:cs="Arial" w:ascii="Arial" w:hAnsi="Arial"/>
+        </w:rPr>
+        <w:t>7</w:t>
+      </w:r>
+      <w:r>
+        <w:rPr>
+          <w:rFonts w:cs="Arial" w:ascii="Arial" w:hAnsi="Arial"/>
+        </w:rPr>
+        <w:t xml:space="preserve"> .docx files and convert them to</w:t>
+      </w:r>
+    </w:p>
+    <w:p>
+      <w:pPr>
+        <w:pStyle w:val="Standard"/>
+        <w:bidi w:val="0"/>
+        <w:jc w:val="left"/>
+        <w:rPr>
+          <w:rFonts w:ascii="Arial" w:hAnsi="Arial" w:cs="Arial"/>
+        </w:rPr>
+      </w:pPr>
+      <w:r>
+        <w:rPr>
+          <w:rFonts w:cs="Arial" w:ascii="Arial" w:hAnsi="Arial"/>
+        </w:rPr>
+        <w:t>.pdf, .html and .rtf in the same location</w:t>
+      </w:r>
+    </w:p>
+    <w:p>
+      <w:pPr>
+        <w:pStyle w:val="Standard"/>
+        <w:bidi w:val="0"/>
+        <w:jc w:val="left"/>
+        <w:rPr>
+          <w:rFonts w:ascii="Arial" w:hAnsi="Arial" w:cs="Arial"/>
+        </w:rPr>
+      </w:pPr>
+      <w:r>
+        <w:rPr>
+          <w:rFonts w:cs="Arial" w:ascii="Arial" w:hAnsi="Arial"/>
+        </w:rPr>
+      </w:r>
+    </w:p>
+    <w:p>
+      <w:pPr>
+        <w:pStyle w:val="Standard"/>
+        <w:bidi w:val="0"/>
+        <w:jc w:val="left"/>
+        <w:rPr/>
+      </w:pPr>
+      <w:r>
+        <w:rPr>
+          <w:rFonts w:cs="Arial" w:ascii="Arial" w:hAnsi="Arial"/>
+        </w:rPr>
+        <w:t xml:space="preserve">"Filer-&gt;Exportér som .pdf"   </w:t>
+        <w:tab/>
+      </w:r>
+      <w:r>
+        <w:rPr>
+          <w:rFonts w:cs="Arial" w:ascii="Arial" w:hAnsi="Arial"/>
+        </w:rPr>
+        <w:t>(Accepter de foreslåede indstillinger)</w:t>
+      </w:r>
+    </w:p>
+    <w:p>
+      <w:pPr>
+        <w:pStyle w:val="Standard"/>
+        <w:bidi w:val="0"/>
+        <w:jc w:val="left"/>
+        <w:rPr/>
+      </w:pPr>
+      <w:r>
+        <w:rPr>
+          <w:rFonts w:cs="Arial" w:ascii="Arial" w:hAnsi="Arial"/>
+        </w:rPr>
+        <w:t xml:space="preserve">"Filer-&gt;Gem som"   Vælg .rtf </w:t>
+        <w:tab/>
+      </w:r>
+      <w:r>
+        <w:rPr>
+          <w:rFonts w:cs="Arial" w:ascii="Arial" w:hAnsi="Arial"/>
+        </w:rPr>
+        <w:t>(A</w:t>
+      </w:r>
+      <w:r>
+        <w:rPr>
+          <w:rFonts w:cs="Arial" w:ascii="Arial" w:hAnsi="Arial"/>
+        </w:rPr>
+        <w:t xml:space="preserve">ccepter de foreslåede </w:t>
+      </w:r>
+      <w:r>
+        <w:rPr>
+          <w:rFonts w:cs="Arial" w:ascii="Arial" w:hAnsi="Arial"/>
+        </w:rPr>
+        <w:t>indstillinger)</w:t>
+      </w:r>
+    </w:p>
+    <w:p>
+      <w:pPr>
+        <w:pStyle w:val="Standard"/>
+        <w:bidi w:val="0"/>
+        <w:jc w:val="left"/>
+        <w:rPr/>
+      </w:pPr>
+      <w:r>
+        <w:rPr>
+          <w:rFonts w:cs="Arial" w:ascii="Arial" w:hAnsi="Arial"/>
+        </w:rPr>
+        <w:t xml:space="preserve">"Filer-&gt;Gem som"   Vælg .html </w:t>
+        <w:tab/>
+        <w:t>(Accepter de foreslåede indstillinger)</w:t>
+      </w:r>
+    </w:p>
+    <w:p>
+      <w:pPr>
+        <w:pStyle w:val="Standard"/>
+        <w:bidi w:val="0"/>
+        <w:jc w:val="left"/>
+        <w:rPr>
+          <w:rFonts w:ascii="Arial" w:hAnsi="Arial" w:cs="Arial"/>
+        </w:rPr>
+      </w:pPr>
+      <w:r>
+        <w:rPr>
+          <w:rFonts w:cs="Arial" w:ascii="Arial" w:hAnsi="Arial"/>
+        </w:rPr>
+      </w:r>
+    </w:p>
+    <w:p>
+      <w:pPr>
+        <w:pStyle w:val="Standard"/>
+        <w:bidi w:val="0"/>
+        <w:jc w:val="left"/>
+        <w:rPr>
+          <w:rFonts w:ascii="Arial" w:hAnsi="Arial" w:cs="Arial"/>
+        </w:rPr>
+      </w:pPr>
+      <w:r>
+        <w:rPr>
+          <w:rFonts w:cs="Arial" w:ascii="Arial" w:hAnsi="Arial"/>
+        </w:rPr>
+      </w:r>
+    </w:p>
+    <w:p>
+      <w:pPr>
+        <w:pStyle w:val="Standard"/>
+        <w:bidi w:val="0"/>
+        <w:jc w:val="left"/>
+        <w:rPr/>
+      </w:pPr>
+      <w:r>
+        <w:rPr>
+          <w:rFonts w:cs="Arial" w:ascii="Arial" w:hAnsi="Arial"/>
+        </w:rPr>
+        <w:t xml:space="preserve">Write protect the </w:t>
+      </w:r>
+      <w:r>
+        <w:rPr>
+          <w:rFonts w:cs="Arial" w:ascii="Arial" w:hAnsi="Arial"/>
+        </w:rPr>
+        <w:t>7</w:t>
+      </w:r>
+      <w:r>
+        <w:rPr>
+          <w:rFonts w:cs="Arial" w:ascii="Arial" w:hAnsi="Arial"/>
+        </w:rPr>
+        <w:t>*4 + 1 resulting files.</w:t>
       </w:r>
       <w:r>
         <w:br w:type="page"/>
@@ -3979,6 +4723,7 @@
         </w:rPr>
         <w:t xml:space="preserve">Rename public.zip to </w:t>
       </w:r>
+      <w:bookmarkStart w:id="10" w:name="__DdeLink__4486_1173279241"/>
       <w:r>
         <w:rPr>
           <w:rFonts w:cs="Arial" w:ascii="Arial" w:hAnsi="Arial"/>
@@ -4004,6 +4749,7 @@
         </w:rPr>
         <w:t>.0.0.0.zip"</w:t>
       </w:r>
+      <w:bookmarkEnd w:id="10"/>
     </w:p>
     <w:p>
       <w:pPr>
@@ -4060,6 +4806,66 @@
           <w:rFonts w:cs="Arial" w:ascii="Arial" w:hAnsi="Arial"/>
         </w:rPr>
         <w:t>.0.0.0" distribution file!</w:t>
+      </w:r>
+    </w:p>
+    <w:p>
+      <w:pPr>
+        <w:pStyle w:val="Standard"/>
+        <w:bidi w:val="0"/>
+        <w:jc w:val="left"/>
+        <w:rPr>
+          <w:rFonts w:ascii="Arial" w:hAnsi="Arial" w:cs="Arial"/>
+        </w:rPr>
+      </w:pPr>
+      <w:r>
+        <w:rPr/>
+      </w:r>
+    </w:p>
+    <w:p>
+      <w:pPr>
+        <w:pStyle w:val="Standard"/>
+        <w:bidi w:val="0"/>
+        <w:jc w:val="left"/>
+        <w:rPr/>
+      </w:pPr>
+      <w:r>
+        <w:rPr>
+          <w:rFonts w:cs="Arial" w:ascii="Arial" w:hAnsi="Arial"/>
+        </w:rPr>
+        <w:t>It should be found at</w:t>
+      </w:r>
+    </w:p>
+    <w:p>
+      <w:pPr>
+        <w:pStyle w:val="Standard"/>
+        <w:bidi w:val="0"/>
+        <w:jc w:val="left"/>
+        <w:rPr>
+          <w:rFonts w:ascii="Arial" w:hAnsi="Arial" w:cs="Arial"/>
+        </w:rPr>
+      </w:pPr>
+      <w:r>
+        <w:rPr/>
+      </w:r>
+    </w:p>
+    <w:p>
+      <w:pPr>
+        <w:pStyle w:val="Standard"/>
+        <w:bidi w:val="0"/>
+        <w:jc w:val="left"/>
+        <w:rPr>
+          <w:b/>
+          <w:b/>
+          <w:bCs/>
+        </w:rPr>
+      </w:pPr>
+      <w:r>
+        <w:rPr>
+          <w:rFonts w:cs="Arial" w:ascii="Arial" w:hAnsi="Arial"/>
+          <w:b/>
+          <w:bCs/>
+        </w:rPr>
+        <w:t>C:\Users\Jens\Dropbox\Root\Arkiv for releasede versioner\Version 4.0.0.0\Public</w:t>
       </w:r>
     </w:p>
     <w:p>
@@ -4159,48 +4965,81 @@
         <w:jc w:val="left"/>
         <w:rPr/>
       </w:pPr>
-      <w:bookmarkStart w:id="10" w:name="__RefHeading___Toc531097486"/>
-      <w:bookmarkEnd w:id="10"/>
-      <w:r>
-        <w:rPr/>
-        <w:t xml:space="preserve">Save a copy of the release </w:t>
-      </w:r>
-      <w:r>
-        <w:rPr/>
-        <w:t>in Dropbox:</w:t>
-      </w:r>
-    </w:p>
-    <w:p>
-      <w:pPr>
-        <w:pStyle w:val="Standard"/>
-        <w:bidi w:val="0"/>
-        <w:jc w:val="left"/>
-        <w:rPr>
-          <w:rFonts w:ascii="Arial" w:hAnsi="Arial" w:cs="Arial"/>
-        </w:rPr>
-      </w:pPr>
-      <w:r>
-        <w:rPr>
-          <w:rFonts w:cs="Arial" w:ascii="Arial" w:hAnsi="Arial"/>
-        </w:rPr>
-      </w:r>
-    </w:p>
-    <w:p>
-      <w:pPr>
-        <w:pStyle w:val="Standard"/>
-        <w:bidi w:val="0"/>
-        <w:jc w:val="left"/>
-        <w:rPr/>
-      </w:pPr>
-      <w:r>
-        <w:rPr>
-          <w:rFonts w:cs="Arial" w:ascii="Arial" w:hAnsi="Arial"/>
-        </w:rPr>
-        <w:t xml:space="preserve">Copy the whole directory "Version </w:t>
-      </w:r>
-      <w:r>
-        <w:rPr>
-          <w:rFonts w:cs="Arial" w:ascii="Arial" w:hAnsi="Arial"/>
+      <w:bookmarkStart w:id="11" w:name="__RefHeading___Toc531097486"/>
+      <w:bookmarkEnd w:id="11"/>
+      <w:r>
+        <w:rPr/>
+        <w:t>C</w:t>
+      </w:r>
+      <w:r>
+        <w:rPr/>
+        <w:t xml:space="preserve">opy the release </w:t>
+      </w:r>
+      <w:r>
+        <w:rPr/>
+        <w:t>on a USB memory stick</w:t>
+      </w:r>
+      <w:r>
+        <w:rPr/>
+        <w:t>:</w:t>
+      </w:r>
+    </w:p>
+    <w:p>
+      <w:pPr>
+        <w:pStyle w:val="Standard"/>
+        <w:bidi w:val="0"/>
+        <w:jc w:val="left"/>
+        <w:rPr>
+          <w:rFonts w:ascii="Arial" w:hAnsi="Arial" w:cs="Arial"/>
+        </w:rPr>
+      </w:pPr>
+      <w:r>
+        <w:rPr>
+          <w:rFonts w:cs="Arial" w:ascii="Arial" w:hAnsi="Arial"/>
+        </w:rPr>
+        <w:t>Copy the one single file</w:t>
+      </w:r>
+    </w:p>
+    <w:p>
+      <w:pPr>
+        <w:pStyle w:val="Standard"/>
+        <w:bidi w:val="0"/>
+        <w:jc w:val="left"/>
+        <w:rPr>
+          <w:rFonts w:ascii="Arial" w:hAnsi="Arial" w:cs="Arial"/>
+        </w:rPr>
+      </w:pPr>
+      <w:r>
+        <w:rPr>
+          <w:rFonts w:cs="Arial" w:ascii="Arial" w:hAnsi="Arial"/>
+        </w:rPr>
+      </w:r>
+    </w:p>
+    <w:p>
+      <w:pPr>
+        <w:pStyle w:val="Standard"/>
+        <w:bidi w:val="0"/>
+        <w:jc w:val="left"/>
+        <w:rPr>
+          <w:rFonts w:ascii="Arial" w:hAnsi="Arial" w:cs="Arial"/>
+          <w:b/>
+          <w:b/>
+          <w:bCs/>
+        </w:rPr>
+      </w:pPr>
+      <w:r>
+        <w:rPr>
+          <w:rFonts w:cs="Arial" w:ascii="Arial" w:hAnsi="Arial"/>
+          <w:b/>
+          <w:bCs/>
+        </w:rPr>
+        <w:t xml:space="preserve">C:\Users\Jens\Dropbox\Root\Arkiv for releasede versioner\Version 4.0.0.0\Public\"IBOS MusicXmlReader </w:t>
+      </w:r>
+      <w:r>
+        <w:rPr>
+          <w:rFonts w:cs="Arial" w:ascii="Arial" w:hAnsi="Arial"/>
+          <w:b/>
+          <w:bCs/>
           <w:lang w:val="en-US"/>
         </w:rPr>
         <w:t>4</w:t>
@@ -4208,122 +5047,79 @@
       <w:r>
         <w:rPr>
           <w:rFonts w:cs="Arial" w:ascii="Arial" w:hAnsi="Arial"/>
-        </w:rPr>
-        <w:t xml:space="preserve">.0.0.0" just created </w:t>
-      </w:r>
-      <w:r>
-        <w:rPr>
-          <w:rFonts w:cs="Arial" w:ascii="Arial" w:hAnsi="Arial"/>
-        </w:rPr>
-        <w:t>to</w:t>
-      </w:r>
-    </w:p>
-    <w:p>
-      <w:pPr>
-        <w:pStyle w:val="Standard"/>
-        <w:bidi w:val="0"/>
-        <w:jc w:val="left"/>
-        <w:rPr>
-          <w:rFonts w:ascii="Arial" w:hAnsi="Arial" w:cs="Arial"/>
-        </w:rPr>
-      </w:pPr>
-      <w:r>
-        <w:rPr>
-          <w:rFonts w:cs="Arial" w:ascii="Arial" w:hAnsi="Arial"/>
-        </w:rPr>
-      </w:r>
-    </w:p>
-    <w:p>
-      <w:pPr>
-        <w:pStyle w:val="Standard"/>
-        <w:bidi w:val="0"/>
-        <w:jc w:val="left"/>
-        <w:rPr/>
-      </w:pPr>
-      <w:r>
-        <w:rPr>
-          <w:rFonts w:cs="Arial" w:ascii="Arial" w:hAnsi="Arial"/>
-        </w:rPr>
-        <w:t>”</w:t>
-      </w:r>
-      <w:r>
-        <w:rPr>
-          <w:rFonts w:cs="Arial" w:ascii="Arial" w:hAnsi="Arial"/>
-        </w:rPr>
-        <w:t>C:\Users\Jens\Dropbox\Root\Arkiv for releasede versioner”</w:t>
-      </w:r>
-    </w:p>
-    <w:p>
-      <w:pPr>
-        <w:pStyle w:val="Standard"/>
-        <w:bidi w:val="0"/>
-        <w:jc w:val="left"/>
-        <w:rPr>
-          <w:rFonts w:ascii="Arial" w:hAnsi="Arial" w:cs="Arial"/>
-        </w:rPr>
-      </w:pPr>
-      <w:r>
-        <w:rPr>
-          <w:rFonts w:cs="Arial" w:ascii="Arial" w:hAnsi="Arial"/>
-        </w:rPr>
-      </w:r>
-    </w:p>
-    <w:p>
-      <w:pPr>
-        <w:pStyle w:val="Standard"/>
-        <w:bidi w:val="0"/>
-        <w:jc w:val="left"/>
-        <w:rPr/>
-      </w:pPr>
-      <w:r>
-        <w:rPr>
-          <w:rFonts w:cs="Arial" w:ascii="Arial" w:hAnsi="Arial"/>
-        </w:rPr>
-        <w:t xml:space="preserve">and to </w:t>
-      </w:r>
-      <w:r>
-        <w:rPr>
-          <w:rFonts w:cs="Arial" w:ascii="Arial" w:hAnsi="Arial"/>
-        </w:rPr>
-        <w:t>a U</w:t>
-      </w:r>
-      <w:r>
-        <w:rPr>
-          <w:rFonts w:cs="Arial" w:ascii="Arial" w:hAnsi="Arial"/>
-        </w:rPr>
-        <w:t>SB</w:t>
-      </w:r>
-      <w:r>
-        <w:rPr>
-          <w:rFonts w:cs="Arial" w:ascii="Arial" w:hAnsi="Arial"/>
-        </w:rPr>
-        <w:t xml:space="preserve"> memory stick</w:t>
-      </w:r>
-    </w:p>
-    <w:p>
-      <w:pPr>
-        <w:pStyle w:val="Standard"/>
-        <w:bidi w:val="0"/>
-        <w:jc w:val="left"/>
-        <w:rPr>
-          <w:rFonts w:ascii="Arial" w:hAnsi="Arial" w:cs="Arial"/>
-        </w:rPr>
-      </w:pPr>
-      <w:r>
-        <w:rPr/>
-      </w:r>
-    </w:p>
-    <w:p>
-      <w:pPr>
-        <w:pStyle w:val="Standard"/>
-        <w:bidi w:val="0"/>
-        <w:jc w:val="left"/>
-        <w:rPr>
-          <w:rFonts w:ascii="Arial" w:hAnsi="Arial" w:cs="Arial"/>
-        </w:rPr>
-      </w:pPr>
-      <w:r>
-        <w:rPr/>
+          <w:b/>
+          <w:bCs/>
+        </w:rPr>
+        <w:t>.0.0.0.zip"</w:t>
+      </w:r>
+    </w:p>
+    <w:p>
+      <w:pPr>
+        <w:pStyle w:val="Standard"/>
+        <w:bidi w:val="0"/>
+        <w:jc w:val="left"/>
+        <w:rPr>
+          <w:rFonts w:ascii="Arial" w:hAnsi="Arial" w:cs="Arial"/>
+        </w:rPr>
+      </w:pPr>
+      <w:r>
+        <w:rPr>
+          <w:rFonts w:cs="Arial" w:ascii="Arial" w:hAnsi="Arial"/>
+        </w:rPr>
+      </w:r>
+    </w:p>
+    <w:p>
+      <w:pPr>
+        <w:pStyle w:val="Standard"/>
+        <w:bidi w:val="0"/>
+        <w:jc w:val="left"/>
+        <w:rPr/>
+      </w:pPr>
+      <w:r>
+        <w:rPr>
+          <w:rFonts w:cs="Arial" w:ascii="Arial" w:hAnsi="Arial"/>
+        </w:rPr>
+        <w:t>to a memory stick</w:t>
+      </w:r>
+    </w:p>
+    <w:p>
+      <w:pPr>
+        <w:pStyle w:val="Standard"/>
+        <w:bidi w:val="0"/>
+        <w:jc w:val="left"/>
+        <w:rPr>
+          <w:rFonts w:ascii="Arial" w:hAnsi="Arial" w:cs="Arial"/>
+        </w:rPr>
+      </w:pPr>
+      <w:r>
+        <w:rPr>
+          <w:rFonts w:cs="Arial" w:ascii="Arial" w:hAnsi="Arial"/>
+        </w:rPr>
+      </w:r>
+    </w:p>
+    <w:p>
+      <w:pPr>
+        <w:pStyle w:val="Overskrift1"/>
+        <w:rPr/>
+      </w:pPr>
+      <w:r>
+        <w:rPr/>
+        <w:t>Create a DropBox link to the .zip file</w:t>
+      </w:r>
+    </w:p>
+    <w:p>
+      <w:pPr>
+        <w:pStyle w:val="Standard"/>
+        <w:bidi w:val="0"/>
+        <w:jc w:val="left"/>
+        <w:rPr>
+          <w:rFonts w:ascii="Arial" w:hAnsi="Arial" w:cs="Arial"/>
+        </w:rPr>
+      </w:pPr>
+      <w:r>
+        <w:rPr>
+          <w:rFonts w:cs="Arial" w:ascii="Arial" w:hAnsi="Arial"/>
+        </w:rPr>
       </w:r>
     </w:p>
     <w:p>
@@ -4338,6 +5134,45 @@
           <w:rFonts w:cs="Arial" w:ascii="Arial" w:hAnsi="Arial"/>
         </w:rPr>
         <w:t>Create a Dropbox link to the .zip file and save it in a .txt document just beside the .zip file</w:t>
+      </w:r>
+    </w:p>
+    <w:p>
+      <w:pPr>
+        <w:pStyle w:val="Standard"/>
+        <w:bidi w:val="0"/>
+        <w:jc w:val="left"/>
+        <w:rPr>
+          <w:rFonts w:ascii="Arial" w:hAnsi="Arial" w:cs="Arial"/>
+        </w:rPr>
+      </w:pPr>
+      <w:r>
+        <w:rPr/>
+      </w:r>
+    </w:p>
+    <w:p>
+      <w:pPr>
+        <w:pStyle w:val="Standard"/>
+        <w:bidi w:val="0"/>
+        <w:jc w:val="left"/>
+        <w:rPr>
+          <w:rFonts w:ascii="Arial" w:hAnsi="Arial" w:cs="Arial"/>
+        </w:rPr>
+      </w:pPr>
+      <w:r>
+        <w:rPr/>
+      </w:r>
+    </w:p>
+    <w:p>
+      <w:pPr>
+        <w:pStyle w:val="Standard"/>
+        <w:bidi w:val="0"/>
+        <w:jc w:val="left"/>
+        <w:rPr>
+          <w:rFonts w:ascii="Arial" w:hAnsi="Arial" w:cs="Arial"/>
+        </w:rPr>
+      </w:pPr>
+      <w:r>
+        <w:rPr/>
       </w:r>
     </w:p>
     <w:p>
@@ -5235,11 +6070,9 @@
       </w:r>
     </w:p>
     <w:sectPr>
-      <w:footerReference w:type="default" r:id="rId4"/>
       <w:type w:val="continuous"/>
       <w:pgSz w:w="11906" w:h="16838"/>
       <w:pgMar w:left="1134" w:right="1134" w:header="0" w:top="1134" w:footer="708" w:bottom="1134" w:gutter="0"/>
-      <w:pgNumType w:fmt="decimal"/>
       <w:formProt w:val="false"/>
       <w:textDirection w:val="lrTb"/>
       <w:docGrid w:type="default" w:linePitch="360" w:charSpace="0"/>
@@ -5304,73 +6137,7 @@
     </w:r>
     <w:r>
       <w:rPr/>
-      <w:t>7</w:t>
-    </w:r>
-    <w:r>
-      <w:rPr/>
-      <w:fldChar w:fldCharType="end"/>
-    </w:r>
-  </w:p>
-</w:ftr>
-</file>
-
-<file path=word/footer2.xml><?xml version="1.0" encoding="utf-8"?>
-<w:ftr xmlns:o="urn:schemas-microsoft-com:office:office" xmlns:r="http://schemas.openxmlformats.org/officeDocument/2006/relationships" xmlns:v="urn:schemas-microsoft-com:vml" xmlns:w="http://schemas.openxmlformats.org/wordprocessingml/2006/main" xmlns:w10="urn:schemas-microsoft-com:office:word" xmlns:wp="http://schemas.openxmlformats.org/drawingml/2006/wordprocessingDrawing" xmlns:wps="http://schemas.microsoft.com/office/word/2010/wordprocessingShape" xmlns:wpg="http://schemas.microsoft.com/office/word/2010/wordprocessingGroup" xmlns:mc="http://schemas.openxmlformats.org/markup-compatibility/2006" xmlns:wp14="http://schemas.microsoft.com/office/word/2010/wordprocessingDrawing" xmlns:w14="http://schemas.microsoft.com/office/word/2010/wordml" mc:Ignorable="w14 wp14">
-  <w:p>
-    <w:pPr>
-      <w:pStyle w:val="Sidefod"/>
-      <w:suppressLineNumbers/>
-      <w:bidi w:val="0"/>
-      <w:jc w:val="left"/>
-      <w:rPr/>
-    </w:pPr>
-    <w:r>
-      <w:rPr/>
-      <w:fldChar w:fldCharType="begin"/>
-    </w:r>
-    <w:r>
-      <w:rPr/>
-      <w:instrText> FILENAME </w:instrText>
-    </w:r>
-    <w:r>
-      <w:rPr/>
-      <w:fldChar w:fldCharType="separate"/>
-    </w:r>
-    <w:r>
-      <w:rPr/>
-      <w:t>Generering af release 4.0.0.0.docx</w:t>
-    </w:r>
-    <w:r>
-      <w:rPr/>
-      <w:fldChar w:fldCharType="end"/>
-    </w:r>
-  </w:p>
-  <w:p>
-    <w:pPr>
-      <w:pStyle w:val="Sidefod"/>
-      <w:bidi w:val="0"/>
-      <w:jc w:val="right"/>
-      <w:rPr/>
-    </w:pPr>
-    <w:r>
-      <w:rPr/>
-      <w:t xml:space="preserve">Side </w:t>
-    </w:r>
-    <w:r>
-      <w:rPr/>
-      <w:fldChar w:fldCharType="begin"/>
-    </w:r>
-    <w:r>
-      <w:rPr/>
-      <w:instrText> PAGE </w:instrText>
-    </w:r>
-    <w:r>
-      <w:rPr/>
-      <w:fldChar w:fldCharType="separate"/>
-    </w:r>
-    <w:r>
-      <w:rPr/>
-      <w:t>7</w:t>
+      <w:t>8</w:t>
     </w:r>
     <w:r>
       <w:rPr/>
@@ -6042,6 +6809,143 @@
         <w:rFonts w:ascii="OpenSymbol" w:hAnsi="OpenSymbol" w:cs="OpenSymbol" w:hint="default"/>
         <w:rFonts w:cs="OpenSymbol"/>
         <w:lang w:val="da-DK"/>
+      </w:rPr>
+    </w:lvl>
+  </w:abstractNum>
+  <w:abstractNum w:abstractNumId="7">
+    <w:lvl w:ilvl="0">
+      <w:start w:val="1"/>
+      <w:numFmt w:val="bullet"/>
+      <w:lvlText w:val=""/>
+      <w:lvlJc w:val="left"/>
+      <w:pPr>
+        <w:tabs>
+          <w:tab w:val="num" w:pos="227"/>
+        </w:tabs>
+        <w:ind w:left="227" w:hanging="227"/>
+      </w:pPr>
+      <w:rPr>
+        <w:rFonts w:ascii="Symbol" w:hAnsi="Symbol" w:cs="Symbol" w:hint="default"/>
+      </w:rPr>
+    </w:lvl>
+    <w:lvl w:ilvl="1">
+      <w:start w:val="1"/>
+      <w:numFmt w:val="bullet"/>
+      <w:lvlText w:val=""/>
+      <w:lvlJc w:val="left"/>
+      <w:pPr>
+        <w:tabs>
+          <w:tab w:val="num" w:pos="454"/>
+        </w:tabs>
+        <w:ind w:left="454" w:hanging="227"/>
+      </w:pPr>
+      <w:rPr>
+        <w:rFonts w:ascii="Symbol" w:hAnsi="Symbol" w:cs="Symbol" w:hint="default"/>
+      </w:rPr>
+    </w:lvl>
+    <w:lvl w:ilvl="2">
+      <w:start w:val="1"/>
+      <w:numFmt w:val="bullet"/>
+      <w:lvlText w:val=""/>
+      <w:lvlJc w:val="left"/>
+      <w:pPr>
+        <w:tabs>
+          <w:tab w:val="num" w:pos="680"/>
+        </w:tabs>
+        <w:ind w:left="680" w:hanging="227"/>
+      </w:pPr>
+      <w:rPr>
+        <w:rFonts w:ascii="Symbol" w:hAnsi="Symbol" w:cs="Symbol" w:hint="default"/>
+      </w:rPr>
+    </w:lvl>
+    <w:lvl w:ilvl="3">
+      <w:start w:val="1"/>
+      <w:numFmt w:val="bullet"/>
+      <w:lvlText w:val=""/>
+      <w:lvlJc w:val="left"/>
+      <w:pPr>
+        <w:tabs>
+          <w:tab w:val="num" w:pos="907"/>
+        </w:tabs>
+        <w:ind w:left="907" w:hanging="227"/>
+      </w:pPr>
+      <w:rPr>
+        <w:rFonts w:ascii="Symbol" w:hAnsi="Symbol" w:cs="Symbol" w:hint="default"/>
+      </w:rPr>
+    </w:lvl>
+    <w:lvl w:ilvl="4">
+      <w:start w:val="1"/>
+      <w:numFmt w:val="bullet"/>
+      <w:lvlText w:val=""/>
+      <w:lvlJc w:val="left"/>
+      <w:pPr>
+        <w:tabs>
+          <w:tab w:val="num" w:pos="1134"/>
+        </w:tabs>
+        <w:ind w:left="1134" w:hanging="227"/>
+      </w:pPr>
+      <w:rPr>
+        <w:rFonts w:ascii="Symbol" w:hAnsi="Symbol" w:cs="Symbol" w:hint="default"/>
+      </w:rPr>
+    </w:lvl>
+    <w:lvl w:ilvl="5">
+      <w:start w:val="1"/>
+      <w:numFmt w:val="bullet"/>
+      <w:lvlText w:val=""/>
+      <w:lvlJc w:val="left"/>
+      <w:pPr>
+        <w:tabs>
+          <w:tab w:val="num" w:pos="1361"/>
+        </w:tabs>
+        <w:ind w:left="1361" w:hanging="227"/>
+      </w:pPr>
+      <w:rPr>
+        <w:rFonts w:ascii="Symbol" w:hAnsi="Symbol" w:cs="Symbol" w:hint="default"/>
+      </w:rPr>
+    </w:lvl>
+    <w:lvl w:ilvl="6">
+      <w:start w:val="1"/>
+      <w:numFmt w:val="bullet"/>
+      <w:lvlText w:val=""/>
+      <w:lvlJc w:val="left"/>
+      <w:pPr>
+        <w:tabs>
+          <w:tab w:val="num" w:pos="1587"/>
+        </w:tabs>
+        <w:ind w:left="1587" w:hanging="227"/>
+      </w:pPr>
+      <w:rPr>
+        <w:rFonts w:ascii="Symbol" w:hAnsi="Symbol" w:cs="Symbol" w:hint="default"/>
+      </w:rPr>
+    </w:lvl>
+    <w:lvl w:ilvl="7">
+      <w:start w:val="1"/>
+      <w:numFmt w:val="bullet"/>
+      <w:lvlText w:val=""/>
+      <w:lvlJc w:val="left"/>
+      <w:pPr>
+        <w:tabs>
+          <w:tab w:val="num" w:pos="1814"/>
+        </w:tabs>
+        <w:ind w:left="1814" w:hanging="227"/>
+      </w:pPr>
+      <w:rPr>
+        <w:rFonts w:ascii="Symbol" w:hAnsi="Symbol" w:cs="Symbol" w:hint="default"/>
+      </w:rPr>
+    </w:lvl>
+    <w:lvl w:ilvl="8">
+      <w:start w:val="1"/>
+      <w:numFmt w:val="bullet"/>
+      <w:lvlText w:val=""/>
+      <w:lvlJc w:val="left"/>
+      <w:pPr>
+        <w:tabs>
+          <w:tab w:val="num" w:pos="2041"/>
+        </w:tabs>
+        <w:ind w:left="2041" w:hanging="227"/>
+      </w:pPr>
+      <w:rPr>
+        <w:rFonts w:ascii="Symbol" w:hAnsi="Symbol" w:cs="Symbol" w:hint="default"/>
       </w:rPr>
     </w:lvl>
   </w:abstractNum>
@@ -6062,6 +6966,9 @@
   </w:num>
   <w:num w:numId="6">
     <w:abstractNumId w:val="6"/>
+  </w:num>
+  <w:num w:numId="7">
+    <w:abstractNumId w:val="7"/>
   </w:num>
 </w:numbering>
 </file>
@@ -6330,7 +7237,7 @@
     <w:pPr>
       <w:suppressLineNumbers/>
       <w:tabs>
-        <w:tab w:val="clear" w:pos="709"/>
+        <w:tab w:val="clear" w:pos="720"/>
         <w:tab w:val="center" w:pos="4819" w:leader="none"/>
         <w:tab w:val="right" w:pos="9638" w:leader="none"/>
       </w:tabs>
@@ -6384,7 +7291,7 @@
     <w:basedOn w:val="Normal"/>
     <w:pPr>
       <w:tabs>
-        <w:tab w:val="clear" w:pos="709"/>
+        <w:tab w:val="clear" w:pos="720"/>
         <w:tab w:val="center" w:pos="4819" w:leader="none"/>
         <w:tab w:val="right" w:pos="9638" w:leader="none"/>
       </w:tabs>
@@ -6416,9 +7323,10 @@
       <w:bCs/>
     </w:rPr>
   </w:style>
-  <w:style w:type="paragraph" w:styleId="Indholdsfortegnelseoverskrift">
+  <w:style w:type="paragraph" w:styleId="TOAHeading">
     <w:name w:val="TOA Heading"/>
     <w:basedOn w:val="Overskrift"/>
+    <w:qFormat/>
     <w:pPr>
       <w:suppressLineNumbers/>
       <w:ind w:left="0" w:hanging="0"/>
@@ -6446,5 +7354,9 @@
     <w:name w:val="WW8Num4"/>
     <w:qFormat/>
   </w:style>
+  <w:style w:type="numbering" w:styleId="Punkttegn1">
+    <w:name w:val="Punkttegn •"/>
+    <w:qFormat/>
+  </w:style>
 </w:styles>
 </file>
</xml_diff>